<commit_message>
SET-18 Fetch correct image format
</commit_message>
<xml_diff>
--- a/templates/thermofly_paneel_tagged.docx
+++ b/templates/thermofly_paneel_tagged.docx
@@ -3,7 +3,15 @@
 <w:document xmlns:wpc="http://schemas.microsoft.com/office/word/2010/wordprocessingCanvas" xmlns:cx="http://schemas.microsoft.com/office/drawing/2014/chartex" xmlns:cx1="http://schemas.microsoft.com/office/drawing/2015/9/8/chartex" xmlns:cx2="http://schemas.microsoft.com/office/drawing/2015/10/21/chartex" xmlns:cx3="http://schemas.microsoft.com/office/drawing/2016/5/9/chartex" xmlns:cx4="http://schemas.microsoft.com/office/drawing/2016/5/10/chartex" xmlns:cx5="http://schemas.microsoft.com/office/drawing/2016/5/11/chartex" xmlns:cx6="http://schemas.microsoft.com/office/drawing/2016/5/12/chartex" xmlns:cx7="http://schemas.microsoft.com/office/drawing/2016/5/13/chartex" xmlns:cx8="http://schemas.microsoft.com/office/drawing/2016/5/14/chartex" xmlns:mc="http://schemas.openxmlformats.org/markup-compatibility/2006" xmlns:aink="http://schemas.microsoft.com/office/drawing/2016/ink" xmlns:am3d="http://schemas.microsoft.com/office/drawing/2017/model3d" xmlns:o="urn:schemas-microsoft-com:office:office" xmlns:oel="http://schemas.microsoft.com/office/2019/extlst" xmlns:r="http://schemas.openxmlformats.org/officeDocument/2006/relationships" xmlns:m="http://schemas.openxmlformats.org/officeDocument/2006/math" xmlns:v="urn:schemas-microsoft-com:vml" xmlns:wp14="http://schemas.microsoft.com/office/word/2010/wordprocessingDrawing" xmlns:wp="http://schemas.openxmlformats.org/drawingml/2006/wordprocessingDrawing" xmlns:w10="urn:schemas-microsoft-com:office:word" xmlns:w="http://schemas.openxmlformats.org/wordprocessingml/2006/main" xmlns:w14="http://schemas.microsoft.com/office/word/2010/wordml" xmlns:w15="http://schemas.microsoft.com/office/word/2012/wordml" xmlns:w16cex="http://schemas.microsoft.com/office/word/2018/wordml/cex" xmlns:w16cid="http://schemas.microsoft.com/office/word/2016/wordml/cid" xmlns:w16="http://schemas.microsoft.com/office/word/2018/wordml" xmlns:w16du="http://schemas.microsoft.com/office/word/2023/wordml/word16du" xmlns:w16sdtdh="http://schemas.microsoft.com/office/word/2020/wordml/sdtdatahash" xmlns:w16sdtfl="http://schemas.microsoft.com/office/word/2024/wordml/sdtformatlock" xmlns:w16se="http://schemas.microsoft.com/office/word/2015/wordml/symex" xmlns:wpg="http://schemas.microsoft.com/office/word/2010/wordprocessingGroup" xmlns:wpi="http://schemas.microsoft.com/office/word/2010/wordprocessingInk" xmlns:wne="http://schemas.microsoft.com/office/word/2006/wordml" xmlns:wps="http://schemas.microsoft.com/office/word/2010/wordprocessingShape" mc:Ignorable="w14 w15 w16se w16cid w16 w16cex w16sdtdh w16sdtfl w16du wp14">
   <w:body>
     <w:p>
-      <w:r>
+      <w:pPr>
+        <w:rPr>
+          <w:lang w:val="en-US"/>
+        </w:rPr>
+      </w:pPr>
+      <w:r>
+        <w:rPr>
+          <w:lang w:val="en-US"/>
+        </w:rPr>
         <w:t>{%p for panel in panels %}</w:t>
       </w:r>
     </w:p>
@@ -124,73 +132,89 @@
         <w:rPr>
           <w:sz w:val="20"/>
           <w:szCs w:val="20"/>
-        </w:rPr>
-      </w:pPr>
-      <w:r>
-        <w:rPr>
-          <w:sz w:val="20"/>
-          <w:szCs w:val="20"/>
+          <w:lang w:val="en-US"/>
+        </w:rPr>
+      </w:pPr>
+      <w:proofErr w:type="spellStart"/>
+      <w:r>
+        <w:rPr>
+          <w:sz w:val="20"/>
+          <w:szCs w:val="20"/>
+          <w:lang w:val="en-US"/>
         </w:rPr>
         <w:t>Projectnummer</w:t>
       </w:r>
-      <w:r>
-        <w:rPr>
-          <w:sz w:val="20"/>
-          <w:szCs w:val="20"/>
-        </w:rPr>
-        <w:tab/>
-      </w:r>
-      <w:r>
-        <w:rPr>
-          <w:sz w:val="20"/>
-          <w:szCs w:val="20"/>
-        </w:rPr>
-        <w:tab/>
-      </w:r>
+      <w:proofErr w:type="spellEnd"/>
+      <w:r>
+        <w:rPr>
+          <w:sz w:val="20"/>
+          <w:szCs w:val="20"/>
+          <w:lang w:val="en-US"/>
+        </w:rPr>
+        <w:tab/>
+      </w:r>
+      <w:r>
+        <w:rPr>
+          <w:sz w:val="20"/>
+          <w:szCs w:val="20"/>
+          <w:lang w:val="en-US"/>
+        </w:rPr>
+        <w:tab/>
+      </w:r>
+      <w:proofErr w:type="gramStart"/>
       <w:r>
         <w:rPr>
           <w:b/>
           <w:bCs/>
           <w:sz w:val="20"/>
           <w:szCs w:val="20"/>
-        </w:rPr>
-        <w:t>{{ panel.projectnummer }}</w:t>
-      </w:r>
+          <w:lang w:val="en-US"/>
+        </w:rPr>
+        <w:t xml:space="preserve">{{ </w:t>
+      </w:r>
+      <w:proofErr w:type="spellStart"/>
       <w:r>
         <w:rPr>
           <w:b/>
           <w:bCs/>
           <w:sz w:val="20"/>
           <w:szCs w:val="20"/>
-        </w:rPr>
-        <w:tab/>
-      </w:r>
+          <w:lang w:val="en-US"/>
+        </w:rPr>
+        <w:t>panel</w:t>
+      </w:r>
+      <w:proofErr w:type="gramEnd"/>
       <w:r>
         <w:rPr>
           <w:b/>
           <w:bCs/>
           <w:sz w:val="20"/>
           <w:szCs w:val="20"/>
-        </w:rPr>
-        <w:tab/>
-      </w:r>
+          <w:lang w:val="en-US"/>
+        </w:rPr>
+        <w:t>.</w:t>
+      </w:r>
+      <w:proofErr w:type="gramStart"/>
       <w:r>
         <w:rPr>
           <w:b/>
           <w:bCs/>
           <w:sz w:val="20"/>
           <w:szCs w:val="20"/>
-        </w:rPr>
-        <w:tab/>
-      </w:r>
+          <w:lang w:val="en-US"/>
+        </w:rPr>
+        <w:t>projectnummer</w:t>
+      </w:r>
+      <w:proofErr w:type="spellEnd"/>
       <w:r>
         <w:rPr>
           <w:b/>
           <w:bCs/>
           <w:sz w:val="20"/>
           <w:szCs w:val="20"/>
-        </w:rPr>
-        <w:tab/>
+          <w:lang w:val="en-US"/>
+        </w:rPr>
+        <w:t xml:space="preserve"> }}</w:t>
       </w:r>
       <w:r>
         <w:rPr>
@@ -198,13 +222,26 @@
           <w:bCs/>
           <w:sz w:val="20"/>
           <w:szCs w:val="20"/>
-        </w:rPr>
-        <w:tab/>
-      </w:r>
-      <w:r>
-        <w:rPr>
-          <w:sz w:val="20"/>
-          <w:szCs w:val="20"/>
+          <w:lang w:val="en-US"/>
+        </w:rPr>
+        <w:tab/>
+      </w:r>
+      <w:proofErr w:type="gramEnd"/>
+      <w:r>
+        <w:rPr>
+          <w:b/>
+          <w:bCs/>
+          <w:sz w:val="20"/>
+          <w:szCs w:val="20"/>
+          <w:lang w:val="en-US"/>
+        </w:rPr>
+        <w:tab/>
+      </w:r>
+      <w:r>
+        <w:rPr>
+          <w:sz w:val="20"/>
+          <w:szCs w:val="20"/>
+          <w:lang w:val="en-US"/>
         </w:rPr>
         <w:t>String</w:t>
       </w:r>
@@ -212,29 +249,79 @@
         <w:rPr>
           <w:sz w:val="20"/>
           <w:szCs w:val="20"/>
-        </w:rPr>
-        <w:tab/>
-      </w:r>
-      <w:r>
-        <w:rPr>
-          <w:sz w:val="20"/>
-          <w:szCs w:val="20"/>
-        </w:rPr>
-        <w:tab/>
-      </w:r>
-      <w:r>
-        <w:rPr>
-          <w:sz w:val="20"/>
-          <w:szCs w:val="20"/>
-        </w:rPr>
-        <w:tab/>
-      </w:r>
-      <w:r>
-        <w:rPr>
-          <w:sz w:val="20"/>
-          <w:szCs w:val="20"/>
-        </w:rPr>
-        <w:t>{{ panel.string }}</w:t>
+          <w:lang w:val="en-US"/>
+        </w:rPr>
+        <w:tab/>
+      </w:r>
+      <w:r>
+        <w:rPr>
+          <w:sz w:val="20"/>
+          <w:szCs w:val="20"/>
+          <w:lang w:val="en-US"/>
+        </w:rPr>
+        <w:tab/>
+      </w:r>
+      <w:r>
+        <w:rPr>
+          <w:sz w:val="20"/>
+          <w:szCs w:val="20"/>
+          <w:lang w:val="en-US"/>
+        </w:rPr>
+        <w:tab/>
+      </w:r>
+      <w:proofErr w:type="gramStart"/>
+      <w:r>
+        <w:rPr>
+          <w:sz w:val="20"/>
+          <w:szCs w:val="20"/>
+          <w:lang w:val="en-US"/>
+        </w:rPr>
+        <w:t xml:space="preserve">{{ </w:t>
+      </w:r>
+      <w:proofErr w:type="spellStart"/>
+      <w:r>
+        <w:rPr>
+          <w:sz w:val="20"/>
+          <w:szCs w:val="20"/>
+          <w:lang w:val="en-US"/>
+        </w:rPr>
+        <w:t>panel</w:t>
+      </w:r>
+      <w:proofErr w:type="gramEnd"/>
+      <w:r>
+        <w:rPr>
+          <w:sz w:val="20"/>
+          <w:szCs w:val="20"/>
+          <w:lang w:val="en-US"/>
+        </w:rPr>
+        <w:t>.</w:t>
+      </w:r>
+      <w:proofErr w:type="gramStart"/>
+      <w:r>
+        <w:rPr>
+          <w:sz w:val="20"/>
+          <w:szCs w:val="20"/>
+          <w:lang w:val="en-US"/>
+        </w:rPr>
+        <w:t>string</w:t>
+      </w:r>
+      <w:proofErr w:type="spellEnd"/>
+      <w:r>
+        <w:rPr>
+          <w:sz w:val="20"/>
+          <w:szCs w:val="20"/>
+          <w:lang w:val="en-US"/>
+        </w:rPr>
+        <w:t xml:space="preserve"> }</w:t>
+      </w:r>
+      <w:proofErr w:type="gramEnd"/>
+      <w:r>
+        <w:rPr>
+          <w:sz w:val="20"/>
+          <w:szCs w:val="20"/>
+          <w:lang w:val="en-US"/>
+        </w:rPr>
+        <w:t>}</w:t>
       </w:r>
     </w:p>
     <w:p>
@@ -266,39 +353,67 @@
         </w:rPr>
         <w:tab/>
       </w:r>
-      <w:r>
-        <w:rPr>
-          <w:sz w:val="20"/>
-          <w:szCs w:val="20"/>
-        </w:rPr>
-        <w:t>{{ panel.opdrachtgever }}</w:t>
-      </w:r>
-      <w:r>
-        <w:rPr>
-          <w:sz w:val="20"/>
-          <w:szCs w:val="20"/>
-        </w:rPr>
-        <w:tab/>
-      </w:r>
-      <w:r>
-        <w:rPr>
-          <w:sz w:val="20"/>
-          <w:szCs w:val="20"/>
-        </w:rPr>
-        <w:tab/>
-      </w:r>
-      <w:r>
-        <w:rPr>
-          <w:sz w:val="20"/>
-          <w:szCs w:val="20"/>
-        </w:rPr>
-        <w:tab/>
-      </w:r>
-      <w:r>
-        <w:rPr>
-          <w:sz w:val="20"/>
-          <w:szCs w:val="20"/>
-        </w:rPr>
+      <w:proofErr w:type="gramStart"/>
+      <w:r>
+        <w:rPr>
+          <w:sz w:val="20"/>
+          <w:szCs w:val="20"/>
+        </w:rPr>
+        <w:t xml:space="preserve">{{ </w:t>
+      </w:r>
+      <w:proofErr w:type="spellStart"/>
+      <w:r>
+        <w:rPr>
+          <w:sz w:val="20"/>
+          <w:szCs w:val="20"/>
+        </w:rPr>
+        <w:t>panel</w:t>
+      </w:r>
+      <w:proofErr w:type="gramEnd"/>
+      <w:r>
+        <w:rPr>
+          <w:sz w:val="20"/>
+          <w:szCs w:val="20"/>
+        </w:rPr>
+        <w:t>.</w:t>
+      </w:r>
+      <w:proofErr w:type="gramStart"/>
+      <w:r>
+        <w:rPr>
+          <w:sz w:val="20"/>
+          <w:szCs w:val="20"/>
+        </w:rPr>
+        <w:t>opdrachtgever</w:t>
+      </w:r>
+      <w:proofErr w:type="spellEnd"/>
+      <w:r>
+        <w:rPr>
+          <w:sz w:val="20"/>
+          <w:szCs w:val="20"/>
+        </w:rPr>
+        <w:t xml:space="preserve"> }}</w:t>
+      </w:r>
+      <w:r>
+        <w:rPr>
+          <w:sz w:val="20"/>
+          <w:szCs w:val="20"/>
+        </w:rPr>
+        <w:tab/>
+      </w:r>
+      <w:proofErr w:type="gramEnd"/>
+      <w:r>
+        <w:rPr>
+          <w:sz w:val="20"/>
+          <w:szCs w:val="20"/>
+        </w:rPr>
+        <w:tab/>
+      </w:r>
+      <w:r>
+        <w:rPr>
+          <w:sz w:val="20"/>
+          <w:szCs w:val="20"/>
+        </w:rPr>
+        <w:tab/>
         <w:t>Paneelnummer</w:t>
       </w:r>
       <w:r>
@@ -315,12 +430,37 @@
         </w:rPr>
         <w:tab/>
       </w:r>
-      <w:r>
-        <w:rPr>
-          <w:sz w:val="20"/>
-          <w:szCs w:val="20"/>
-        </w:rPr>
-        <w:t>{{ panel.paneelnummer }}</w:t>
+      <w:proofErr w:type="gramStart"/>
+      <w:r>
+        <w:rPr>
+          <w:sz w:val="20"/>
+          <w:szCs w:val="20"/>
+        </w:rPr>
+        <w:t>{{ panel</w:t>
+      </w:r>
+      <w:proofErr w:type="gramEnd"/>
+      <w:r>
+        <w:rPr>
+          <w:sz w:val="20"/>
+          <w:szCs w:val="20"/>
+        </w:rPr>
+        <w:t>.</w:t>
+      </w:r>
+      <w:proofErr w:type="gramStart"/>
+      <w:r>
+        <w:rPr>
+          <w:sz w:val="20"/>
+          <w:szCs w:val="20"/>
+        </w:rPr>
+        <w:t>paneelnummer }</w:t>
+      </w:r>
+      <w:proofErr w:type="gramEnd"/>
+      <w:r>
+        <w:rPr>
+          <w:sz w:val="20"/>
+          <w:szCs w:val="20"/>
+        </w:rPr>
+        <w:t>}</w:t>
       </w:r>
     </w:p>
     <w:p>
@@ -359,12 +499,60 @@
         </w:rPr>
         <w:tab/>
       </w:r>
-      <w:r>
-        <w:rPr>
-          <w:sz w:val="20"/>
-          <w:szCs w:val="20"/>
-        </w:rPr>
-        <w:t>{{ panel.locatie }}</w:t>
+      <w:proofErr w:type="gramStart"/>
+      <w:r>
+        <w:rPr>
+          <w:sz w:val="20"/>
+          <w:szCs w:val="20"/>
+        </w:rPr>
+        <w:t xml:space="preserve">{{ </w:t>
+      </w:r>
+      <w:proofErr w:type="spellStart"/>
+      <w:r>
+        <w:rPr>
+          <w:sz w:val="20"/>
+          <w:szCs w:val="20"/>
+        </w:rPr>
+        <w:t>panel</w:t>
+      </w:r>
+      <w:proofErr w:type="gramEnd"/>
+      <w:r>
+        <w:rPr>
+          <w:sz w:val="20"/>
+          <w:szCs w:val="20"/>
+        </w:rPr>
+        <w:t>.</w:t>
+      </w:r>
+      <w:proofErr w:type="gramStart"/>
+      <w:r>
+        <w:rPr>
+          <w:sz w:val="20"/>
+          <w:szCs w:val="20"/>
+        </w:rPr>
+        <w:t>locatie</w:t>
+      </w:r>
+      <w:proofErr w:type="spellEnd"/>
+      <w:r>
+        <w:rPr>
+          <w:sz w:val="20"/>
+          <w:szCs w:val="20"/>
+        </w:rPr>
+        <w:t xml:space="preserve"> }}</w:t>
+      </w:r>
+      <w:r>
+        <w:rPr>
+          <w:sz w:val="20"/>
+          <w:szCs w:val="20"/>
+        </w:rPr>
+        <w:tab/>
+      </w:r>
+      <w:proofErr w:type="gramEnd"/>
+      <w:r>
+        <w:rPr>
+          <w:sz w:val="20"/>
+          <w:szCs w:val="20"/>
+        </w:rPr>
+        <w:tab/>
       </w:r>
       <w:r>
         <w:rPr>
@@ -401,12 +589,13 @@
         </w:rPr>
         <w:tab/>
       </w:r>
-      <w:r>
-        <w:rPr>
-          <w:sz w:val="20"/>
-          <w:szCs w:val="20"/>
-        </w:rPr>
-        <w:t>{{ panel.type_paneel }}</w:t>
+      <w:proofErr w:type="gramStart"/>
+      <w:r>
+        <w:rPr>
+          <w:sz w:val="20"/>
+          <w:szCs w:val="20"/>
+        </w:rPr>
+        <w:t xml:space="preserve">{{ </w:t>
       </w:r>
       <w:proofErr w:type="spellStart"/>
       <w:r>
@@ -414,6 +603,23 @@
           <w:sz w:val="20"/>
           <w:szCs w:val="20"/>
         </w:rPr>
+        <w:t>panel</w:t>
+      </w:r>
+      <w:proofErr w:type="gramEnd"/>
+      <w:r>
+        <w:rPr>
+          <w:sz w:val="20"/>
+          <w:szCs w:val="20"/>
+        </w:rPr>
+        <w:t>.type_</w:t>
+      </w:r>
+      <w:proofErr w:type="gramStart"/>
+      <w:r>
+        <w:rPr>
+          <w:sz w:val="20"/>
+          <w:szCs w:val="20"/>
+        </w:rPr>
+        <w:t>paneel</w:t>
       </w:r>
       <w:proofErr w:type="spellEnd"/>
       <w:r>
@@ -421,6 +627,15 @@
           <w:sz w:val="20"/>
           <w:szCs w:val="20"/>
         </w:rPr>
+        <w:t xml:space="preserve"> }</w:t>
+      </w:r>
+      <w:proofErr w:type="gramEnd"/>
+      <w:r>
+        <w:rPr>
+          <w:sz w:val="20"/>
+          <w:szCs w:val="20"/>
+        </w:rPr>
+        <w:t>}</w:t>
       </w:r>
     </w:p>
     <w:p>
@@ -452,46 +667,60 @@
         </w:rPr>
         <w:tab/>
       </w:r>
-      <w:r>
-        <w:rPr>
-          <w:sz w:val="20"/>
-          <w:szCs w:val="20"/>
-        </w:rPr>
-        <w:t>{{ panel.datum_inspectie }}</w:t>
-      </w:r>
-      <w:r>
-        <w:rPr>
-          <w:sz w:val="20"/>
-          <w:szCs w:val="20"/>
-        </w:rPr>
-        <w:tab/>
-      </w:r>
-      <w:r>
-        <w:rPr>
-          <w:sz w:val="20"/>
-          <w:szCs w:val="20"/>
-        </w:rPr>
-        <w:tab/>
-      </w:r>
-      <w:r>
-        <w:rPr>
-          <w:sz w:val="20"/>
-          <w:szCs w:val="20"/>
-        </w:rPr>
-        <w:tab/>
-      </w:r>
-      <w:r>
-        <w:rPr>
-          <w:sz w:val="20"/>
-          <w:szCs w:val="20"/>
-        </w:rPr>
-        <w:tab/>
-      </w:r>
-      <w:r>
-        <w:rPr>
-          <w:sz w:val="20"/>
-          <w:szCs w:val="20"/>
-        </w:rPr>
+      <w:proofErr w:type="gramStart"/>
+      <w:r>
+        <w:rPr>
+          <w:sz w:val="20"/>
+          <w:szCs w:val="20"/>
+        </w:rPr>
+        <w:t xml:space="preserve">{{ </w:t>
+      </w:r>
+      <w:proofErr w:type="spellStart"/>
+      <w:r>
+        <w:rPr>
+          <w:sz w:val="20"/>
+          <w:szCs w:val="20"/>
+        </w:rPr>
+        <w:t>panel</w:t>
+      </w:r>
+      <w:proofErr w:type="gramEnd"/>
+      <w:r>
+        <w:rPr>
+          <w:sz w:val="20"/>
+          <w:szCs w:val="20"/>
+        </w:rPr>
+        <w:t>.datum_</w:t>
+      </w:r>
+      <w:proofErr w:type="gramStart"/>
+      <w:r>
+        <w:rPr>
+          <w:sz w:val="20"/>
+          <w:szCs w:val="20"/>
+        </w:rPr>
+        <w:t>inspectie</w:t>
+      </w:r>
+      <w:proofErr w:type="spellEnd"/>
+      <w:r>
+        <w:rPr>
+          <w:sz w:val="20"/>
+          <w:szCs w:val="20"/>
+        </w:rPr>
+        <w:t xml:space="preserve"> }}</w:t>
+      </w:r>
+      <w:r>
+        <w:rPr>
+          <w:sz w:val="20"/>
+          <w:szCs w:val="20"/>
+        </w:rPr>
+        <w:tab/>
+      </w:r>
+      <w:proofErr w:type="gramEnd"/>
+      <w:r>
+        <w:rPr>
+          <w:sz w:val="20"/>
+          <w:szCs w:val="20"/>
+        </w:rPr>
+        <w:tab/>
         <w:t>Oriëntatie</w:t>
       </w:r>
       <w:r>
@@ -508,12 +737,53 @@
         </w:rPr>
         <w:tab/>
       </w:r>
-      <w:r>
-        <w:rPr>
-          <w:sz w:val="20"/>
-          <w:szCs w:val="20"/>
-        </w:rPr>
-        <w:t>{{ panel.orientatie }}</w:t>
+      <w:proofErr w:type="gramStart"/>
+      <w:r>
+        <w:rPr>
+          <w:sz w:val="20"/>
+          <w:szCs w:val="20"/>
+        </w:rPr>
+        <w:t xml:space="preserve">{{ </w:t>
+      </w:r>
+      <w:proofErr w:type="spellStart"/>
+      <w:r>
+        <w:rPr>
+          <w:sz w:val="20"/>
+          <w:szCs w:val="20"/>
+        </w:rPr>
+        <w:t>panel</w:t>
+      </w:r>
+      <w:proofErr w:type="gramEnd"/>
+      <w:r>
+        <w:rPr>
+          <w:sz w:val="20"/>
+          <w:szCs w:val="20"/>
+        </w:rPr>
+        <w:t>.</w:t>
+      </w:r>
+      <w:proofErr w:type="gramStart"/>
+      <w:r>
+        <w:rPr>
+          <w:sz w:val="20"/>
+          <w:szCs w:val="20"/>
+        </w:rPr>
+        <w:t>orientatie</w:t>
+      </w:r>
+      <w:proofErr w:type="spellEnd"/>
+      <w:r>
+        <w:rPr>
+          <w:sz w:val="20"/>
+          <w:szCs w:val="20"/>
+        </w:rPr>
+        <w:t xml:space="preserve"> }</w:t>
+      </w:r>
+      <w:proofErr w:type="gramEnd"/>
+      <w:r>
+        <w:rPr>
+          <w:sz w:val="20"/>
+          <w:szCs w:val="20"/>
+        </w:rPr>
+        <w:t>}</w:t>
       </w:r>
     </w:p>
     <w:p>
@@ -545,46 +815,60 @@
         </w:rPr>
         <w:tab/>
       </w:r>
-      <w:r>
-        <w:rPr>
-          <w:sz w:val="20"/>
-          <w:szCs w:val="20"/>
-        </w:rPr>
-        <w:t>{{ panel.tijdstip_inspectie }}</w:t>
-      </w:r>
-      <w:r>
-        <w:rPr>
-          <w:sz w:val="20"/>
-          <w:szCs w:val="20"/>
-        </w:rPr>
-        <w:tab/>
-      </w:r>
-      <w:r>
-        <w:rPr>
-          <w:sz w:val="20"/>
-          <w:szCs w:val="20"/>
-        </w:rPr>
-        <w:tab/>
-      </w:r>
-      <w:r>
-        <w:rPr>
-          <w:sz w:val="20"/>
-          <w:szCs w:val="20"/>
-        </w:rPr>
-        <w:tab/>
-      </w:r>
-      <w:r>
-        <w:rPr>
-          <w:sz w:val="20"/>
-          <w:szCs w:val="20"/>
-        </w:rPr>
-        <w:tab/>
-      </w:r>
-      <w:r>
-        <w:rPr>
-          <w:sz w:val="20"/>
-          <w:szCs w:val="20"/>
-        </w:rPr>
+      <w:proofErr w:type="gramStart"/>
+      <w:r>
+        <w:rPr>
+          <w:sz w:val="20"/>
+          <w:szCs w:val="20"/>
+        </w:rPr>
+        <w:t xml:space="preserve">{{ </w:t>
+      </w:r>
+      <w:proofErr w:type="spellStart"/>
+      <w:r>
+        <w:rPr>
+          <w:sz w:val="20"/>
+          <w:szCs w:val="20"/>
+        </w:rPr>
+        <w:t>panel</w:t>
+      </w:r>
+      <w:proofErr w:type="gramEnd"/>
+      <w:r>
+        <w:rPr>
+          <w:sz w:val="20"/>
+          <w:szCs w:val="20"/>
+        </w:rPr>
+        <w:t>.tijdstip_</w:t>
+      </w:r>
+      <w:proofErr w:type="gramStart"/>
+      <w:r>
+        <w:rPr>
+          <w:sz w:val="20"/>
+          <w:szCs w:val="20"/>
+        </w:rPr>
+        <w:t>inspectie</w:t>
+      </w:r>
+      <w:proofErr w:type="spellEnd"/>
+      <w:r>
+        <w:rPr>
+          <w:sz w:val="20"/>
+          <w:szCs w:val="20"/>
+        </w:rPr>
+        <w:t xml:space="preserve"> }}</w:t>
+      </w:r>
+      <w:r>
+        <w:rPr>
+          <w:sz w:val="20"/>
+          <w:szCs w:val="20"/>
+        </w:rPr>
+        <w:tab/>
+      </w:r>
+      <w:proofErr w:type="gramEnd"/>
+      <w:r>
+        <w:rPr>
+          <w:sz w:val="20"/>
+          <w:szCs w:val="20"/>
+        </w:rPr>
+        <w:tab/>
         <w:t>Hellingshoek</w:t>
       </w:r>
       <w:r>
@@ -601,12 +885,53 @@
         </w:rPr>
         <w:tab/>
       </w:r>
-      <w:r>
-        <w:rPr>
-          <w:sz w:val="20"/>
-          <w:szCs w:val="20"/>
-        </w:rPr>
-        <w:t>{{ panel.hellingshoek }}</w:t>
+      <w:proofErr w:type="gramStart"/>
+      <w:r>
+        <w:rPr>
+          <w:sz w:val="20"/>
+          <w:szCs w:val="20"/>
+        </w:rPr>
+        <w:t xml:space="preserve">{{ </w:t>
+      </w:r>
+      <w:proofErr w:type="spellStart"/>
+      <w:r>
+        <w:rPr>
+          <w:sz w:val="20"/>
+          <w:szCs w:val="20"/>
+        </w:rPr>
+        <w:t>panel</w:t>
+      </w:r>
+      <w:proofErr w:type="gramEnd"/>
+      <w:r>
+        <w:rPr>
+          <w:sz w:val="20"/>
+          <w:szCs w:val="20"/>
+        </w:rPr>
+        <w:t>.</w:t>
+      </w:r>
+      <w:proofErr w:type="gramStart"/>
+      <w:r>
+        <w:rPr>
+          <w:sz w:val="20"/>
+          <w:szCs w:val="20"/>
+        </w:rPr>
+        <w:t>hellingshoek</w:t>
+      </w:r>
+      <w:proofErr w:type="spellEnd"/>
+      <w:r>
+        <w:rPr>
+          <w:sz w:val="20"/>
+          <w:szCs w:val="20"/>
+        </w:rPr>
+        <w:t xml:space="preserve"> }</w:t>
+      </w:r>
+      <w:proofErr w:type="gramEnd"/>
+      <w:r>
+        <w:rPr>
+          <w:sz w:val="20"/>
+          <w:szCs w:val="20"/>
+        </w:rPr>
+        <w:t>}</w:t>
       </w:r>
     </w:p>
     <w:p>
@@ -638,46 +963,67 @@
         </w:rPr>
         <w:tab/>
       </w:r>
-      <w:r>
-        <w:rPr>
-          <w:sz w:val="20"/>
-          <w:szCs w:val="20"/>
-        </w:rPr>
-        <w:t>{{ panel.inspecteur }}</w:t>
-      </w:r>
-      <w:r>
-        <w:rPr>
-          <w:sz w:val="20"/>
-          <w:szCs w:val="20"/>
-        </w:rPr>
-        <w:tab/>
-      </w:r>
-      <w:r>
-        <w:rPr>
-          <w:sz w:val="20"/>
-          <w:szCs w:val="20"/>
-        </w:rPr>
-        <w:tab/>
-      </w:r>
-      <w:r>
-        <w:rPr>
-          <w:sz w:val="20"/>
-          <w:szCs w:val="20"/>
-        </w:rPr>
-        <w:tab/>
-      </w:r>
-      <w:r>
-        <w:rPr>
-          <w:sz w:val="20"/>
-          <w:szCs w:val="20"/>
-        </w:rPr>
-        <w:tab/>
-      </w:r>
-      <w:r>
-        <w:rPr>
-          <w:sz w:val="20"/>
-          <w:szCs w:val="20"/>
-        </w:rPr>
+      <w:proofErr w:type="gramStart"/>
+      <w:r>
+        <w:rPr>
+          <w:sz w:val="20"/>
+          <w:szCs w:val="20"/>
+        </w:rPr>
+        <w:t xml:space="preserve">{{ </w:t>
+      </w:r>
+      <w:proofErr w:type="spellStart"/>
+      <w:r>
+        <w:rPr>
+          <w:sz w:val="20"/>
+          <w:szCs w:val="20"/>
+        </w:rPr>
+        <w:t>panel</w:t>
+      </w:r>
+      <w:proofErr w:type="gramEnd"/>
+      <w:r>
+        <w:rPr>
+          <w:sz w:val="20"/>
+          <w:szCs w:val="20"/>
+        </w:rPr>
+        <w:t>.</w:t>
+      </w:r>
+      <w:proofErr w:type="gramStart"/>
+      <w:r>
+        <w:rPr>
+          <w:sz w:val="20"/>
+          <w:szCs w:val="20"/>
+        </w:rPr>
+        <w:t>inspecteur</w:t>
+      </w:r>
+      <w:proofErr w:type="spellEnd"/>
+      <w:r>
+        <w:rPr>
+          <w:sz w:val="20"/>
+          <w:szCs w:val="20"/>
+        </w:rPr>
+        <w:t xml:space="preserve"> }}</w:t>
+      </w:r>
+      <w:r>
+        <w:rPr>
+          <w:sz w:val="20"/>
+          <w:szCs w:val="20"/>
+        </w:rPr>
+        <w:tab/>
+      </w:r>
+      <w:proofErr w:type="gramEnd"/>
+      <w:r>
+        <w:rPr>
+          <w:sz w:val="20"/>
+          <w:szCs w:val="20"/>
+        </w:rPr>
+        <w:tab/>
+      </w:r>
+      <w:r>
+        <w:rPr>
+          <w:sz w:val="20"/>
+          <w:szCs w:val="20"/>
+        </w:rPr>
+        <w:tab/>
         <w:t>Positie op dak</w:t>
       </w:r>
       <w:r>
@@ -693,7 +1039,38 @@
           <w:szCs w:val="20"/>
         </w:rPr>
         <w:tab/>
-        <w:t>{{ panel.positie_op_dak }}</w:t>
+      </w:r>
+      <w:proofErr w:type="gramStart"/>
+      <w:r>
+        <w:rPr>
+          <w:sz w:val="20"/>
+          <w:szCs w:val="20"/>
+        </w:rPr>
+        <w:t>{{ panel</w:t>
+      </w:r>
+      <w:proofErr w:type="gramEnd"/>
+      <w:r>
+        <w:rPr>
+          <w:sz w:val="20"/>
+          <w:szCs w:val="20"/>
+        </w:rPr>
+        <w:t>.positie_op_</w:t>
+      </w:r>
+      <w:proofErr w:type="gramStart"/>
+      <w:r>
+        <w:rPr>
+          <w:sz w:val="20"/>
+          <w:szCs w:val="20"/>
+        </w:rPr>
+        <w:t>dak }</w:t>
+      </w:r>
+      <w:proofErr w:type="gramEnd"/>
+      <w:r>
+        <w:rPr>
+          <w:sz w:val="20"/>
+          <w:szCs w:val="20"/>
+        </w:rPr>
+        <w:t>}</w:t>
       </w:r>
     </w:p>
     <w:p>
@@ -713,7 +1090,7 @@
         <mc:AlternateContent>
           <mc:Choice Requires="wps">
             <w:drawing>
-              <wp:anchor distT="45720" distB="45720" distL="114300" distR="114300" simplePos="0" relativeHeight="251660293" behindDoc="0" locked="0" layoutInCell="1" allowOverlap="1" wp14:anchorId="1E49E321" wp14:editId="60B94B11">
+              <wp:anchor distT="45720" distB="45720" distL="114300" distR="114300" simplePos="0" relativeHeight="251660293" behindDoc="0" locked="0" layoutInCell="1" allowOverlap="1" wp14:anchorId="204AFA4F" wp14:editId="7771640A">
                 <wp:simplePos x="0" y="0"/>
                 <wp:positionH relativeFrom="column">
                   <wp:posOffset>3503930</wp:posOffset>
@@ -758,7 +1135,7 @@
                                 <w:noProof/>
                               </w:rPr>
                               <w:drawing>
-                                <wp:inline distT="0" distB="0" distL="0" distR="0" wp14:anchorId="2D53B607" wp14:editId="21397796">
+                                <wp:inline distT="0" distB="0" distL="0" distR="0" wp14:anchorId="5CBF76AE" wp14:editId="3838E55A">
                                   <wp:extent cx="2409825" cy="1613340"/>
                                   <wp:effectExtent l="0" t="0" r="0" b="6350"/>
                                   <wp:docPr id="1956148834" name="Afbeelding 1"/>
@@ -811,7 +1188,7 @@
               </wp:anchor>
             </w:drawing>
           </mc:Choice>
-          <mc:Fallback>
+          <mc:Fallback xmlns="">
             <w:pict>
               <v:shapetype w14:anchorId="1E49E321" id="_x0000_t202" coordsize="21600,21600" o:spt="202" path="m,l,21600r21600,l21600,xe">
                 <v:stroke joinstyle="miter"/>
@@ -841,7 +1218,7 @@
                                     <pic:cNvPicPr/>
                                   </pic:nvPicPr>
                                   <pic:blipFill>
-                                    <a:blip r:embed="rId11"/>
+                                    <a:blip r:embed="rId12"/>
                                     <a:stretch>
                                       <a:fillRect/>
                                     </a:stretch>
@@ -882,7 +1259,38 @@
           <w:szCs w:val="20"/>
         </w:rPr>
         <w:tab/>
-        <w:t>{{ panel.weersomstandigheden }}</w:t>
+      </w:r>
+      <w:proofErr w:type="gramStart"/>
+      <w:r>
+        <w:rPr>
+          <w:sz w:val="20"/>
+          <w:szCs w:val="20"/>
+        </w:rPr>
+        <w:t>{{ panel</w:t>
+      </w:r>
+      <w:proofErr w:type="gramEnd"/>
+      <w:r>
+        <w:rPr>
+          <w:sz w:val="20"/>
+          <w:szCs w:val="20"/>
+        </w:rPr>
+        <w:t>.</w:t>
+      </w:r>
+      <w:proofErr w:type="gramStart"/>
+      <w:r>
+        <w:rPr>
+          <w:sz w:val="20"/>
+          <w:szCs w:val="20"/>
+        </w:rPr>
+        <w:t>weersomstandigheden }</w:t>
+      </w:r>
+      <w:proofErr w:type="gramEnd"/>
+      <w:r>
+        <w:rPr>
+          <w:sz w:val="20"/>
+          <w:szCs w:val="20"/>
+        </w:rPr>
+        <w:t>}</w:t>
       </w:r>
       <w:r>
         <w:rPr>
@@ -927,7 +1335,38 @@
           <w:szCs w:val="20"/>
         </w:rPr>
         <w:tab/>
-        <w:t>{{ panel.buitentemperatuur }}</w:t>
+      </w:r>
+      <w:proofErr w:type="gramStart"/>
+      <w:r>
+        <w:rPr>
+          <w:sz w:val="20"/>
+          <w:szCs w:val="20"/>
+        </w:rPr>
+        <w:t>{{ panel</w:t>
+      </w:r>
+      <w:proofErr w:type="gramEnd"/>
+      <w:r>
+        <w:rPr>
+          <w:sz w:val="20"/>
+          <w:szCs w:val="20"/>
+        </w:rPr>
+        <w:t>.</w:t>
+      </w:r>
+      <w:proofErr w:type="gramStart"/>
+      <w:r>
+        <w:rPr>
+          <w:sz w:val="20"/>
+          <w:szCs w:val="20"/>
+        </w:rPr>
+        <w:t>buitentemperatuur }</w:t>
+      </w:r>
+      <w:proofErr w:type="gramEnd"/>
+      <w:r>
+        <w:rPr>
+          <w:sz w:val="20"/>
+          <w:szCs w:val="20"/>
+        </w:rPr>
+        <w:t>}</w:t>
       </w:r>
     </w:p>
     <w:p>
@@ -959,12 +1398,37 @@
         </w:rPr>
         <w:tab/>
       </w:r>
-      <w:r>
-        <w:rPr>
-          <w:sz w:val="20"/>
-          <w:szCs w:val="20"/>
-        </w:rPr>
-        <w:t>{{ panel.windsnelheid }}</w:t>
+      <w:proofErr w:type="gramStart"/>
+      <w:r>
+        <w:rPr>
+          <w:sz w:val="20"/>
+          <w:szCs w:val="20"/>
+        </w:rPr>
+        <w:t>{{ panel</w:t>
+      </w:r>
+      <w:proofErr w:type="gramEnd"/>
+      <w:r>
+        <w:rPr>
+          <w:sz w:val="20"/>
+          <w:szCs w:val="20"/>
+        </w:rPr>
+        <w:t>.</w:t>
+      </w:r>
+      <w:proofErr w:type="gramStart"/>
+      <w:r>
+        <w:rPr>
+          <w:sz w:val="20"/>
+          <w:szCs w:val="20"/>
+        </w:rPr>
+        <w:t>windsnelheid }</w:t>
+      </w:r>
+      <w:proofErr w:type="gramEnd"/>
+      <w:r>
+        <w:rPr>
+          <w:sz w:val="20"/>
+          <w:szCs w:val="20"/>
+        </w:rPr>
+        <w:t>}</w:t>
       </w:r>
     </w:p>
     <w:p>
@@ -973,7 +1437,6 @@
         <w:rPr>
           <w:sz w:val="20"/>
           <w:szCs w:val="20"/>
-          <w:lang w:val="en-GB"/>
         </w:rPr>
       </w:pPr>
       <w:r>
@@ -985,7 +1448,7 @@
         <mc:AlternateContent>
           <mc:Choice Requires="wps">
             <w:drawing>
-              <wp:anchor distT="0" distB="0" distL="114300" distR="114300" simplePos="0" relativeHeight="251661317" behindDoc="0" locked="0" layoutInCell="1" allowOverlap="1" wp14:anchorId="4D76E488" wp14:editId="520DC357">
+              <wp:anchor distT="0" distB="0" distL="114300" distR="114300" simplePos="0" relativeHeight="251661317" behindDoc="0" locked="0" layoutInCell="1" allowOverlap="1" wp14:anchorId="5417CE70" wp14:editId="305793CD">
                 <wp:simplePos x="0" y="0"/>
                 <wp:positionH relativeFrom="column">
                   <wp:posOffset>3874011</wp:posOffset>
@@ -1053,76 +1516,107 @@
               </wp:anchor>
             </w:drawing>
           </mc:Choice>
-          <mc:Fallback>
+          <mc:Fallback xmlns="">
             <w:pict>
               <v:rect w14:anchorId="4E1B8920" id="Rechthoek 15" o:spid="_x0000_s1026" style="position:absolute;margin-left:305.05pt;margin-top:4.85pt;width:5.55pt;height:3.6pt;z-index:251661317;visibility:visible;mso-wrap-style:square;mso-width-percent:0;mso-height-percent:0;mso-wrap-distance-left:9pt;mso-wrap-distance-top:0;mso-wrap-distance-right:9pt;mso-wrap-distance-bottom:0;mso-position-horizontal:absolute;mso-position-horizontal-relative:text;mso-position-vertical:absolute;mso-position-vertical-relative:text;mso-width-percent:0;mso-height-percent:0;mso-width-relative:margin;mso-height-relative:margin;v-text-anchor:middle" o:gfxdata="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" fillcolor="#e00" strokecolor="#e00" strokeweight="1pt"/>
             </w:pict>
           </mc:Fallback>
         </mc:AlternateContent>
       </w:r>
+      <w:r>
+        <w:rPr>
+          <w:sz w:val="20"/>
+          <w:szCs w:val="20"/>
+        </w:rPr>
+        <w:t>Instraling</w:t>
+      </w:r>
+      <w:r>
+        <w:rPr>
+          <w:sz w:val="20"/>
+          <w:szCs w:val="20"/>
+        </w:rPr>
+        <w:tab/>
+      </w:r>
+      <w:r>
+        <w:rPr>
+          <w:sz w:val="20"/>
+          <w:szCs w:val="20"/>
+        </w:rPr>
+        <w:tab/>
+      </w:r>
+      <w:proofErr w:type="gramStart"/>
+      <w:r>
+        <w:rPr>
+          <w:sz w:val="20"/>
+          <w:szCs w:val="20"/>
+        </w:rPr>
+        <w:t xml:space="preserve">{{ </w:t>
+      </w:r>
       <w:proofErr w:type="spellStart"/>
       <w:r>
         <w:rPr>
           <w:sz w:val="20"/>
           <w:szCs w:val="20"/>
-          <w:lang w:val="en-GB"/>
-        </w:rPr>
-        <w:t>Instraling</w:t>
+        </w:rPr>
+        <w:t>panel</w:t>
+      </w:r>
+      <w:proofErr w:type="gramEnd"/>
+      <w:r>
+        <w:rPr>
+          <w:sz w:val="20"/>
+          <w:szCs w:val="20"/>
+        </w:rPr>
+        <w:t>.</w:t>
+      </w:r>
+      <w:proofErr w:type="gramStart"/>
+      <w:r>
+        <w:rPr>
+          <w:sz w:val="20"/>
+          <w:szCs w:val="20"/>
+        </w:rPr>
+        <w:t>instraling</w:t>
       </w:r>
       <w:proofErr w:type="spellEnd"/>
       <w:r>
         <w:rPr>
           <w:sz w:val="20"/>
           <w:szCs w:val="20"/>
-          <w:lang w:val="en-GB"/>
-        </w:rPr>
-        <w:tab/>
-      </w:r>
-      <w:r>
-        <w:rPr>
-          <w:sz w:val="20"/>
-          <w:szCs w:val="20"/>
-          <w:lang w:val="en-GB"/>
-        </w:rPr>
-        <w:tab/>
-      </w:r>
-      <w:r>
-        <w:rPr>
-          <w:sz w:val="20"/>
-          <w:szCs w:val="20"/>
-          <w:lang w:val="en-GB"/>
-        </w:rPr>
-        <w:t>{{ panel.instraling }}</w:t>
-      </w:r>
-      <w:r>
-        <w:rPr>
-          <w:sz w:val="20"/>
-          <w:szCs w:val="20"/>
-          <w:lang w:val="en-GB"/>
-        </w:rPr>
-        <w:tab/>
-      </w:r>
-      <w:r>
-        <w:rPr>
-          <w:sz w:val="20"/>
-          <w:szCs w:val="20"/>
-          <w:lang w:val="en-GB"/>
-        </w:rPr>
-        <w:tab/>
-      </w:r>
-      <w:r>
-        <w:rPr>
-          <w:sz w:val="20"/>
-          <w:szCs w:val="20"/>
-          <w:lang w:val="en-GB"/>
-        </w:rPr>
-        <w:tab/>
-      </w:r>
-      <w:r>
-        <w:rPr>
-          <w:sz w:val="20"/>
-          <w:szCs w:val="20"/>
-          <w:lang w:val="en-GB"/>
+        </w:rPr>
+        <w:t xml:space="preserve"> }</w:t>
+      </w:r>
+      <w:proofErr w:type="gramEnd"/>
+      <w:r>
+        <w:rPr>
+          <w:sz w:val="20"/>
+          <w:szCs w:val="20"/>
+        </w:rPr>
+        <w:t>}</w:t>
+      </w:r>
+      <w:r>
+        <w:rPr>
+          <w:sz w:val="20"/>
+          <w:szCs w:val="20"/>
+        </w:rPr>
+        <w:tab/>
+      </w:r>
+      <w:r>
+        <w:rPr>
+          <w:sz w:val="20"/>
+          <w:szCs w:val="20"/>
+        </w:rPr>
+        <w:tab/>
+      </w:r>
+      <w:r>
+        <w:rPr>
+          <w:sz w:val="20"/>
+          <w:szCs w:val="20"/>
+        </w:rPr>
+        <w:tab/>
+      </w:r>
+      <w:r>
+        <w:rPr>
+          <w:sz w:val="20"/>
+          <w:szCs w:val="20"/>
         </w:rPr>
         <w:tab/>
       </w:r>
@@ -1160,13 +1654,59 @@
         </w:rPr>
         <w:tab/>
       </w:r>
+      <w:proofErr w:type="gramStart"/>
       <w:r>
         <w:rPr>
           <w:sz w:val="20"/>
           <w:szCs w:val="20"/>
           <w:lang w:val="en-GB"/>
         </w:rPr>
-        <w:t>{{ panel.drone_camera }}</w:t>
+        <w:t xml:space="preserve">{{ </w:t>
+      </w:r>
+      <w:proofErr w:type="spellStart"/>
+      <w:r>
+        <w:rPr>
+          <w:sz w:val="20"/>
+          <w:szCs w:val="20"/>
+          <w:lang w:val="en-GB"/>
+        </w:rPr>
+        <w:t>panel</w:t>
+      </w:r>
+      <w:proofErr w:type="gramEnd"/>
+      <w:r>
+        <w:rPr>
+          <w:sz w:val="20"/>
+          <w:szCs w:val="20"/>
+          <w:lang w:val="en-GB"/>
+        </w:rPr>
+        <w:t>.drone_</w:t>
+      </w:r>
+      <w:proofErr w:type="gramStart"/>
+      <w:r>
+        <w:rPr>
+          <w:sz w:val="20"/>
+          <w:szCs w:val="20"/>
+          <w:lang w:val="en-GB"/>
+        </w:rPr>
+        <w:t>camera</w:t>
+      </w:r>
+      <w:proofErr w:type="spellEnd"/>
+      <w:r>
+        <w:rPr>
+          <w:sz w:val="20"/>
+          <w:szCs w:val="20"/>
+          <w:lang w:val="en-GB"/>
+        </w:rPr>
+        <w:t xml:space="preserve"> }</w:t>
+      </w:r>
+      <w:proofErr w:type="gramEnd"/>
+      <w:r>
+        <w:rPr>
+          <w:sz w:val="20"/>
+          <w:szCs w:val="20"/>
+          <w:lang w:val="en-GB"/>
+        </w:rPr>
+        <w:t>}</w:t>
       </w:r>
       <w:r>
         <w:rPr>
@@ -1281,35 +1821,53 @@
           <w:sz w:val="20"/>
           <w:szCs w:val="20"/>
         </w:rPr>
-        <w:t>Gemiddelde paneeltemp</w:t>
-      </w:r>
-      <w:r>
-        <w:rPr>
-          <w:sz w:val="20"/>
-          <w:szCs w:val="20"/>
-        </w:rPr>
-        <w:t>.</w:t>
-      </w:r>
-      <w:r>
-        <w:rPr>
-          <w:sz w:val="20"/>
-          <w:szCs w:val="20"/>
-        </w:rPr>
-        <w:tab/>
-      </w:r>
-      <w:r>
-        <w:rPr>
-          <w:sz w:val="20"/>
-          <w:szCs w:val="20"/>
-        </w:rPr>
-        <w:tab/>
-      </w:r>
-      <w:r>
-        <w:rPr>
-          <w:sz w:val="20"/>
-          <w:szCs w:val="20"/>
-        </w:rPr>
-        <w:t>{{ panel.gem_paneeltemp }}</w:t>
+        <w:t>Gemiddelde paneeltemp.</w:t>
+      </w:r>
+      <w:r>
+        <w:rPr>
+          <w:sz w:val="20"/>
+          <w:szCs w:val="20"/>
+        </w:rPr>
+        <w:tab/>
+      </w:r>
+      <w:r>
+        <w:rPr>
+          <w:sz w:val="20"/>
+          <w:szCs w:val="20"/>
+        </w:rPr>
+        <w:tab/>
+      </w:r>
+      <w:proofErr w:type="gramStart"/>
+      <w:r>
+        <w:rPr>
+          <w:sz w:val="20"/>
+          <w:szCs w:val="20"/>
+        </w:rPr>
+        <w:t>{{ panel.gem</w:t>
+      </w:r>
+      <w:proofErr w:type="gramEnd"/>
+      <w:r>
+        <w:rPr>
+          <w:sz w:val="20"/>
+          <w:szCs w:val="20"/>
+        </w:rPr>
+        <w:t>_</w:t>
+      </w:r>
+      <w:proofErr w:type="gramStart"/>
+      <w:r>
+        <w:rPr>
+          <w:sz w:val="20"/>
+          <w:szCs w:val="20"/>
+        </w:rPr>
+        <w:t>paneeltemp }</w:t>
+      </w:r>
+      <w:proofErr w:type="gramEnd"/>
+      <w:r>
+        <w:rPr>
+          <w:sz w:val="20"/>
+          <w:szCs w:val="20"/>
+        </w:rPr>
+        <w:t>}</w:t>
       </w:r>
     </w:p>
     <w:p>
@@ -1341,12 +1899,37 @@
         </w:rPr>
         <w:tab/>
       </w:r>
-      <w:r>
-        <w:rPr>
-          <w:sz w:val="20"/>
-          <w:szCs w:val="20"/>
-        </w:rPr>
-        <w:t>{{ panel.max_temperatuur }}</w:t>
+      <w:proofErr w:type="gramStart"/>
+      <w:r>
+        <w:rPr>
+          <w:sz w:val="20"/>
+          <w:szCs w:val="20"/>
+        </w:rPr>
+        <w:t>{{ panel.max</w:t>
+      </w:r>
+      <w:proofErr w:type="gramEnd"/>
+      <w:r>
+        <w:rPr>
+          <w:sz w:val="20"/>
+          <w:szCs w:val="20"/>
+        </w:rPr>
+        <w:t>_</w:t>
+      </w:r>
+      <w:proofErr w:type="gramStart"/>
+      <w:r>
+        <w:rPr>
+          <w:sz w:val="20"/>
+          <w:szCs w:val="20"/>
+        </w:rPr>
+        <w:t>temperatuur }</w:t>
+      </w:r>
+      <w:proofErr w:type="gramEnd"/>
+      <w:r>
+        <w:rPr>
+          <w:sz w:val="20"/>
+          <w:szCs w:val="20"/>
+        </w:rPr>
+        <w:t>}</w:t>
       </w:r>
     </w:p>
     <w:p>
@@ -1378,12 +1961,37 @@
         </w:rPr>
         <w:tab/>
       </w:r>
-      <w:r>
-        <w:rPr>
-          <w:sz w:val="20"/>
-          <w:szCs w:val="20"/>
-        </w:rPr>
-        <w:t>{{ panel.min_temperatuur }}</w:t>
+      <w:proofErr w:type="gramStart"/>
+      <w:r>
+        <w:rPr>
+          <w:sz w:val="20"/>
+          <w:szCs w:val="20"/>
+        </w:rPr>
+        <w:t>{{ panel.min</w:t>
+      </w:r>
+      <w:proofErr w:type="gramEnd"/>
+      <w:r>
+        <w:rPr>
+          <w:sz w:val="20"/>
+          <w:szCs w:val="20"/>
+        </w:rPr>
+        <w:t>_</w:t>
+      </w:r>
+      <w:proofErr w:type="gramStart"/>
+      <w:r>
+        <w:rPr>
+          <w:sz w:val="20"/>
+          <w:szCs w:val="20"/>
+        </w:rPr>
+        <w:t>temperatuur }</w:t>
+      </w:r>
+      <w:proofErr w:type="gramEnd"/>
+      <w:r>
+        <w:rPr>
+          <w:sz w:val="20"/>
+          <w:szCs w:val="20"/>
+        </w:rPr>
+        <w:t>}</w:t>
       </w:r>
       <w:r>
         <w:rPr>
@@ -1458,20 +2066,38 @@
         </w:rPr>
         <w:tab/>
       </w:r>
-      <w:r>
-        <w:rPr>
-          <w:sz w:val="20"/>
-          <w:szCs w:val="20"/>
-        </w:rPr>
-        <w:t>{{ panel.temperatuurverschil }}</w:t>
-      </w:r>
-      <w:r>
-        <w:rPr>
-          <w:sz w:val="20"/>
-          <w:szCs w:val="20"/>
-        </w:rPr>
-        <w:tab/>
-      </w:r>
+      <w:proofErr w:type="gramStart"/>
+      <w:r>
+        <w:rPr>
+          <w:sz w:val="20"/>
+          <w:szCs w:val="20"/>
+        </w:rPr>
+        <w:t>{{ panel</w:t>
+      </w:r>
+      <w:proofErr w:type="gramEnd"/>
+      <w:r>
+        <w:rPr>
+          <w:sz w:val="20"/>
+          <w:szCs w:val="20"/>
+        </w:rPr>
+        <w:t>.</w:t>
+      </w:r>
+      <w:proofErr w:type="gramStart"/>
+      <w:r>
+        <w:rPr>
+          <w:sz w:val="20"/>
+          <w:szCs w:val="20"/>
+        </w:rPr>
+        <w:t>temperatuurverschil }}</w:t>
+      </w:r>
+      <w:r>
+        <w:rPr>
+          <w:sz w:val="20"/>
+          <w:szCs w:val="20"/>
+        </w:rPr>
+        <w:tab/>
+      </w:r>
+      <w:proofErr w:type="gramEnd"/>
       <w:r>
         <w:rPr>
           <w:sz w:val="20"/>
@@ -1531,6 +2157,18 @@
         <w:tab/>
       </w:r>
       <w:r>
+        <w:tab/>
+      </w:r>
+      <w:r>
+        <w:tab/>
+      </w:r>
+      <w:r>
+        <w:tab/>
+      </w:r>
+      <w:r>
+        <w:tab/>
+      </w:r>
+      <w:r>
         <w:rPr>
           <w:noProof/>
         </w:rPr>
@@ -1570,13 +2208,37 @@
           <w:szCs w:val="20"/>
         </w:rPr>
       </w:pPr>
+      <w:proofErr w:type="gramStart"/>
+      <w:r>
+        <w:rPr>
+          <w:sz w:val="20"/>
+          <w:szCs w:val="20"/>
+        </w:rPr>
+        <w:t xml:space="preserve">{{ </w:t>
+      </w:r>
       <w:proofErr w:type="spellStart"/>
       <w:r>
         <w:rPr>
           <w:sz w:val="20"/>
           <w:szCs w:val="20"/>
         </w:rPr>
-        <w:t>{{ panel.bevindingen }}</w:t>
+        <w:t>panel</w:t>
+      </w:r>
+      <w:proofErr w:type="gramEnd"/>
+      <w:r>
+        <w:rPr>
+          <w:sz w:val="20"/>
+          <w:szCs w:val="20"/>
+        </w:rPr>
+        <w:t>.</w:t>
+      </w:r>
+      <w:proofErr w:type="gramStart"/>
+      <w:r>
+        <w:rPr>
+          <w:sz w:val="20"/>
+          <w:szCs w:val="20"/>
+        </w:rPr>
+        <w:t>bevindingen</w:t>
       </w:r>
       <w:proofErr w:type="spellEnd"/>
       <w:r>
@@ -1584,110 +2246,15 @@
           <w:sz w:val="20"/>
           <w:szCs w:val="20"/>
         </w:rPr>
-      </w:r>
-      <w:proofErr w:type="spellStart"/>
-      <w:r>
-        <w:rPr>
-          <w:sz w:val="20"/>
-          <w:szCs w:val="20"/>
-        </w:rPr>
-      </w:r>
-      <w:proofErr w:type="spellEnd"/>
-      <w:r>
-        <w:rPr>
-          <w:sz w:val="20"/>
-          <w:szCs w:val="20"/>
-        </w:rPr>
-      </w:r>
-      <w:proofErr w:type="spellStart"/>
-      <w:r>
-        <w:rPr>
-          <w:sz w:val="20"/>
-          <w:szCs w:val="20"/>
-        </w:rPr>
-      </w:r>
-      <w:proofErr w:type="spellEnd"/>
-      <w:r>
-        <w:rPr>
-          <w:sz w:val="20"/>
-          <w:szCs w:val="20"/>
-        </w:rPr>
-      </w:r>
-      <w:proofErr w:type="spellStart"/>
-      <w:r>
-        <w:rPr>
-          <w:sz w:val="20"/>
-          <w:szCs w:val="20"/>
-        </w:rPr>
-      </w:r>
-      <w:proofErr w:type="spellEnd"/>
-      <w:r>
-        <w:rPr>
-          <w:sz w:val="20"/>
-          <w:szCs w:val="20"/>
-        </w:rPr>
-      </w:r>
-      <w:r>
-        <w:rPr>
-          <w:sz w:val="20"/>
-          <w:szCs w:val="20"/>
-        </w:rPr>
-      </w:r>
-      <w:proofErr w:type="spellStart"/>
-      <w:r>
-        <w:rPr>
-          <w:sz w:val="20"/>
-          <w:szCs w:val="20"/>
-        </w:rPr>
-      </w:r>
-      <w:proofErr w:type="spellEnd"/>
-      <w:r>
-        <w:rPr>
-          <w:sz w:val="20"/>
-          <w:szCs w:val="20"/>
-        </w:rPr>
-      </w:r>
-      <w:proofErr w:type="spellStart"/>
-      <w:r>
-        <w:rPr>
-          <w:sz w:val="20"/>
-          <w:szCs w:val="20"/>
-        </w:rPr>
-      </w:r>
-      <w:proofErr w:type="spellEnd"/>
-      <w:r>
-        <w:rPr>
-          <w:sz w:val="20"/>
-          <w:szCs w:val="20"/>
-        </w:rPr>
-      </w:r>
-      <w:proofErr w:type="spellStart"/>
-      <w:r>
-        <w:rPr>
-          <w:sz w:val="20"/>
-          <w:szCs w:val="20"/>
-        </w:rPr>
-      </w:r>
-      <w:proofErr w:type="spellEnd"/>
-      <w:r>
-        <w:rPr>
-          <w:sz w:val="20"/>
-          <w:szCs w:val="20"/>
-        </w:rPr>
-      </w:r>
-      <w:proofErr w:type="spellStart"/>
-      <w:r>
-        <w:rPr>
-          <w:sz w:val="20"/>
-          <w:szCs w:val="20"/>
-        </w:rPr>
-      </w:r>
-      <w:proofErr w:type="spellEnd"/>
-      <w:r>
-        <w:rPr>
-          <w:sz w:val="20"/>
-          <w:szCs w:val="20"/>
-        </w:rPr>
+        <w:t xml:space="preserve"> }</w:t>
+      </w:r>
+      <w:proofErr w:type="gramEnd"/>
+      <w:r>
+        <w:rPr>
+          <w:sz w:val="20"/>
+          <w:szCs w:val="20"/>
+        </w:rPr>
+        <w:t>}</w:t>
       </w:r>
     </w:p>
     <w:p>
@@ -1736,38 +2303,37 @@
           <w:szCs w:val="20"/>
         </w:rPr>
       </w:pPr>
-      <w:r>
-        <w:rPr>
-          <w:sz w:val="20"/>
-          <w:szCs w:val="20"/>
-        </w:rPr>
-        <w:t>{{ panel.conclusie }}</w:t>
-      </w:r>
-      <w:proofErr w:type="spellStart"/>
-      <w:r>
-        <w:rPr>
-          <w:sz w:val="20"/>
-          <w:szCs w:val="20"/>
-        </w:rPr>
-      </w:r>
-      <w:proofErr w:type="spellEnd"/>
-      <w:r>
-        <w:rPr>
-          <w:sz w:val="20"/>
-          <w:szCs w:val="20"/>
-        </w:rPr>
-      </w:r>
-      <w:r>
-        <w:rPr>
-          <w:sz w:val="20"/>
-          <w:szCs w:val="20"/>
-        </w:rPr>
-      </w:r>
-      <w:r>
-        <w:rPr>
-          <w:sz w:val="20"/>
-          <w:szCs w:val="20"/>
-        </w:rPr>
+      <w:proofErr w:type="gramStart"/>
+      <w:r>
+        <w:rPr>
+          <w:sz w:val="20"/>
+          <w:szCs w:val="20"/>
+        </w:rPr>
+        <w:t>{{ panel</w:t>
+      </w:r>
+      <w:proofErr w:type="gramEnd"/>
+      <w:r>
+        <w:rPr>
+          <w:sz w:val="20"/>
+          <w:szCs w:val="20"/>
+        </w:rPr>
+        <w:t>.</w:t>
+      </w:r>
+      <w:proofErr w:type="gramStart"/>
+      <w:r>
+        <w:rPr>
+          <w:sz w:val="20"/>
+          <w:szCs w:val="20"/>
+        </w:rPr>
+        <w:t>conclusie }</w:t>
+      </w:r>
+      <w:proofErr w:type="gramEnd"/>
+      <w:r>
+        <w:rPr>
+          <w:sz w:val="20"/>
+          <w:szCs w:val="20"/>
+        </w:rPr>
+        <w:t>}</w:t>
       </w:r>
     </w:p>
     <w:p>
@@ -1796,17 +2362,21 @@
           <w:bCs/>
           <w:sz w:val="20"/>
           <w:szCs w:val="20"/>
-        </w:rPr>
-      </w:pPr>
+          <w:lang w:val="en-US"/>
+        </w:rPr>
+      </w:pPr>
+      <w:proofErr w:type="spellStart"/>
       <w:r>
         <w:rPr>
           <w:b/>
           <w:bCs/>
           <w:sz w:val="20"/>
           <w:szCs w:val="20"/>
+          <w:lang w:val="en-US"/>
         </w:rPr>
         <w:t>Advies</w:t>
       </w:r>
+      <w:proofErr w:type="spellEnd"/>
     </w:p>
     <w:p>
       <w:pPr>
@@ -1814,66 +2384,119 @@
         <w:rPr>
           <w:sz w:val="20"/>
           <w:szCs w:val="20"/>
-        </w:rPr>
-      </w:pPr>
-      <w:r>
-        <w:rPr>
-          <w:sz w:val="20"/>
-          <w:szCs w:val="20"/>
-        </w:rPr>
-        <w:t>{{ panel.advies }}</w:t>
-      </w:r>
-      <w:r>
-        <w:rPr>
-          <w:sz w:val="20"/>
-          <w:szCs w:val="20"/>
-        </w:rPr>
-      </w:r>
-      <w:r>
-        <w:rPr>
-          <w:sz w:val="20"/>
-          <w:szCs w:val="20"/>
-        </w:rPr>
-      </w:r>
-      <w:r>
-        <w:rPr>
-          <w:sz w:val="20"/>
-          <w:szCs w:val="20"/>
-        </w:rPr>
-      </w:r>
-      <w:r>
-        <w:rPr>
-          <w:sz w:val="20"/>
-          <w:szCs w:val="20"/>
-        </w:rPr>
-      </w:r>
-      <w:r>
-        <w:rPr>
-          <w:sz w:val="20"/>
-          <w:szCs w:val="20"/>
-        </w:rPr>
-      </w:r>
-      <w:r>
-        <w:rPr>
-          <w:sz w:val="20"/>
-          <w:szCs w:val="20"/>
-        </w:rPr>
+          <w:lang w:val="en-US"/>
+        </w:rPr>
+      </w:pPr>
+      <w:proofErr w:type="gramStart"/>
+      <w:r>
+        <w:rPr>
+          <w:sz w:val="20"/>
+          <w:szCs w:val="20"/>
+          <w:lang w:val="en-US"/>
+        </w:rPr>
+        <w:t xml:space="preserve">{{ </w:t>
+      </w:r>
+      <w:proofErr w:type="spellStart"/>
+      <w:r>
+        <w:rPr>
+          <w:sz w:val="20"/>
+          <w:szCs w:val="20"/>
+          <w:lang w:val="en-US"/>
+        </w:rPr>
+        <w:t>panel</w:t>
+      </w:r>
+      <w:proofErr w:type="gramEnd"/>
+      <w:r>
+        <w:rPr>
+          <w:sz w:val="20"/>
+          <w:szCs w:val="20"/>
+          <w:lang w:val="en-US"/>
+        </w:rPr>
+        <w:t>.</w:t>
+      </w:r>
+      <w:proofErr w:type="gramStart"/>
+      <w:r>
+        <w:rPr>
+          <w:sz w:val="20"/>
+          <w:szCs w:val="20"/>
+          <w:lang w:val="en-US"/>
+        </w:rPr>
+        <w:t>advies</w:t>
+      </w:r>
+      <w:proofErr w:type="spellEnd"/>
+      <w:r>
+        <w:rPr>
+          <w:sz w:val="20"/>
+          <w:szCs w:val="20"/>
+          <w:lang w:val="en-US"/>
+        </w:rPr>
+        <w:t xml:space="preserve"> }</w:t>
+      </w:r>
+      <w:proofErr w:type="gramEnd"/>
+      <w:r>
+        <w:rPr>
+          <w:sz w:val="20"/>
+          <w:szCs w:val="20"/>
+          <w:lang w:val="en-US"/>
+        </w:rPr>
+        <w:t>}</w:t>
       </w:r>
       <w:bookmarkEnd w:id="0"/>
     </w:p>
     <w:p>
-      <w:r>
-        <w:t>{%p if not loop.last %}</w:t>
+      <w:pPr>
+        <w:rPr>
+          <w:lang w:val="en-US"/>
+        </w:rPr>
+      </w:pPr>
+      <w:r>
+        <w:rPr>
+          <w:lang w:val="en-US"/>
+        </w:rPr>
+        <w:t xml:space="preserve">{%p if not </w:t>
+      </w:r>
+      <w:proofErr w:type="spellStart"/>
+      <w:proofErr w:type="gramStart"/>
+      <w:r>
+        <w:rPr>
+          <w:lang w:val="en-US"/>
+        </w:rPr>
+        <w:t>loop.last</w:t>
+      </w:r>
+      <w:proofErr w:type="spellEnd"/>
+      <w:proofErr w:type="gramEnd"/>
+      <w:r>
+        <w:rPr>
+          <w:lang w:val="en-US"/>
+        </w:rPr>
+        <w:t xml:space="preserve"> %}</w:t>
       </w:r>
     </w:p>
     <w:p>
-      <w:r>
+      <w:pPr>
+        <w:rPr>
+          <w:lang w:val="en-US"/>
+        </w:rPr>
+      </w:pPr>
+      <w:r>
+        <w:rPr>
+          <w:lang w:val="en-US"/>
+        </w:rPr>
         <w:br w:type="page"/>
       </w:r>
     </w:p>
     <w:p>
       <w:r>
-        <w:t>{%p endif %}</w:t>
+        <w:lastRenderedPageBreak/>
+        <w:t xml:space="preserve">{%p </w:t>
+      </w:r>
+      <w:proofErr w:type="spellStart"/>
+      <w:r>
+        <w:t>endif</w:t>
+      </w:r>
+      <w:proofErr w:type="spellEnd"/>
+      <w:r>
+        <w:t xml:space="preserve"> %}</w:t>
       </w:r>
     </w:p>
     <w:p>
@@ -1882,11 +2505,11 @@
       </w:r>
     </w:p>
     <w:sectPr>
-      <w:headerReference w:type="even" r:id="rId14"/>
-      <w:headerReference w:type="default" r:id="rId15"/>
-      <w:footerReference w:type="default" r:id="rId16"/>
-      <w:headerReference w:type="first" r:id="rId17"/>
-      <w:footerReference w:type="first" r:id="rId18"/>
+      <w:headerReference w:type="even" r:id="rId13"/>
+      <w:headerReference w:type="default" r:id="rId14"/>
+      <w:footerReference w:type="default" r:id="rId15"/>
+      <w:headerReference w:type="first" r:id="rId16"/>
+      <w:footerReference w:type="first" r:id="rId17"/>
       <w:pgSz w:w="11906" w:h="16838"/>
       <w:pgMar w:top="284" w:right="992" w:bottom="1135" w:left="992" w:header="680" w:footer="709" w:gutter="0"/>
       <w:cols w:space="708"/>
@@ -1925,7 +2548,7 @@
 <w:ftr xmlns:wpc="http://schemas.microsoft.com/office/word/2010/wordprocessingCanvas" xmlns:cx="http://schemas.microsoft.com/office/drawing/2014/chartex" xmlns:cx1="http://schemas.microsoft.com/office/drawing/2015/9/8/chartex" xmlns:cx2="http://schemas.microsoft.com/office/drawing/2015/10/21/chartex" xmlns:cx3="http://schemas.microsoft.com/office/drawing/2016/5/9/chartex" xmlns:cx4="http://schemas.microsoft.com/office/drawing/2016/5/10/chartex" xmlns:cx5="http://schemas.microsoft.com/office/drawing/2016/5/11/chartex" xmlns:cx6="http://schemas.microsoft.com/office/drawing/2016/5/12/chartex" xmlns:cx7="http://schemas.microsoft.com/office/drawing/2016/5/13/chartex" xmlns:cx8="http://schemas.microsoft.com/office/drawing/2016/5/14/chartex" xmlns:mc="http://schemas.openxmlformats.org/markup-compatibility/2006" xmlns:aink="http://schemas.microsoft.com/office/drawing/2016/ink" xmlns:am3d="http://schemas.microsoft.com/office/drawing/2017/model3d" xmlns:o="urn:schemas-microsoft-com:office:office" xmlns:oel="http://schemas.microsoft.com/office/2019/extlst" xmlns:r="http://schemas.openxmlformats.org/officeDocument/2006/relationships" xmlns:m="http://schemas.openxmlformats.org/officeDocument/2006/math" xmlns:v="urn:schemas-microsoft-com:vml" xmlns:wp14="http://schemas.microsoft.com/office/word/2010/wordprocessingDrawing" xmlns:wp="http://schemas.openxmlformats.org/drawingml/2006/wordprocessingDrawing" xmlns:w10="urn:schemas-microsoft-com:office:word" xmlns:w="http://schemas.openxmlformats.org/wordprocessingml/2006/main" xmlns:w14="http://schemas.microsoft.com/office/word/2010/wordml" xmlns:w15="http://schemas.microsoft.com/office/word/2012/wordml" xmlns:w16cex="http://schemas.microsoft.com/office/word/2018/wordml/cex" xmlns:w16cid="http://schemas.microsoft.com/office/word/2016/wordml/cid" xmlns:w16="http://schemas.microsoft.com/office/word/2018/wordml" xmlns:w16du="http://schemas.microsoft.com/office/word/2023/wordml/word16du" xmlns:w16sdtdh="http://schemas.microsoft.com/office/word/2020/wordml/sdtdatahash" xmlns:w16sdtfl="http://schemas.microsoft.com/office/word/2024/wordml/sdtformatlock" xmlns:w16se="http://schemas.microsoft.com/office/word/2015/wordml/symex" xmlns:wpg="http://schemas.microsoft.com/office/word/2010/wordprocessingGroup" xmlns:wpi="http://schemas.microsoft.com/office/word/2010/wordprocessingInk" xmlns:wne="http://schemas.microsoft.com/office/word/2006/wordml" xmlns:wps="http://schemas.microsoft.com/office/word/2010/wordprocessingShape" mc:Ignorable="w14 w15 w16se w16cid w16 w16cex w16sdtdh w16sdtfl w16du wp14">
   <w:p>
     <w:pPr>
-      <w:pStyle w:val="Voettekst"/>
+      <w:pStyle w:val="Footer"/>
       <w:tabs>
         <w:tab w:val="clear" w:pos="9072"/>
         <w:tab w:val="right" w:pos="9922"/>
@@ -2100,7 +2723,7 @@
         <w:sz w:val="18"/>
         <w:szCs w:val="18"/>
       </w:rPr>
-      <w:t>16 juni 2026</w:t>
+      <w:t>24 juni 2026</w:t>
     </w:r>
     <w:r>
       <w:rPr>
@@ -2121,7 +2744,7 @@
 <w:ftr xmlns:wpc="http://schemas.microsoft.com/office/word/2010/wordprocessingCanvas" xmlns:cx="http://schemas.microsoft.com/office/drawing/2014/chartex" xmlns:cx1="http://schemas.microsoft.com/office/drawing/2015/9/8/chartex" xmlns:cx2="http://schemas.microsoft.com/office/drawing/2015/10/21/chartex" xmlns:cx3="http://schemas.microsoft.com/office/drawing/2016/5/9/chartex" xmlns:cx4="http://schemas.microsoft.com/office/drawing/2016/5/10/chartex" xmlns:cx5="http://schemas.microsoft.com/office/drawing/2016/5/11/chartex" xmlns:cx6="http://schemas.microsoft.com/office/drawing/2016/5/12/chartex" xmlns:cx7="http://schemas.microsoft.com/office/drawing/2016/5/13/chartex" xmlns:cx8="http://schemas.microsoft.com/office/drawing/2016/5/14/chartex" xmlns:mc="http://schemas.openxmlformats.org/markup-compatibility/2006" xmlns:aink="http://schemas.microsoft.com/office/drawing/2016/ink" xmlns:am3d="http://schemas.microsoft.com/office/drawing/2017/model3d" xmlns:o="urn:schemas-microsoft-com:office:office" xmlns:oel="http://schemas.microsoft.com/office/2019/extlst" xmlns:r="http://schemas.openxmlformats.org/officeDocument/2006/relationships" xmlns:m="http://schemas.openxmlformats.org/officeDocument/2006/math" xmlns:v="urn:schemas-microsoft-com:vml" xmlns:wp14="http://schemas.microsoft.com/office/word/2010/wordprocessingDrawing" xmlns:wp="http://schemas.openxmlformats.org/drawingml/2006/wordprocessingDrawing" xmlns:w10="urn:schemas-microsoft-com:office:word" xmlns:w="http://schemas.openxmlformats.org/wordprocessingml/2006/main" xmlns:w14="http://schemas.microsoft.com/office/word/2010/wordml" xmlns:w15="http://schemas.microsoft.com/office/word/2012/wordml" xmlns:w16cex="http://schemas.microsoft.com/office/word/2018/wordml/cex" xmlns:w16cid="http://schemas.microsoft.com/office/word/2016/wordml/cid" xmlns:w16="http://schemas.microsoft.com/office/word/2018/wordml" xmlns:w16du="http://schemas.microsoft.com/office/word/2023/wordml/word16du" xmlns:w16sdtdh="http://schemas.microsoft.com/office/word/2020/wordml/sdtdatahash" xmlns:w16sdtfl="http://schemas.microsoft.com/office/word/2024/wordml/sdtformatlock" xmlns:w16se="http://schemas.microsoft.com/office/word/2015/wordml/symex" xmlns:wpg="http://schemas.microsoft.com/office/word/2010/wordprocessingGroup" xmlns:wpi="http://schemas.microsoft.com/office/word/2010/wordprocessingInk" xmlns:wne="http://schemas.microsoft.com/office/word/2006/wordml" xmlns:wps="http://schemas.microsoft.com/office/word/2010/wordprocessingShape" mc:Ignorable="w14 w15 w16se w16cid w16 w16cex w16sdtdh w16sdtfl w16du wp14">
   <w:p>
     <w:pPr>
-      <w:pStyle w:val="Voettekst"/>
+      <w:pStyle w:val="Footer"/>
     </w:pPr>
     <w:r>
       <w:rPr>
@@ -2133,7 +2756,7 @@
       <mc:AlternateContent>
         <mc:Choice Requires="wps">
           <w:drawing>
-            <wp:anchor distT="0" distB="0" distL="114300" distR="114300" simplePos="0" relativeHeight="251658240" behindDoc="0" locked="0" layoutInCell="1" allowOverlap="1" wp14:anchorId="15E3606F" wp14:editId="55CF5C93">
+            <wp:anchor distT="0" distB="0" distL="114300" distR="114300" simplePos="0" relativeHeight="251658240" behindDoc="0" locked="0" layoutInCell="1" allowOverlap="1" wp14:anchorId="112D08FB" wp14:editId="07BE434E">
               <wp:simplePos x="0" y="0"/>
               <wp:positionH relativeFrom="column">
                 <wp:posOffset>-77027</wp:posOffset>
@@ -2302,7 +2925,7 @@
             </wp:anchor>
           </w:drawing>
         </mc:Choice>
-        <mc:Fallback>
+        <mc:Fallback xmlns="">
           <w:pict>
             <v:shapetype w14:anchorId="15E3606F" id="_x0000_t202" coordsize="21600,21600" o:spt="202" path="m,l,21600r21600,l21600,xe">
               <v:stroke joinstyle="miter"/>
@@ -2444,7 +3067,7 @@
       <mc:AlternateContent>
         <mc:Choice Requires="wps">
           <w:drawing>
-            <wp:anchor distT="45720" distB="45720" distL="114300" distR="114300" simplePos="0" relativeHeight="251658241" behindDoc="0" locked="0" layoutInCell="1" allowOverlap="1" wp14:anchorId="10B52C07" wp14:editId="7E22A496">
+            <wp:anchor distT="45720" distB="45720" distL="114300" distR="114300" simplePos="0" relativeHeight="251658241" behindDoc="0" locked="0" layoutInCell="1" allowOverlap="1" wp14:anchorId="2928AAB4" wp14:editId="18298B0B">
               <wp:simplePos x="0" y="0"/>
               <wp:positionH relativeFrom="column">
                 <wp:posOffset>3825122</wp:posOffset>
@@ -2496,7 +3119,7 @@
                               <w:noProof/>
                             </w:rPr>
                             <w:drawing>
-                              <wp:inline distT="0" distB="0" distL="0" distR="0" wp14:anchorId="2D9806D4" wp14:editId="65599633">
+                              <wp:inline distT="0" distB="0" distL="0" distR="0" wp14:anchorId="6D158CE4" wp14:editId="6ECB0A53">
                                 <wp:extent cx="2392325" cy="530878"/>
                                 <wp:effectExtent l="0" t="0" r="8255" b="2540"/>
                                 <wp:docPr id="420118151" name="Afbeelding 30"/>
@@ -2557,7 +3180,7 @@
             </wp:anchor>
           </w:drawing>
         </mc:Choice>
-        <mc:Fallback>
+        <mc:Fallback xmlns="">
           <w:pict>
             <v:shape w14:anchorId="10B52C07" id="_x0000_s1029" type="#_x0000_t202" style="position:absolute;margin-left:301.2pt;margin-top:-14.4pt;width:230.05pt;height:54.1pt;z-index:251658241;visibility:visible;mso-wrap-style:square;mso-width-percent:0;mso-height-percent:0;mso-wrap-distance-left:9pt;mso-wrap-distance-top:3.6pt;mso-wrap-distance-right:9pt;mso-wrap-distance-bottom:3.6pt;mso-position-horizontal:absolute;mso-position-horizontal-relative:text;mso-position-vertical:absolute;mso-position-vertical-relative:text;mso-width-percent:0;mso-height-percent:0;mso-width-relative:margin;mso-height-relative:margin;v-text-anchor:top" o:gfxdata="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" fillcolor="white [3212]" strokecolor="white [3212]">
               <v:textbox>
@@ -2588,7 +3211,7 @@
                                   </pic:cNvPicPr>
                                 </pic:nvPicPr>
                                 <pic:blipFill>
-                                  <a:blip r:embed="rId1">
+                                  <a:blip r:embed="rId2">
                                     <a:extLst>
                                       <a:ext uri="{28A0092B-C50C-407E-A947-70E740481C1C}">
                                         <a14:useLocalDpi xmlns:a14="http://schemas.microsoft.com/office/drawing/2010/main" val="0"/>
@@ -2655,7 +3278,7 @@
 <w:hdr xmlns:wpc="http://schemas.microsoft.com/office/word/2010/wordprocessingCanvas" xmlns:cx="http://schemas.microsoft.com/office/drawing/2014/chartex" xmlns:cx1="http://schemas.microsoft.com/office/drawing/2015/9/8/chartex" xmlns:cx2="http://schemas.microsoft.com/office/drawing/2015/10/21/chartex" xmlns:cx3="http://schemas.microsoft.com/office/drawing/2016/5/9/chartex" xmlns:cx4="http://schemas.microsoft.com/office/drawing/2016/5/10/chartex" xmlns:cx5="http://schemas.microsoft.com/office/drawing/2016/5/11/chartex" xmlns:cx6="http://schemas.microsoft.com/office/drawing/2016/5/12/chartex" xmlns:cx7="http://schemas.microsoft.com/office/drawing/2016/5/13/chartex" xmlns:cx8="http://schemas.microsoft.com/office/drawing/2016/5/14/chartex" xmlns:mc="http://schemas.openxmlformats.org/markup-compatibility/2006" xmlns:aink="http://schemas.microsoft.com/office/drawing/2016/ink" xmlns:am3d="http://schemas.microsoft.com/office/drawing/2017/model3d" xmlns:o="urn:schemas-microsoft-com:office:office" xmlns:oel="http://schemas.microsoft.com/office/2019/extlst" xmlns:r="http://schemas.openxmlformats.org/officeDocument/2006/relationships" xmlns:m="http://schemas.openxmlformats.org/officeDocument/2006/math" xmlns:v="urn:schemas-microsoft-com:vml" xmlns:wp14="http://schemas.microsoft.com/office/word/2010/wordprocessingDrawing" xmlns:wp="http://schemas.openxmlformats.org/drawingml/2006/wordprocessingDrawing" xmlns:w10="urn:schemas-microsoft-com:office:word" xmlns:w="http://schemas.openxmlformats.org/wordprocessingml/2006/main" xmlns:w14="http://schemas.microsoft.com/office/word/2010/wordml" xmlns:w15="http://schemas.microsoft.com/office/word/2012/wordml" xmlns:w16cex="http://schemas.microsoft.com/office/word/2018/wordml/cex" xmlns:w16cid="http://schemas.microsoft.com/office/word/2016/wordml/cid" xmlns:w16="http://schemas.microsoft.com/office/word/2018/wordml" xmlns:w16du="http://schemas.microsoft.com/office/word/2023/wordml/word16du" xmlns:w16sdtdh="http://schemas.microsoft.com/office/word/2020/wordml/sdtdatahash" xmlns:w16sdtfl="http://schemas.microsoft.com/office/word/2024/wordml/sdtformatlock" xmlns:w16se="http://schemas.microsoft.com/office/word/2015/wordml/symex" xmlns:wpg="http://schemas.microsoft.com/office/word/2010/wordprocessingGroup" xmlns:wpi="http://schemas.microsoft.com/office/word/2010/wordprocessingInk" xmlns:wne="http://schemas.microsoft.com/office/word/2006/wordml" xmlns:wps="http://schemas.microsoft.com/office/word/2010/wordprocessingShape" mc:Ignorable="w14 w15 w16se w16cid w16 w16cex w16sdtdh w16sdtfl w16du wp14">
   <w:p>
     <w:pPr>
-      <w:pStyle w:val="Koptekst"/>
+      <w:pStyle w:val="Header"/>
     </w:pPr>
     <w:r>
       <w:rPr>
@@ -2664,7 +3287,7 @@
       <mc:AlternateContent>
         <mc:Choice Requires="wps">
           <w:drawing>
-            <wp:anchor distT="0" distB="0" distL="114300" distR="114300" simplePos="0" relativeHeight="251658242" behindDoc="1" locked="0" layoutInCell="0" allowOverlap="1" wp14:anchorId="1A0C6A3D" wp14:editId="695456C9">
+            <wp:anchor distT="0" distB="0" distL="114300" distR="114300" simplePos="0" relativeHeight="251658242" behindDoc="1" locked="0" layoutInCell="0" allowOverlap="1" wp14:anchorId="4FF81A66" wp14:editId="7C19AB5E">
               <wp:simplePos x="0" y="0"/>
               <wp:positionH relativeFrom="margin">
                 <wp:align>center</wp:align>
@@ -2710,7 +3333,7 @@
                       <w:txbxContent>
                         <w:p>
                           <w:pPr>
-                            <w:pStyle w:val="Normaalweb"/>
+                            <w:pStyle w:val="NormalWeb"/>
                             <w:spacing w:before="0" w:beforeAutospacing="0" w:after="0" w:afterAutospacing="0"/>
                             <w:jc w:val="center"/>
                           </w:pPr>
@@ -2755,18 +3378,18 @@
         </mc:Choice>
         <mc:Fallback>
           <w:pict>
-            <v:shapetype w14:anchorId="1A0C6A3D" id="_x0000_t202" coordsize="21600,21600" o:spt="202" path="m,l,21600r21600,l21600,xe">
+            <v:shapetype w14:anchorId="4FF81A66" id="_x0000_t202" coordsize="21600,21600" o:spt="202" path="m,l,21600r21600,l21600,xe">
               <v:stroke joinstyle="miter"/>
               <v:path gradientshapeok="t" o:connecttype="rect"/>
             </v:shapetype>
-            <v:shape id="Tekstvak 6" o:spid="_x0000_s1027" type="#_x0000_t202" style="position:absolute;margin-left:0;margin-top:0;width:475.5pt;height:203.8pt;rotation:-45;z-index:-251658238;visibility:visible;mso-wrap-style:square;mso-width-percent:0;mso-height-percent:0;mso-wrap-distance-left:9pt;mso-wrap-distance-top:0;mso-wrap-distance-right:9pt;mso-wrap-distance-bottom:0;mso-position-horizontal:center;mso-position-horizontal-relative:margin;mso-position-vertical:center;mso-position-vertical-relative:margin;mso-width-percent:0;mso-height-percent:0;mso-width-relative:page;mso-height-relative:page;v-text-anchor:top" o:gfxdata="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" o:allowincell="f" filled="f" stroked="f">
+            <v:shape id="Tekstvak 6" o:spid="_x0000_s1027" type="#_x0000_t202" style="position:absolute;margin-left:0;margin-top:0;width:475.5pt;height:203.8pt;rotation:-45;z-index:-251658238;visibility:visible;mso-wrap-style:square;mso-width-percent:0;mso-height-percent:0;mso-wrap-distance-left:9pt;mso-wrap-distance-top:0;mso-wrap-distance-right:9pt;mso-wrap-distance-bottom:0;mso-position-horizontal:center;mso-position-horizontal-relative:margin;mso-position-vertical:center;mso-position-vertical-relative:margin;mso-width-percent:0;mso-height-percent:0;mso-width-relative:page;mso-height-relative:page;v-text-anchor:top" o:gfxdata="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" o:allowincell="f" filled="f" stroked="f">
               <v:stroke joinstyle="round"/>
               <o:lock v:ext="edit" shapetype="t"/>
               <v:textbox style="mso-fit-shape-to-text:t">
                 <w:txbxContent>
                   <w:p>
                     <w:pPr>
-                      <w:pStyle w:val="Normaalweb"/>
+                      <w:pStyle w:val="NormalWeb"/>
                       <w:spacing w:before="0" w:beforeAutospacing="0" w:after="0" w:afterAutospacing="0"/>
                       <w:jc w:val="center"/>
                     </w:pPr>
@@ -2803,7 +3426,7 @@
 <w:hdr xmlns:wpc="http://schemas.microsoft.com/office/word/2010/wordprocessingCanvas" xmlns:cx="http://schemas.microsoft.com/office/drawing/2014/chartex" xmlns:cx1="http://schemas.microsoft.com/office/drawing/2015/9/8/chartex" xmlns:cx2="http://schemas.microsoft.com/office/drawing/2015/10/21/chartex" xmlns:cx3="http://schemas.microsoft.com/office/drawing/2016/5/9/chartex" xmlns:cx4="http://schemas.microsoft.com/office/drawing/2016/5/10/chartex" xmlns:cx5="http://schemas.microsoft.com/office/drawing/2016/5/11/chartex" xmlns:cx6="http://schemas.microsoft.com/office/drawing/2016/5/12/chartex" xmlns:cx7="http://schemas.microsoft.com/office/drawing/2016/5/13/chartex" xmlns:cx8="http://schemas.microsoft.com/office/drawing/2016/5/14/chartex" xmlns:mc="http://schemas.openxmlformats.org/markup-compatibility/2006" xmlns:aink="http://schemas.microsoft.com/office/drawing/2016/ink" xmlns:am3d="http://schemas.microsoft.com/office/drawing/2017/model3d" xmlns:o="urn:schemas-microsoft-com:office:office" xmlns:oel="http://schemas.microsoft.com/office/2019/extlst" xmlns:r="http://schemas.openxmlformats.org/officeDocument/2006/relationships" xmlns:m="http://schemas.openxmlformats.org/officeDocument/2006/math" xmlns:v="urn:schemas-microsoft-com:vml" xmlns:wp14="http://schemas.microsoft.com/office/word/2010/wordprocessingDrawing" xmlns:wp="http://schemas.openxmlformats.org/drawingml/2006/wordprocessingDrawing" xmlns:w10="urn:schemas-microsoft-com:office:word" xmlns:w="http://schemas.openxmlformats.org/wordprocessingml/2006/main" xmlns:w14="http://schemas.microsoft.com/office/word/2010/wordml" xmlns:w15="http://schemas.microsoft.com/office/word/2012/wordml" xmlns:w16cex="http://schemas.microsoft.com/office/word/2018/wordml/cex" xmlns:w16cid="http://schemas.microsoft.com/office/word/2016/wordml/cid" xmlns:w16="http://schemas.microsoft.com/office/word/2018/wordml" xmlns:w16du="http://schemas.microsoft.com/office/word/2023/wordml/word16du" xmlns:w16sdtdh="http://schemas.microsoft.com/office/word/2020/wordml/sdtdatahash" xmlns:w16sdtfl="http://schemas.microsoft.com/office/word/2024/wordml/sdtformatlock" xmlns:w16se="http://schemas.microsoft.com/office/word/2015/wordml/symex" xmlns:wpg="http://schemas.microsoft.com/office/word/2010/wordprocessingGroup" xmlns:wpi="http://schemas.microsoft.com/office/word/2010/wordprocessingInk" xmlns:wne="http://schemas.microsoft.com/office/word/2006/wordml" xmlns:wps="http://schemas.microsoft.com/office/word/2010/wordprocessingShape" mc:Ignorable="w14 w15 w16se w16cid w16 w16cex w16sdtdh w16sdtfl w16du wp14">
   <w:p>
     <w:pPr>
-      <w:pStyle w:val="Koptekst"/>
+      <w:pStyle w:val="Header"/>
       <w:jc w:val="center"/>
       <w:rPr>
         <w:sz w:val="16"/>
@@ -2817,7 +3440,7 @@
         <w:szCs w:val="16"/>
       </w:rPr>
       <w:drawing>
-        <wp:inline distT="0" distB="0" distL="0" distR="0" wp14:anchorId="54DCBB24" wp14:editId="4D2B97B0">
+        <wp:inline distT="0" distB="0" distL="0" distR="0" wp14:anchorId="7FD04010" wp14:editId="73369CDF">
           <wp:extent cx="2160000" cy="479806"/>
           <wp:effectExtent l="0" t="0" r="0" b="0"/>
           <wp:docPr id="78947686" name="Afbeelding 31"/>
@@ -2861,7 +3484,7 @@
   </w:p>
   <w:p>
     <w:pPr>
-      <w:pStyle w:val="Koptekst"/>
+      <w:pStyle w:val="Header"/>
       <w:rPr>
         <w:sz w:val="16"/>
         <w:szCs w:val="16"/>
@@ -2875,7 +3498,7 @@
 <w:hdr xmlns:wpc="http://schemas.microsoft.com/office/word/2010/wordprocessingCanvas" xmlns:cx="http://schemas.microsoft.com/office/drawing/2014/chartex" xmlns:cx1="http://schemas.microsoft.com/office/drawing/2015/9/8/chartex" xmlns:cx2="http://schemas.microsoft.com/office/drawing/2015/10/21/chartex" xmlns:cx3="http://schemas.microsoft.com/office/drawing/2016/5/9/chartex" xmlns:cx4="http://schemas.microsoft.com/office/drawing/2016/5/10/chartex" xmlns:cx5="http://schemas.microsoft.com/office/drawing/2016/5/11/chartex" xmlns:cx6="http://schemas.microsoft.com/office/drawing/2016/5/12/chartex" xmlns:cx7="http://schemas.microsoft.com/office/drawing/2016/5/13/chartex" xmlns:cx8="http://schemas.microsoft.com/office/drawing/2016/5/14/chartex" xmlns:mc="http://schemas.openxmlformats.org/markup-compatibility/2006" xmlns:aink="http://schemas.microsoft.com/office/drawing/2016/ink" xmlns:am3d="http://schemas.microsoft.com/office/drawing/2017/model3d" xmlns:o="urn:schemas-microsoft-com:office:office" xmlns:oel="http://schemas.microsoft.com/office/2019/extlst" xmlns:r="http://schemas.openxmlformats.org/officeDocument/2006/relationships" xmlns:m="http://schemas.openxmlformats.org/officeDocument/2006/math" xmlns:v="urn:schemas-microsoft-com:vml" xmlns:wp14="http://schemas.microsoft.com/office/word/2010/wordprocessingDrawing" xmlns:wp="http://schemas.openxmlformats.org/drawingml/2006/wordprocessingDrawing" xmlns:w10="urn:schemas-microsoft-com:office:word" xmlns:w="http://schemas.openxmlformats.org/wordprocessingml/2006/main" xmlns:w14="http://schemas.microsoft.com/office/word/2010/wordml" xmlns:w15="http://schemas.microsoft.com/office/word/2012/wordml" xmlns:w16cex="http://schemas.microsoft.com/office/word/2018/wordml/cex" xmlns:w16cid="http://schemas.microsoft.com/office/word/2016/wordml/cid" xmlns:w16="http://schemas.microsoft.com/office/word/2018/wordml" xmlns:w16du="http://schemas.microsoft.com/office/word/2023/wordml/word16du" xmlns:w16sdtdh="http://schemas.microsoft.com/office/word/2020/wordml/sdtdatahash" xmlns:w16sdtfl="http://schemas.microsoft.com/office/word/2024/wordml/sdtformatlock" xmlns:w16se="http://schemas.microsoft.com/office/word/2015/wordml/symex" xmlns:wpg="http://schemas.microsoft.com/office/word/2010/wordprocessingGroup" xmlns:wpi="http://schemas.microsoft.com/office/word/2010/wordprocessingInk" xmlns:wne="http://schemas.microsoft.com/office/word/2006/wordml" xmlns:wps="http://schemas.microsoft.com/office/word/2010/wordprocessingShape" mc:Ignorable="w14 w15 w16se w16cid w16 w16cex w16sdtdh w16sdtfl w16du wp14">
   <w:p>
     <w:pPr>
-      <w:pStyle w:val="Koptekst"/>
+      <w:pStyle w:val="Header"/>
       <w:rPr>
         <w:sz w:val="16"/>
         <w:szCs w:val="16"/>
@@ -2891,7 +3514,7 @@
   </w:p>
   <w:p>
     <w:pPr>
-      <w:pStyle w:val="Koptekst"/>
+      <w:pStyle w:val="Header"/>
       <w:rPr>
         <w:sz w:val="16"/>
         <w:szCs w:val="16"/>
@@ -2900,7 +3523,7 @@
   </w:p>
   <w:p>
     <w:pPr>
-      <w:pStyle w:val="Koptekst"/>
+      <w:pStyle w:val="Header"/>
     </w:pPr>
   </w:p>
 </w:hdr>
@@ -3480,7 +4103,7 @@
     <w:lvl w:ilvl="0" w:tplc="AC76AA6E">
       <w:start w:val="1"/>
       <w:numFmt w:val="bullet"/>
-      <w:pStyle w:val="Lijstalinea"/>
+      <w:pStyle w:val="ListParagraph"/>
       <w:lvlText w:val=""/>
       <w:lvlJc w:val="left"/>
       <w:pPr>
@@ -3796,7 +4419,7 @@
     <w:lvl w:ilvl="0" w:tplc="1CD0AA04">
       <w:start w:val="1"/>
       <w:numFmt w:val="upperLetter"/>
-      <w:pStyle w:val="Kop4"/>
+      <w:pStyle w:val="Heading4"/>
       <w:lvlText w:val="Bijlage %1"/>
       <w:lvlJc w:val="left"/>
       <w:pPr>
@@ -4002,7 +4625,7 @@
     <w:lvl w:ilvl="0" w:tplc="CD746EEA">
       <w:start w:val="1"/>
       <w:numFmt w:val="decimal"/>
-      <w:pStyle w:val="Kop1"/>
+      <w:pStyle w:val="Heading1"/>
       <w:lvlText w:val="%1."/>
       <w:lvlJc w:val="left"/>
       <w:pPr>
@@ -4105,7 +4728,7 @@
     <w:lvl w:ilvl="1">
       <w:start w:val="1"/>
       <w:numFmt w:val="decimal"/>
-      <w:pStyle w:val="Kop2"/>
+      <w:pStyle w:val="Heading2"/>
       <w:suff w:val="space"/>
       <w:lvlText w:val="%1.%2"/>
       <w:lvlJc w:val="left"/>
@@ -4119,7 +4742,7 @@
     <w:lvl w:ilvl="2">
       <w:start w:val="1"/>
       <w:numFmt w:val="decimal"/>
-      <w:pStyle w:val="Kop3"/>
+      <w:pStyle w:val="Heading3"/>
       <w:suff w:val="space"/>
       <w:lvlText w:val="%1.%2.%3"/>
       <w:lvlJc w:val="left"/>
@@ -5697,7 +6320,7 @@
     <w:lsdException w:name="Unresolved Mention" w:semiHidden="1" w:unhideWhenUsed="1"/>
     <w:lsdException w:name="Smart Link" w:semiHidden="1" w:unhideWhenUsed="1"/>
   </w:latentStyles>
-  <w:style w:type="paragraph" w:default="1" w:styleId="Standaard">
+  <w:style w:type="paragraph" w:default="1" w:styleId="Normal">
     <w:name w:val="Normal"/>
     <w:qFormat/>
     <w:rsid w:val="00EA0AFE"/>
@@ -5706,12 +6329,12 @@
       <w:contextualSpacing/>
     </w:pPr>
   </w:style>
-  <w:style w:type="paragraph" w:styleId="Kop1">
+  <w:style w:type="paragraph" w:styleId="Heading1">
     <w:name w:val="heading 1"/>
     <w:aliases w:val="LEKK 1"/>
     <w:basedOn w:val="TF-Algemeen"/>
-    <w:next w:val="Standaard"/>
-    <w:link w:val="Kop1Char"/>
+    <w:next w:val="Normal"/>
+    <w:link w:val="Heading1Char"/>
     <w:autoRedefine/>
     <w:uiPriority w:val="9"/>
     <w:qFormat/>
@@ -5730,12 +6353,12 @@
       <w:szCs w:val="32"/>
     </w:rPr>
   </w:style>
-  <w:style w:type="paragraph" w:styleId="Kop2">
+  <w:style w:type="paragraph" w:styleId="Heading2">
     <w:name w:val="heading 2"/>
     <w:aliases w:val="LEKK 2"/>
-    <w:basedOn w:val="Kop1"/>
-    <w:next w:val="Standaard"/>
-    <w:link w:val="Kop2Char"/>
+    <w:basedOn w:val="Heading1"/>
+    <w:next w:val="Normal"/>
+    <w:link w:val="Heading2Char"/>
     <w:autoRedefine/>
     <w:uiPriority w:val="9"/>
     <w:unhideWhenUsed/>
@@ -5755,12 +6378,12 @@
       <w:lang w:val="nl-NL"/>
     </w:rPr>
   </w:style>
-  <w:style w:type="paragraph" w:styleId="Kop3">
+  <w:style w:type="paragraph" w:styleId="Heading3">
     <w:name w:val="heading 3"/>
     <w:aliases w:val="LEKK 3"/>
-    <w:basedOn w:val="Kop2"/>
-    <w:next w:val="Standaard"/>
-    <w:link w:val="Kop3Char"/>
+    <w:basedOn w:val="Heading2"/>
+    <w:next w:val="Normal"/>
+    <w:link w:val="Heading3Char"/>
     <w:uiPriority w:val="9"/>
     <w:unhideWhenUsed/>
     <w:qFormat/>
@@ -5776,12 +6399,12 @@
       <w:szCs w:val="24"/>
     </w:rPr>
   </w:style>
-  <w:style w:type="paragraph" w:styleId="Kop4">
+  <w:style w:type="paragraph" w:styleId="Heading4">
     <w:name w:val="heading 4"/>
     <w:aliases w:val="LEKK 4"/>
-    <w:basedOn w:val="Kop1"/>
-    <w:next w:val="Standaard"/>
-    <w:link w:val="Kop4Char"/>
+    <w:basedOn w:val="Heading1"/>
+    <w:next w:val="Normal"/>
+    <w:link w:val="Heading4Char"/>
     <w:uiPriority w:val="9"/>
     <w:unhideWhenUsed/>
     <w:qFormat/>
@@ -5793,11 +6416,11 @@
       <w:outlineLvl w:val="3"/>
     </w:pPr>
   </w:style>
-  <w:style w:type="paragraph" w:styleId="Kop5">
+  <w:style w:type="paragraph" w:styleId="Heading5">
     <w:name w:val="heading 5"/>
-    <w:basedOn w:val="Standaard"/>
-    <w:next w:val="Standaard"/>
-    <w:link w:val="Kop5Char"/>
+    <w:basedOn w:val="Normal"/>
+    <w:next w:val="Normal"/>
+    <w:link w:val="Heading5Char"/>
     <w:uiPriority w:val="9"/>
     <w:semiHidden/>
     <w:unhideWhenUsed/>
@@ -5813,11 +6436,11 @@
       <w:color w:val="2E74B5" w:themeColor="accent1" w:themeShade="BF"/>
     </w:rPr>
   </w:style>
-  <w:style w:type="paragraph" w:styleId="Kop6">
+  <w:style w:type="paragraph" w:styleId="Heading6">
     <w:name w:val="heading 6"/>
-    <w:basedOn w:val="Standaard"/>
-    <w:next w:val="Standaard"/>
-    <w:link w:val="Kop6Char"/>
+    <w:basedOn w:val="Normal"/>
+    <w:next w:val="Normal"/>
+    <w:link w:val="Heading6Char"/>
     <w:uiPriority w:val="9"/>
     <w:semiHidden/>
     <w:unhideWhenUsed/>
@@ -5834,11 +6457,11 @@
       <w:color w:val="1F4D78" w:themeColor="accent1" w:themeShade="7F"/>
     </w:rPr>
   </w:style>
-  <w:style w:type="paragraph" w:styleId="Kop7">
+  <w:style w:type="paragraph" w:styleId="Heading7">
     <w:name w:val="heading 7"/>
-    <w:basedOn w:val="Standaard"/>
-    <w:next w:val="Standaard"/>
-    <w:link w:val="Kop7Char"/>
+    <w:basedOn w:val="Normal"/>
+    <w:next w:val="Normal"/>
+    <w:link w:val="Heading7Char"/>
     <w:uiPriority w:val="9"/>
     <w:semiHidden/>
     <w:unhideWhenUsed/>
@@ -5857,11 +6480,11 @@
       <w:color w:val="1F4D78" w:themeColor="accent1" w:themeShade="7F"/>
     </w:rPr>
   </w:style>
-  <w:style w:type="paragraph" w:styleId="Kop8">
+  <w:style w:type="paragraph" w:styleId="Heading8">
     <w:name w:val="heading 8"/>
-    <w:basedOn w:val="Standaard"/>
-    <w:next w:val="Standaard"/>
-    <w:link w:val="Kop8Char"/>
+    <w:basedOn w:val="Normal"/>
+    <w:next w:val="Normal"/>
+    <w:link w:val="Heading8Char"/>
     <w:uiPriority w:val="9"/>
     <w:semiHidden/>
     <w:unhideWhenUsed/>
@@ -5880,11 +6503,11 @@
       <w:szCs w:val="21"/>
     </w:rPr>
   </w:style>
-  <w:style w:type="paragraph" w:styleId="Kop9">
+  <w:style w:type="paragraph" w:styleId="Heading9">
     <w:name w:val="heading 9"/>
-    <w:basedOn w:val="Standaard"/>
-    <w:next w:val="Standaard"/>
-    <w:link w:val="Kop9Char"/>
+    <w:basedOn w:val="Normal"/>
+    <w:next w:val="Normal"/>
+    <w:link w:val="Heading9Char"/>
     <w:uiPriority w:val="9"/>
     <w:semiHidden/>
     <w:unhideWhenUsed/>
@@ -5905,12 +6528,13 @@
       <w:szCs w:val="21"/>
     </w:rPr>
   </w:style>
-  <w:style w:type="character" w:default="1" w:styleId="Standaardalinea-lettertype">
+  <w:style w:type="character" w:default="1" w:styleId="DefaultParagraphFont">
     <w:name w:val="Default Paragraph Font"/>
     <w:uiPriority w:val="1"/>
+    <w:semiHidden/>
     <w:unhideWhenUsed/>
   </w:style>
-  <w:style w:type="table" w:default="1" w:styleId="Standaardtabel">
+  <w:style w:type="table" w:default="1" w:styleId="TableNormal">
     <w:name w:val="Normal Table"/>
     <w:uiPriority w:val="99"/>
     <w:semiHidden/>
@@ -5925,7 +6549,7 @@
       </w:tblCellMar>
     </w:tblPr>
   </w:style>
-  <w:style w:type="numbering" w:default="1" w:styleId="Geenlijst">
+  <w:style w:type="numbering" w:default="1" w:styleId="NoList">
     <w:name w:val="No List"/>
     <w:uiPriority w:val="99"/>
     <w:semiHidden/>
@@ -5933,7 +6557,7 @@
   </w:style>
   <w:style w:type="character" w:styleId="Hyperlink">
     <w:name w:val="Hyperlink"/>
-    <w:basedOn w:val="Standaardalinea-lettertype"/>
+    <w:basedOn w:val="DefaultParagraphFont"/>
     <w:uiPriority w:val="99"/>
     <w:unhideWhenUsed/>
     <w:rsid w:val="00733A2F"/>
@@ -5944,10 +6568,10 @@
       <w:u w:val="single"/>
     </w:rPr>
   </w:style>
-  <w:style w:type="paragraph" w:styleId="Lijstalinea">
+  <w:style w:type="paragraph" w:styleId="ListParagraph">
     <w:name w:val="List Paragraph"/>
     <w:aliases w:val="LEKK 5 Lijst"/>
-    <w:basedOn w:val="Standaard"/>
+    <w:basedOn w:val="Normal"/>
     <w:autoRedefine/>
     <w:uiPriority w:val="34"/>
     <w:qFormat/>
@@ -5962,10 +6586,10 @@
       <w:lang w:eastAsia="nl-NL"/>
     </w:rPr>
   </w:style>
-  <w:style w:type="paragraph" w:styleId="Koptekst">
+  <w:style w:type="paragraph" w:styleId="Header">
     <w:name w:val="header"/>
-    <w:basedOn w:val="Standaard"/>
-    <w:link w:val="KoptekstChar"/>
+    <w:basedOn w:val="Normal"/>
+    <w:link w:val="HeaderChar"/>
     <w:uiPriority w:val="99"/>
     <w:unhideWhenUsed/>
     <w:rsid w:val="00A30DA5"/>
@@ -5977,17 +6601,17 @@
       <w:spacing w:after="0" w:line="240" w:lineRule="auto"/>
     </w:pPr>
   </w:style>
-  <w:style w:type="character" w:customStyle="1" w:styleId="KoptekstChar">
-    <w:name w:val="Koptekst Char"/>
-    <w:basedOn w:val="Standaardalinea-lettertype"/>
-    <w:link w:val="Koptekst"/>
+  <w:style w:type="character" w:customStyle="1" w:styleId="HeaderChar">
+    <w:name w:val="Header Char"/>
+    <w:basedOn w:val="DefaultParagraphFont"/>
+    <w:link w:val="Header"/>
     <w:uiPriority w:val="99"/>
     <w:rsid w:val="00A30DA5"/>
   </w:style>
-  <w:style w:type="paragraph" w:styleId="Voettekst">
+  <w:style w:type="paragraph" w:styleId="Footer">
     <w:name w:val="footer"/>
-    <w:basedOn w:val="Standaard"/>
-    <w:link w:val="VoettekstChar"/>
+    <w:basedOn w:val="Normal"/>
+    <w:link w:val="FooterChar"/>
     <w:uiPriority w:val="99"/>
     <w:unhideWhenUsed/>
     <w:rsid w:val="00A30DA5"/>
@@ -5999,17 +6623,17 @@
       <w:spacing w:after="0" w:line="240" w:lineRule="auto"/>
     </w:pPr>
   </w:style>
-  <w:style w:type="character" w:customStyle="1" w:styleId="VoettekstChar">
-    <w:name w:val="Voettekst Char"/>
-    <w:basedOn w:val="Standaardalinea-lettertype"/>
-    <w:link w:val="Voettekst"/>
+  <w:style w:type="character" w:customStyle="1" w:styleId="FooterChar">
+    <w:name w:val="Footer Char"/>
+    <w:basedOn w:val="DefaultParagraphFont"/>
+    <w:link w:val="Footer"/>
     <w:uiPriority w:val="99"/>
     <w:rsid w:val="00A30DA5"/>
   </w:style>
-  <w:style w:type="paragraph" w:styleId="Ballontekst">
+  <w:style w:type="paragraph" w:styleId="BalloonText">
     <w:name w:val="Balloon Text"/>
-    <w:basedOn w:val="Standaard"/>
-    <w:link w:val="BallontekstChar"/>
+    <w:basedOn w:val="Normal"/>
+    <w:link w:val="BalloonTextChar"/>
     <w:uiPriority w:val="99"/>
     <w:semiHidden/>
     <w:unhideWhenUsed/>
@@ -6023,10 +6647,10 @@
       <w:szCs w:val="18"/>
     </w:rPr>
   </w:style>
-  <w:style w:type="character" w:customStyle="1" w:styleId="BallontekstChar">
-    <w:name w:val="Ballontekst Char"/>
-    <w:basedOn w:val="Standaardalinea-lettertype"/>
-    <w:link w:val="Ballontekst"/>
+  <w:style w:type="character" w:customStyle="1" w:styleId="BalloonTextChar">
+    <w:name w:val="Balloon Text Char"/>
+    <w:basedOn w:val="DefaultParagraphFont"/>
+    <w:link w:val="BalloonText"/>
     <w:uiPriority w:val="99"/>
     <w:semiHidden/>
     <w:rsid w:val="00157D4E"/>
@@ -6036,11 +6660,11 @@
       <w:szCs w:val="18"/>
     </w:rPr>
   </w:style>
-  <w:style w:type="character" w:customStyle="1" w:styleId="Kop1Char">
-    <w:name w:val="Kop 1 Char"/>
+  <w:style w:type="character" w:customStyle="1" w:styleId="Heading1Char">
+    <w:name w:val="Heading 1 Char"/>
     <w:aliases w:val="LEKK 1 Char"/>
-    <w:basedOn w:val="Standaardalinea-lettertype"/>
-    <w:link w:val="Kop1"/>
+    <w:basedOn w:val="DefaultParagraphFont"/>
+    <w:link w:val="Heading1"/>
     <w:uiPriority w:val="9"/>
     <w:rsid w:val="007B6C5F"/>
     <w:rPr>
@@ -6053,10 +6677,10 @@
       <w:lang w:val="en-US" w:eastAsia="nl-NL"/>
     </w:rPr>
   </w:style>
-  <w:style w:type="paragraph" w:styleId="Kopvaninhoudsopgave">
+  <w:style w:type="paragraph" w:styleId="TOCHeading">
     <w:name w:val="TOC Heading"/>
-    <w:basedOn w:val="Kop1"/>
-    <w:next w:val="Standaard"/>
+    <w:basedOn w:val="Heading1"/>
+    <w:next w:val="Normal"/>
     <w:uiPriority w:val="39"/>
     <w:unhideWhenUsed/>
     <w:qFormat/>
@@ -6065,11 +6689,11 @@
       <w:outlineLvl w:val="9"/>
     </w:pPr>
   </w:style>
-  <w:style w:type="character" w:customStyle="1" w:styleId="Kop2Char">
-    <w:name w:val="Kop 2 Char"/>
+  <w:style w:type="character" w:customStyle="1" w:styleId="Heading2Char">
+    <w:name w:val="Heading 2 Char"/>
     <w:aliases w:val="LEKK 2 Char"/>
-    <w:basedOn w:val="Standaardalinea-lettertype"/>
-    <w:link w:val="Kop2"/>
+    <w:basedOn w:val="DefaultParagraphFont"/>
+    <w:link w:val="Heading2"/>
     <w:uiPriority w:val="9"/>
     <w:rsid w:val="003014DA"/>
     <w:rPr>
@@ -6082,11 +6706,11 @@
       <w:lang w:eastAsia="nl-NL"/>
     </w:rPr>
   </w:style>
-  <w:style w:type="character" w:customStyle="1" w:styleId="Kop3Char">
-    <w:name w:val="Kop 3 Char"/>
+  <w:style w:type="character" w:customStyle="1" w:styleId="Heading3Char">
+    <w:name w:val="Heading 3 Char"/>
     <w:aliases w:val="LEKK 3 Char"/>
-    <w:basedOn w:val="Standaardalinea-lettertype"/>
-    <w:link w:val="Kop3"/>
+    <w:basedOn w:val="DefaultParagraphFont"/>
+    <w:link w:val="Heading3"/>
     <w:uiPriority w:val="9"/>
     <w:rsid w:val="00F8387A"/>
     <w:rPr>
@@ -6099,10 +6723,10 @@
       <w:lang w:eastAsia="nl-NL"/>
     </w:rPr>
   </w:style>
-  <w:style w:type="paragraph" w:styleId="Inhopg1">
+  <w:style w:type="paragraph" w:styleId="TOC1">
     <w:name w:val="toc 1"/>
-    <w:basedOn w:val="Standaard"/>
-    <w:next w:val="Standaard"/>
+    <w:basedOn w:val="Normal"/>
+    <w:next w:val="Normal"/>
     <w:autoRedefine/>
     <w:uiPriority w:val="39"/>
     <w:unhideWhenUsed/>
@@ -6115,10 +6739,10 @@
       <w:spacing w:after="100"/>
     </w:pPr>
   </w:style>
-  <w:style w:type="paragraph" w:styleId="Inhopg2">
+  <w:style w:type="paragraph" w:styleId="TOC2">
     <w:name w:val="toc 2"/>
-    <w:basedOn w:val="Standaard"/>
-    <w:next w:val="Standaard"/>
+    <w:basedOn w:val="Normal"/>
+    <w:next w:val="Normal"/>
     <w:autoRedefine/>
     <w:uiPriority w:val="39"/>
     <w:unhideWhenUsed/>
@@ -6128,10 +6752,10 @@
       <w:ind w:left="220"/>
     </w:pPr>
   </w:style>
-  <w:style w:type="paragraph" w:styleId="Inhopg3">
+  <w:style w:type="paragraph" w:styleId="TOC3">
     <w:name w:val="toc 3"/>
-    <w:basedOn w:val="Standaard"/>
-    <w:next w:val="Standaard"/>
+    <w:basedOn w:val="Normal"/>
+    <w:next w:val="Normal"/>
     <w:autoRedefine/>
     <w:uiPriority w:val="39"/>
     <w:unhideWhenUsed/>
@@ -6141,7 +6765,7 @@
       <w:ind w:left="440"/>
     </w:pPr>
   </w:style>
-  <w:style w:type="paragraph" w:styleId="Geenafstand">
+  <w:style w:type="paragraph" w:styleId="NoSpacing">
     <w:name w:val="No Spacing"/>
     <w:uiPriority w:val="1"/>
     <w:rsid w:val="004D6AC5"/>
@@ -6149,9 +6773,9 @@
       <w:spacing w:after="0" w:line="240" w:lineRule="auto"/>
     </w:pPr>
   </w:style>
-  <w:style w:type="table" w:styleId="Tabelraster">
+  <w:style w:type="table" w:styleId="TableGrid">
     <w:name w:val="Table Grid"/>
-    <w:basedOn w:val="Standaardtabel"/>
+    <w:basedOn w:val="TableNormal"/>
     <w:uiPriority w:val="59"/>
     <w:rsid w:val="004D6AC5"/>
     <w:pPr>
@@ -6175,9 +6799,9 @@
       </w:tblBorders>
     </w:tblPr>
   </w:style>
-  <w:style w:type="paragraph" w:styleId="Normaalweb">
+  <w:style w:type="paragraph" w:styleId="NormalWeb">
     <w:name w:val="Normal (Web)"/>
-    <w:basedOn w:val="Standaard"/>
+    <w:basedOn w:val="Normal"/>
     <w:uiPriority w:val="99"/>
     <w:semiHidden/>
     <w:unhideWhenUsed/>
@@ -6192,11 +6816,11 @@
       <w:lang w:eastAsia="nl-NL"/>
     </w:rPr>
   </w:style>
-  <w:style w:type="paragraph" w:styleId="Bijschrift">
+  <w:style w:type="paragraph" w:styleId="Caption">
     <w:name w:val="caption"/>
     <w:aliases w:val="LEKK 6 Bijschrift"/>
-    <w:basedOn w:val="Standaard"/>
-    <w:next w:val="Standaard"/>
+    <w:basedOn w:val="Normal"/>
+    <w:next w:val="Normal"/>
     <w:autoRedefine/>
     <w:uiPriority w:val="35"/>
     <w:unhideWhenUsed/>
@@ -6212,11 +6836,11 @@
       <w:szCs w:val="18"/>
     </w:rPr>
   </w:style>
-  <w:style w:type="paragraph" w:styleId="Citaat">
+  <w:style w:type="paragraph" w:styleId="Quote">
     <w:name w:val="Quote"/>
-    <w:basedOn w:val="Standaard"/>
-    <w:next w:val="Standaard"/>
-    <w:link w:val="CitaatChar"/>
+    <w:basedOn w:val="Normal"/>
+    <w:next w:val="Normal"/>
+    <w:link w:val="QuoteChar"/>
     <w:uiPriority w:val="29"/>
     <w:rsid w:val="004640EE"/>
     <w:pPr>
@@ -6230,10 +6854,10 @@
       <w:color w:val="404040" w:themeColor="text1" w:themeTint="BF"/>
     </w:rPr>
   </w:style>
-  <w:style w:type="character" w:customStyle="1" w:styleId="CitaatChar">
-    <w:name w:val="Citaat Char"/>
-    <w:basedOn w:val="Standaardalinea-lettertype"/>
-    <w:link w:val="Citaat"/>
+  <w:style w:type="character" w:customStyle="1" w:styleId="QuoteChar">
+    <w:name w:val="Quote Char"/>
+    <w:basedOn w:val="DefaultParagraphFont"/>
+    <w:link w:val="Quote"/>
     <w:uiPriority w:val="29"/>
     <w:rsid w:val="004640EE"/>
     <w:rPr>
@@ -6244,16 +6868,16 @@
   </w:style>
   <w:style w:type="paragraph" w:customStyle="1" w:styleId="STIJL">
     <w:name w:val="STIJL"/>
-    <w:basedOn w:val="Kop1"/>
-    <w:next w:val="Standaard"/>
+    <w:basedOn w:val="Heading1"/>
+    <w:next w:val="Normal"/>
     <w:link w:val="STIJLChar"/>
     <w:rsid w:val="005A7937"/>
   </w:style>
-  <w:style w:type="character" w:customStyle="1" w:styleId="Kop4Char">
-    <w:name w:val="Kop 4 Char"/>
+  <w:style w:type="character" w:customStyle="1" w:styleId="Heading4Char">
+    <w:name w:val="Heading 4 Char"/>
     <w:aliases w:val="LEKK 4 Char"/>
-    <w:basedOn w:val="Standaardalinea-lettertype"/>
-    <w:link w:val="Kop4"/>
+    <w:basedOn w:val="DefaultParagraphFont"/>
+    <w:link w:val="Heading4"/>
     <w:uiPriority w:val="9"/>
     <w:rsid w:val="00D057A0"/>
     <w:rPr>
@@ -6268,7 +6892,7 @@
   </w:style>
   <w:style w:type="character" w:customStyle="1" w:styleId="STIJLChar">
     <w:name w:val="STIJL Char"/>
-    <w:basedOn w:val="Kop1Char"/>
+    <w:basedOn w:val="Heading1Char"/>
     <w:link w:val="STIJL"/>
     <w:rsid w:val="005A7937"/>
     <w:rPr>
@@ -6283,7 +6907,7 @@
   </w:style>
   <w:style w:type="paragraph" w:customStyle="1" w:styleId="Basisalinea">
     <w:name w:val="[Basisalinea]"/>
-    <w:basedOn w:val="Standaard"/>
+    <w:basedOn w:val="Normal"/>
     <w:uiPriority w:val="99"/>
     <w:rsid w:val="008716F1"/>
     <w:pPr>
@@ -6303,9 +6927,9 @@
       <w:lang w:val="en-US" w:eastAsia="nl-NL"/>
     </w:rPr>
   </w:style>
-  <w:style w:type="character" w:styleId="Onopgelostemelding">
+  <w:style w:type="character" w:styleId="UnresolvedMention">
     <w:name w:val="Unresolved Mention"/>
-    <w:basedOn w:val="Standaardalinea-lettertype"/>
+    <w:basedOn w:val="DefaultParagraphFont"/>
     <w:uiPriority w:val="99"/>
     <w:semiHidden/>
     <w:unhideWhenUsed/>
@@ -6317,7 +6941,7 @@
   </w:style>
   <w:style w:type="paragraph" w:customStyle="1" w:styleId="TF-Algemeen">
     <w:name w:val="TF-Algemeen"/>
-    <w:basedOn w:val="Standaard"/>
+    <w:basedOn w:val="Normal"/>
     <w:link w:val="TF-AlgemeenChar"/>
     <w:qFormat/>
     <w:rsid w:val="00F05689"/>
@@ -6362,7 +6986,7 @@
   </w:style>
   <w:style w:type="character" w:customStyle="1" w:styleId="TF-AlgemeenChar">
     <w:name w:val="TF-Algemeen Char"/>
-    <w:basedOn w:val="Standaardalinea-lettertype"/>
+    <w:basedOn w:val="DefaultParagraphFont"/>
     <w:link w:val="TF-Algemeen"/>
     <w:rsid w:val="00F05689"/>
     <w:rPr>
@@ -6390,10 +7014,10 @@
       <w:lang w:val="en-US" w:eastAsia="nl-NL"/>
     </w:rPr>
   </w:style>
-  <w:style w:type="character" w:customStyle="1" w:styleId="Kop5Char">
-    <w:name w:val="Kop 5 Char"/>
-    <w:basedOn w:val="Standaardalinea-lettertype"/>
-    <w:link w:val="Kop5"/>
+  <w:style w:type="character" w:customStyle="1" w:styleId="Heading5Char">
+    <w:name w:val="Heading 5 Char"/>
+    <w:basedOn w:val="DefaultParagraphFont"/>
+    <w:link w:val="Heading5"/>
     <w:uiPriority w:val="9"/>
     <w:semiHidden/>
     <w:rsid w:val="00624E06"/>
@@ -6402,10 +7026,10 @@
       <w:color w:val="2E74B5" w:themeColor="accent1" w:themeShade="BF"/>
     </w:rPr>
   </w:style>
-  <w:style w:type="character" w:customStyle="1" w:styleId="Kop6Char">
-    <w:name w:val="Kop 6 Char"/>
-    <w:basedOn w:val="Standaardalinea-lettertype"/>
-    <w:link w:val="Kop6"/>
+  <w:style w:type="character" w:customStyle="1" w:styleId="Heading6Char">
+    <w:name w:val="Heading 6 Char"/>
+    <w:basedOn w:val="DefaultParagraphFont"/>
+    <w:link w:val="Heading6"/>
     <w:uiPriority w:val="9"/>
     <w:semiHidden/>
     <w:rsid w:val="00624E06"/>
@@ -6414,10 +7038,10 @@
       <w:color w:val="1F4D78" w:themeColor="accent1" w:themeShade="7F"/>
     </w:rPr>
   </w:style>
-  <w:style w:type="character" w:customStyle="1" w:styleId="Kop7Char">
-    <w:name w:val="Kop 7 Char"/>
-    <w:basedOn w:val="Standaardalinea-lettertype"/>
-    <w:link w:val="Kop7"/>
+  <w:style w:type="character" w:customStyle="1" w:styleId="Heading7Char">
+    <w:name w:val="Heading 7 Char"/>
+    <w:basedOn w:val="DefaultParagraphFont"/>
+    <w:link w:val="Heading7"/>
     <w:uiPriority w:val="9"/>
     <w:semiHidden/>
     <w:rsid w:val="00624E06"/>
@@ -6428,10 +7052,10 @@
       <w:color w:val="1F4D78" w:themeColor="accent1" w:themeShade="7F"/>
     </w:rPr>
   </w:style>
-  <w:style w:type="character" w:customStyle="1" w:styleId="Kop8Char">
-    <w:name w:val="Kop 8 Char"/>
-    <w:basedOn w:val="Standaardalinea-lettertype"/>
-    <w:link w:val="Kop8"/>
+  <w:style w:type="character" w:customStyle="1" w:styleId="Heading8Char">
+    <w:name w:val="Heading 8 Char"/>
+    <w:basedOn w:val="DefaultParagraphFont"/>
+    <w:link w:val="Heading8"/>
     <w:uiPriority w:val="9"/>
     <w:semiHidden/>
     <w:rsid w:val="00624E06"/>
@@ -6442,10 +7066,10 @@
       <w:szCs w:val="21"/>
     </w:rPr>
   </w:style>
-  <w:style w:type="character" w:customStyle="1" w:styleId="Kop9Char">
-    <w:name w:val="Kop 9 Char"/>
-    <w:basedOn w:val="Standaardalinea-lettertype"/>
-    <w:link w:val="Kop9"/>
+  <w:style w:type="character" w:customStyle="1" w:styleId="Heading9Char">
+    <w:name w:val="Heading 9 Char"/>
+    <w:basedOn w:val="DefaultParagraphFont"/>
+    <w:link w:val="Heading9"/>
     <w:uiPriority w:val="9"/>
     <w:semiHidden/>
     <w:rsid w:val="00624E06"/>
@@ -6458,10 +7082,10 @@
       <w:szCs w:val="21"/>
     </w:rPr>
   </w:style>
-  <w:style w:type="paragraph" w:styleId="Inhopg4">
+  <w:style w:type="paragraph" w:styleId="TOC4">
     <w:name w:val="toc 4"/>
-    <w:basedOn w:val="Standaard"/>
-    <w:next w:val="Standaard"/>
+    <w:basedOn w:val="Normal"/>
+    <w:next w:val="Normal"/>
     <w:autoRedefine/>
     <w:uiPriority w:val="39"/>
     <w:unhideWhenUsed/>
@@ -6473,7 +7097,7 @@
   </w:style>
   <w:style w:type="paragraph" w:customStyle="1" w:styleId="conversationturnwrapper9thbj227">
     <w:name w:val="_conversationturnwrapper_9thbj_227"/>
-    <w:basedOn w:val="Standaard"/>
+    <w:basedOn w:val="Normal"/>
     <w:rsid w:val="00280592"/>
     <w:pPr>
       <w:spacing w:before="100" w:beforeAutospacing="1" w:after="100" w:afterAutospacing="1" w:line="240" w:lineRule="auto"/>
@@ -6488,14 +7112,14 @@
   </w:style>
   <w:style w:type="character" w:customStyle="1" w:styleId="overflow-hidden">
     <w:name w:val="overflow-hidden"/>
-    <w:basedOn w:val="Standaardalinea-lettertype"/>
+    <w:basedOn w:val="DefaultParagraphFont"/>
     <w:rsid w:val="00280592"/>
   </w:style>
-  <w:style w:type="paragraph" w:styleId="Bovenkantformulier">
+  <w:style w:type="paragraph" w:styleId="z-TopofForm">
     <w:name w:val="HTML Top of Form"/>
-    <w:basedOn w:val="Standaard"/>
-    <w:next w:val="Standaard"/>
-    <w:link w:val="BovenkantformulierChar"/>
+    <w:basedOn w:val="Normal"/>
+    <w:next w:val="Normal"/>
+    <w:link w:val="z-TopofFormChar"/>
     <w:hidden/>
     <w:uiPriority w:val="99"/>
     <w:semiHidden/>
@@ -6517,10 +7141,10 @@
       <w:lang w:eastAsia="nl-NL"/>
     </w:rPr>
   </w:style>
-  <w:style w:type="character" w:customStyle="1" w:styleId="BovenkantformulierChar">
-    <w:name w:val="Bovenkant formulier Char"/>
-    <w:basedOn w:val="Standaardalinea-lettertype"/>
-    <w:link w:val="Bovenkantformulier"/>
+  <w:style w:type="character" w:customStyle="1" w:styleId="z-TopofFormChar">
+    <w:name w:val="z-Top of Form Char"/>
+    <w:basedOn w:val="DefaultParagraphFont"/>
+    <w:link w:val="z-TopofForm"/>
     <w:uiPriority w:val="99"/>
     <w:semiHidden/>
     <w:rsid w:val="00280592"/>
@@ -6532,11 +7156,11 @@
       <w:lang w:eastAsia="nl-NL"/>
     </w:rPr>
   </w:style>
-  <w:style w:type="paragraph" w:styleId="Onderkantformulier">
+  <w:style w:type="paragraph" w:styleId="z-BottomofForm">
     <w:name w:val="HTML Bottom of Form"/>
-    <w:basedOn w:val="Standaard"/>
-    <w:next w:val="Standaard"/>
-    <w:link w:val="OnderkantformulierChar"/>
+    <w:basedOn w:val="Normal"/>
+    <w:next w:val="Normal"/>
+    <w:link w:val="z-BottomofFormChar"/>
     <w:hidden/>
     <w:uiPriority w:val="99"/>
     <w:semiHidden/>
@@ -6558,10 +7182,10 @@
       <w:lang w:eastAsia="nl-NL"/>
     </w:rPr>
   </w:style>
-  <w:style w:type="character" w:customStyle="1" w:styleId="OnderkantformulierChar">
-    <w:name w:val="Onderkant formulier Char"/>
-    <w:basedOn w:val="Standaardalinea-lettertype"/>
-    <w:link w:val="Onderkantformulier"/>
+  <w:style w:type="character" w:customStyle="1" w:styleId="z-BottomofFormChar">
+    <w:name w:val="z-Bottom of Form Char"/>
+    <w:basedOn w:val="DefaultParagraphFont"/>
+    <w:link w:val="z-BottomofForm"/>
     <w:uiPriority w:val="99"/>
     <w:semiHidden/>
     <w:rsid w:val="00280592"/>
@@ -6842,12 +7466,14 @@
 </file>
 
 <file path=customXml/item2.xml><?xml version="1.0" encoding="utf-8"?>
-<?mso-contentType ?>
-<FormTemplates xmlns="http://schemas.microsoft.com/sharepoint/v3/contenttype/forms">
-  <Display>DocumentLibraryForm</Display>
-  <Edit>DocumentLibraryForm</Edit>
-  <New>DocumentLibraryForm</New>
-</FormTemplates>
+<p:properties xmlns:p="http://schemas.microsoft.com/office/2006/metadata/properties" xmlns:xsi="http://www.w3.org/2001/XMLSchema-instance" xmlns:pc="http://schemas.microsoft.com/office/infopath/2007/PartnerControls">
+  <documentManagement>
+    <lcf76f155ced4ddcb4097134ff3c332f xmlns="ecd6e1e9-ac8d-43e0-b591-2645e6e1ef06">
+      <Terms xmlns="http://schemas.microsoft.com/office/infopath/2007/PartnerControls"/>
+    </lcf76f155ced4ddcb4097134ff3c332f>
+    <TaxCatchAll xmlns="8fc8e79b-e696-40e3-82b1-239ab1b6385b" xsi:nil="true"/>
+  </documentManagement>
+</p:properties>
 </file>
 
 <file path=customXml/item3.xml><?xml version="1.0" encoding="utf-8"?>
@@ -7058,14 +7684,12 @@
 </file>
 
 <file path=customXml/item4.xml><?xml version="1.0" encoding="utf-8"?>
-<p:properties xmlns:p="http://schemas.microsoft.com/office/2006/metadata/properties" xmlns:xsi="http://www.w3.org/2001/XMLSchema-instance" xmlns:pc="http://schemas.microsoft.com/office/infopath/2007/PartnerControls">
-  <documentManagement>
-    <lcf76f155ced4ddcb4097134ff3c332f xmlns="ecd6e1e9-ac8d-43e0-b591-2645e6e1ef06">
-      <Terms xmlns="http://schemas.microsoft.com/office/infopath/2007/PartnerControls"/>
-    </lcf76f155ced4ddcb4097134ff3c332f>
-    <TaxCatchAll xmlns="8fc8e79b-e696-40e3-82b1-239ab1b6385b" xsi:nil="true"/>
-  </documentManagement>
-</p:properties>
+<?mso-contentType ?>
+<FormTemplates xmlns="http://schemas.microsoft.com/sharepoint/v3/contenttype/forms">
+  <Display>DocumentLibraryForm</Display>
+  <Edit>DocumentLibraryForm</Edit>
+  <New>DocumentLibraryForm</New>
+</FormTemplates>
 </file>
 
 <file path=customXml/itemProps1.xml><?xml version="1.0" encoding="utf-8"?>
@@ -7077,9 +7701,12 @@
 </file>
 
 <file path=customXml/itemProps2.xml><?xml version="1.0" encoding="utf-8"?>
-<ds:datastoreItem xmlns:ds="http://schemas.openxmlformats.org/officeDocument/2006/customXml" ds:itemID="{AFA01445-9AA3-44DE-8AA3-72924337F849}">
+<ds:datastoreItem xmlns:ds="http://schemas.openxmlformats.org/officeDocument/2006/customXml" ds:itemID="{D57D9AB7-1D3D-4E7F-8A89-1AB488838509}">
   <ds:schemaRefs>
-    <ds:schemaRef ds:uri="http://schemas.microsoft.com/sharepoint/v3/contenttype/forms"/>
+    <ds:schemaRef ds:uri="http://schemas.microsoft.com/office/2006/metadata/properties"/>
+    <ds:schemaRef ds:uri="http://schemas.microsoft.com/office/infopath/2007/PartnerControls"/>
+    <ds:schemaRef ds:uri="ecd6e1e9-ac8d-43e0-b591-2645e6e1ef06"/>
+    <ds:schemaRef ds:uri="8fc8e79b-e696-40e3-82b1-239ab1b6385b"/>
   </ds:schemaRefs>
 </ds:datastoreItem>
 </file>
@@ -7104,12 +7731,9 @@
 </file>
 
 <file path=customXml/itemProps4.xml><?xml version="1.0" encoding="utf-8"?>
-<ds:datastoreItem xmlns:ds="http://schemas.openxmlformats.org/officeDocument/2006/customXml" ds:itemID="{D57D9AB7-1D3D-4E7F-8A89-1AB488838509}">
+<ds:datastoreItem xmlns:ds="http://schemas.openxmlformats.org/officeDocument/2006/customXml" ds:itemID="{AFA01445-9AA3-44DE-8AA3-72924337F849}">
   <ds:schemaRefs>
-    <ds:schemaRef ds:uri="http://schemas.microsoft.com/office/2006/metadata/properties"/>
-    <ds:schemaRef ds:uri="http://schemas.microsoft.com/office/infopath/2007/PartnerControls"/>
-    <ds:schemaRef ds:uri="ecd6e1e9-ac8d-43e0-b591-2645e6e1ef06"/>
-    <ds:schemaRef ds:uri="8fc8e79b-e696-40e3-82b1-239ab1b6385b"/>
+    <ds:schemaRef ds:uri="http://schemas.microsoft.com/sharepoint/v3/contenttype/forms"/>
   </ds:schemaRefs>
 </ds:datastoreItem>
 </file>
</xml_diff>

<commit_message>
SET-18 Fix report export template
</commit_message>
<xml_diff>
--- a/templates/thermofly_paneel_tagged.docx
+++ b/templates/thermofly_paneel_tagged.docx
@@ -27,15 +27,1226 @@
         <w:rPr>
           <w:lang w:val="nl-NL"/>
         </w:rPr>
-        <w:t xml:space="preserve">Inspectieblad </w:t>
-      </w:r>
-      <w:r>
-        <w:rPr>
-          <w:lang w:val="nl-NL"/>
-        </w:rPr>
-        <w:t>paneel</w:t>
+        <w:t>Inspectieblad paneel</w:t>
       </w:r>
     </w:p>
+    <w:tbl>
+      <w:tblPr>
+        <w:tblW w:w="9922" w:type="dxa"/>
+        <w:tblBorders>
+          <w:top w:val="none" w:sz="0" w:space="0" w:color="auto"/>
+          <w:left w:val="none" w:sz="0" w:space="0" w:color="auto"/>
+          <w:bottom w:val="none" w:sz="0" w:space="0" w:color="auto"/>
+          <w:right w:val="none" w:sz="0" w:space="0" w:color="auto"/>
+          <w:insideH w:val="none" w:sz="0" w:space="0" w:color="auto"/>
+          <w:insideV w:val="none" w:sz="0" w:space="0" w:color="auto"/>
+        </w:tblBorders>
+      </w:tblPr>
+      <w:tblGrid>
+        <w:gridCol w:w="2800"/>
+        <w:gridCol w:w="2161"/>
+        <w:gridCol w:w="2000"/>
+        <w:gridCol w:w="2961"/>
+      </w:tblGrid>
+      <w:tr>
+        <w:tc>
+          <w:tcPr>
+            <w:tcW w:w="4961" w:type="dxa"/>
+            <w:gridSpan w:val="2"/>
+          </w:tcPr>
+          <w:p>
+            <w:pPr>
+              <w:spacing w:after="0"/>
+              <w:rPr>
+                <w:sz w:val="20"/>
+                <w:szCs w:val="20"/>
+              </w:rPr>
+            </w:pPr>
+            <w:r>
+              <w:rPr>
+                <w:b/>
+                <w:bCs/>
+                <w:sz w:val="20"/>
+                <w:szCs w:val="20"/>
+              </w:rPr>
+              <w:t>Projectgegevens</w:t>
+            </w:r>
+          </w:p>
+        </w:tc>
+        <w:tc>
+          <w:tcPr>
+            <w:tcW w:w="4961" w:type="dxa"/>
+            <w:gridSpan w:val="2"/>
+          </w:tcPr>
+          <w:p>
+            <w:pPr>
+              <w:spacing w:after="0"/>
+              <w:rPr>
+                <w:sz w:val="20"/>
+                <w:szCs w:val="20"/>
+              </w:rPr>
+            </w:pPr>
+            <w:r>
+              <w:rPr>
+                <w:b/>
+                <w:bCs/>
+                <w:sz w:val="20"/>
+                <w:szCs w:val="20"/>
+              </w:rPr>
+              <w:t>Paneelgegevens</w:t>
+            </w:r>
+          </w:p>
+        </w:tc>
+      </w:tr>
+      <w:tr>
+        <w:tc>
+          <w:tcPr>
+            <w:tcW w:w="2800" w:type="dxa"/>
+          </w:tcPr>
+          <w:p>
+            <w:pPr>
+              <w:spacing w:after="0"/>
+              <w:rPr>
+                <w:sz w:val="20"/>
+                <w:szCs w:val="20"/>
+              </w:rPr>
+            </w:pPr>
+            <w:r>
+              <w:rPr>
+                <w:sz w:val="20"/>
+                <w:szCs w:val="20"/>
+              </w:rPr>
+              <w:t>Projectnummer</w:t>
+            </w:r>
+          </w:p>
+        </w:tc>
+        <w:tc>
+          <w:tcPr>
+            <w:tcW w:w="2161" w:type="dxa"/>
+          </w:tcPr>
+          <w:p>
+            <w:pPr>
+              <w:spacing w:after="0"/>
+              <w:rPr>
+                <w:sz w:val="20"/>
+                <w:szCs w:val="20"/>
+              </w:rPr>
+            </w:pPr>
+            <w:r>
+              <w:rPr>
+                <w:b/>
+                <w:bCs/>
+                <w:sz w:val="20"/>
+                <w:szCs w:val="20"/>
+              </w:rPr>
+              <w:t>{{ panel.projectnummer }}</w:t>
+            </w:r>
+          </w:p>
+        </w:tc>
+        <w:tc>
+          <w:tcPr>
+            <w:tcW w:w="2000" w:type="dxa"/>
+          </w:tcPr>
+          <w:p>
+            <w:pPr>
+              <w:spacing w:after="0"/>
+              <w:rPr>
+                <w:sz w:val="20"/>
+                <w:szCs w:val="20"/>
+              </w:rPr>
+            </w:pPr>
+            <w:r>
+              <w:rPr>
+                <w:sz w:val="20"/>
+                <w:szCs w:val="20"/>
+              </w:rPr>
+              <w:t>String</w:t>
+            </w:r>
+          </w:p>
+        </w:tc>
+        <w:tc>
+          <w:tcPr>
+            <w:tcW w:w="2961" w:type="dxa"/>
+          </w:tcPr>
+          <w:p>
+            <w:pPr>
+              <w:spacing w:after="0"/>
+              <w:rPr>
+                <w:sz w:val="20"/>
+                <w:szCs w:val="20"/>
+              </w:rPr>
+            </w:pPr>
+            <w:r>
+              <w:rPr>
+                <w:sz w:val="20"/>
+                <w:szCs w:val="20"/>
+              </w:rPr>
+              <w:t>{{ panel.string }}</w:t>
+            </w:r>
+          </w:p>
+        </w:tc>
+      </w:tr>
+      <w:tr>
+        <w:tc>
+          <w:tcPr>
+            <w:tcW w:w="2800" w:type="dxa"/>
+          </w:tcPr>
+          <w:p>
+            <w:pPr>
+              <w:spacing w:after="0"/>
+              <w:rPr>
+                <w:sz w:val="20"/>
+                <w:szCs w:val="20"/>
+              </w:rPr>
+            </w:pPr>
+            <w:r>
+              <w:rPr>
+                <w:sz w:val="20"/>
+                <w:szCs w:val="20"/>
+              </w:rPr>
+              <w:t>Opdrachtgever</w:t>
+            </w:r>
+          </w:p>
+        </w:tc>
+        <w:tc>
+          <w:tcPr>
+            <w:tcW w:w="2161" w:type="dxa"/>
+          </w:tcPr>
+          <w:p>
+            <w:pPr>
+              <w:spacing w:after="0"/>
+              <w:rPr>
+                <w:sz w:val="20"/>
+                <w:szCs w:val="20"/>
+              </w:rPr>
+            </w:pPr>
+            <w:r>
+              <w:rPr>
+                <w:sz w:val="20"/>
+                <w:szCs w:val="20"/>
+              </w:rPr>
+              <w:t>{{ panel.opdrachtgever }}</w:t>
+            </w:r>
+          </w:p>
+        </w:tc>
+        <w:tc>
+          <w:tcPr>
+            <w:tcW w:w="2000" w:type="dxa"/>
+          </w:tcPr>
+          <w:p>
+            <w:pPr>
+              <w:spacing w:after="0"/>
+              <w:rPr>
+                <w:sz w:val="20"/>
+                <w:szCs w:val="20"/>
+              </w:rPr>
+            </w:pPr>
+            <w:r>
+              <w:rPr>
+                <w:sz w:val="20"/>
+                <w:szCs w:val="20"/>
+              </w:rPr>
+              <w:t>Paneelnummer</w:t>
+            </w:r>
+          </w:p>
+        </w:tc>
+        <w:tc>
+          <w:tcPr>
+            <w:tcW w:w="2961" w:type="dxa"/>
+          </w:tcPr>
+          <w:p>
+            <w:pPr>
+              <w:spacing w:after="0"/>
+              <w:rPr>
+                <w:sz w:val="20"/>
+                <w:szCs w:val="20"/>
+              </w:rPr>
+            </w:pPr>
+            <w:r>
+              <w:rPr>
+                <w:sz w:val="20"/>
+                <w:szCs w:val="20"/>
+              </w:rPr>
+              <w:t>{{ panel.paneelnummer }}</w:t>
+            </w:r>
+          </w:p>
+        </w:tc>
+      </w:tr>
+      <w:tr>
+        <w:tc>
+          <w:tcPr>
+            <w:tcW w:w="2800" w:type="dxa"/>
+          </w:tcPr>
+          <w:p>
+            <w:pPr>
+              <w:spacing w:after="0"/>
+              <w:rPr>
+                <w:sz w:val="20"/>
+                <w:szCs w:val="20"/>
+              </w:rPr>
+            </w:pPr>
+            <w:r>
+              <w:rPr>
+                <w:sz w:val="20"/>
+                <w:szCs w:val="20"/>
+              </w:rPr>
+              <w:t>Locatie</w:t>
+            </w:r>
+          </w:p>
+        </w:tc>
+        <w:tc>
+          <w:tcPr>
+            <w:tcW w:w="2161" w:type="dxa"/>
+          </w:tcPr>
+          <w:p>
+            <w:pPr>
+              <w:spacing w:after="0"/>
+              <w:rPr>
+                <w:sz w:val="20"/>
+                <w:szCs w:val="20"/>
+              </w:rPr>
+            </w:pPr>
+            <w:r>
+              <w:rPr>
+                <w:sz w:val="20"/>
+                <w:szCs w:val="20"/>
+              </w:rPr>
+              <w:t>{{ panel.locatie }}</w:t>
+            </w:r>
+          </w:p>
+        </w:tc>
+        <w:tc>
+          <w:tcPr>
+            <w:tcW w:w="2000" w:type="dxa"/>
+          </w:tcPr>
+          <w:p>
+            <w:pPr>
+              <w:spacing w:after="0"/>
+              <w:rPr>
+                <w:sz w:val="20"/>
+                <w:szCs w:val="20"/>
+              </w:rPr>
+            </w:pPr>
+            <w:r>
+              <w:rPr>
+                <w:sz w:val="20"/>
+                <w:szCs w:val="20"/>
+              </w:rPr>
+              <w:t>Type paneel</w:t>
+            </w:r>
+          </w:p>
+        </w:tc>
+        <w:tc>
+          <w:tcPr>
+            <w:tcW w:w="2961" w:type="dxa"/>
+          </w:tcPr>
+          <w:p>
+            <w:pPr>
+              <w:spacing w:after="0"/>
+              <w:rPr>
+                <w:sz w:val="20"/>
+                <w:szCs w:val="20"/>
+              </w:rPr>
+            </w:pPr>
+            <w:r>
+              <w:rPr>
+                <w:sz w:val="20"/>
+                <w:szCs w:val="20"/>
+              </w:rPr>
+              <w:t>{{ panel.type_paneel }}</w:t>
+            </w:r>
+          </w:p>
+        </w:tc>
+      </w:tr>
+      <w:tr>
+        <w:tc>
+          <w:tcPr>
+            <w:tcW w:w="2800" w:type="dxa"/>
+          </w:tcPr>
+          <w:p>
+            <w:pPr>
+              <w:spacing w:after="0"/>
+              <w:rPr>
+                <w:sz w:val="20"/>
+                <w:szCs w:val="20"/>
+              </w:rPr>
+            </w:pPr>
+            <w:r>
+              <w:rPr>
+                <w:sz w:val="20"/>
+                <w:szCs w:val="20"/>
+              </w:rPr>
+              <w:t>Datum inspectie</w:t>
+            </w:r>
+          </w:p>
+        </w:tc>
+        <w:tc>
+          <w:tcPr>
+            <w:tcW w:w="2161" w:type="dxa"/>
+          </w:tcPr>
+          <w:p>
+            <w:pPr>
+              <w:spacing w:after="0"/>
+              <w:rPr>
+                <w:sz w:val="20"/>
+                <w:szCs w:val="20"/>
+              </w:rPr>
+            </w:pPr>
+            <w:r>
+              <w:rPr>
+                <w:sz w:val="20"/>
+                <w:szCs w:val="20"/>
+              </w:rPr>
+              <w:t>{{ panel.datum_inspectie }}</w:t>
+            </w:r>
+          </w:p>
+        </w:tc>
+        <w:tc>
+          <w:tcPr>
+            <w:tcW w:w="2000" w:type="dxa"/>
+          </w:tcPr>
+          <w:p>
+            <w:pPr>
+              <w:spacing w:after="0"/>
+              <w:rPr>
+                <w:sz w:val="20"/>
+                <w:szCs w:val="20"/>
+              </w:rPr>
+            </w:pPr>
+            <w:r>
+              <w:rPr>
+                <w:sz w:val="20"/>
+                <w:szCs w:val="20"/>
+              </w:rPr>
+              <w:t>Oriëntatie</w:t>
+            </w:r>
+          </w:p>
+        </w:tc>
+        <w:tc>
+          <w:tcPr>
+            <w:tcW w:w="2961" w:type="dxa"/>
+          </w:tcPr>
+          <w:p>
+            <w:pPr>
+              <w:spacing w:after="0"/>
+              <w:rPr>
+                <w:sz w:val="20"/>
+                <w:szCs w:val="20"/>
+              </w:rPr>
+            </w:pPr>
+            <w:r>
+              <w:rPr>
+                <w:sz w:val="20"/>
+                <w:szCs w:val="20"/>
+              </w:rPr>
+              <w:t>{{ panel.orientatie }}</w:t>
+            </w:r>
+          </w:p>
+        </w:tc>
+      </w:tr>
+      <w:tr>
+        <w:tc>
+          <w:tcPr>
+            <w:tcW w:w="2800" w:type="dxa"/>
+          </w:tcPr>
+          <w:p>
+            <w:pPr>
+              <w:spacing w:after="0"/>
+              <w:rPr>
+                <w:sz w:val="20"/>
+                <w:szCs w:val="20"/>
+              </w:rPr>
+            </w:pPr>
+            <w:r>
+              <w:rPr>
+                <w:sz w:val="20"/>
+                <w:szCs w:val="20"/>
+              </w:rPr>
+              <w:t>Tijdstip inspectie</w:t>
+            </w:r>
+          </w:p>
+        </w:tc>
+        <w:tc>
+          <w:tcPr>
+            <w:tcW w:w="2161" w:type="dxa"/>
+          </w:tcPr>
+          <w:p>
+            <w:pPr>
+              <w:spacing w:after="0"/>
+              <w:rPr>
+                <w:sz w:val="20"/>
+                <w:szCs w:val="20"/>
+              </w:rPr>
+            </w:pPr>
+            <w:r>
+              <w:rPr>
+                <w:sz w:val="20"/>
+                <w:szCs w:val="20"/>
+              </w:rPr>
+              <w:t>{{ panel.tijdstip_inspectie }}</w:t>
+            </w:r>
+          </w:p>
+        </w:tc>
+        <w:tc>
+          <w:tcPr>
+            <w:tcW w:w="2000" w:type="dxa"/>
+          </w:tcPr>
+          <w:p>
+            <w:pPr>
+              <w:spacing w:after="0"/>
+              <w:rPr>
+                <w:sz w:val="20"/>
+                <w:szCs w:val="20"/>
+              </w:rPr>
+            </w:pPr>
+            <w:r>
+              <w:rPr>
+                <w:sz w:val="20"/>
+                <w:szCs w:val="20"/>
+              </w:rPr>
+              <w:t>Hellingshoek</w:t>
+            </w:r>
+          </w:p>
+        </w:tc>
+        <w:tc>
+          <w:tcPr>
+            <w:tcW w:w="2961" w:type="dxa"/>
+          </w:tcPr>
+          <w:p>
+            <w:pPr>
+              <w:spacing w:after="0"/>
+              <w:rPr>
+                <w:sz w:val="20"/>
+                <w:szCs w:val="20"/>
+              </w:rPr>
+            </w:pPr>
+            <w:r>
+              <w:rPr>
+                <w:sz w:val="20"/>
+                <w:szCs w:val="20"/>
+              </w:rPr>
+              <w:t>{{ panel.hellingshoek }}</w:t>
+            </w:r>
+          </w:p>
+        </w:tc>
+      </w:tr>
+      <w:tr>
+        <w:tc>
+          <w:tcPr>
+            <w:tcW w:w="2800" w:type="dxa"/>
+          </w:tcPr>
+          <w:p>
+            <w:pPr>
+              <w:spacing w:after="0"/>
+              <w:rPr>
+                <w:sz w:val="20"/>
+                <w:szCs w:val="20"/>
+              </w:rPr>
+            </w:pPr>
+            <w:r>
+              <w:rPr>
+                <w:sz w:val="20"/>
+                <w:szCs w:val="20"/>
+              </w:rPr>
+              <w:t>Inspecteur</w:t>
+            </w:r>
+          </w:p>
+        </w:tc>
+        <w:tc>
+          <w:tcPr>
+            <w:tcW w:w="2161" w:type="dxa"/>
+          </w:tcPr>
+          <w:p>
+            <w:pPr>
+              <w:spacing w:after="0"/>
+              <w:rPr>
+                <w:sz w:val="20"/>
+                <w:szCs w:val="20"/>
+              </w:rPr>
+            </w:pPr>
+            <w:r>
+              <w:rPr>
+                <w:sz w:val="20"/>
+                <w:szCs w:val="20"/>
+              </w:rPr>
+              <w:t>{{ panel.inspecteur }}</w:t>
+            </w:r>
+          </w:p>
+        </w:tc>
+        <w:tc>
+          <w:tcPr>
+            <w:tcW w:w="2000" w:type="dxa"/>
+          </w:tcPr>
+          <w:p>
+            <w:pPr>
+              <w:spacing w:after="0"/>
+              <w:rPr>
+                <w:sz w:val="20"/>
+                <w:szCs w:val="20"/>
+              </w:rPr>
+            </w:pPr>
+            <w:r>
+              <w:rPr>
+                <w:sz w:val="20"/>
+                <w:szCs w:val="20"/>
+              </w:rPr>
+              <w:t>Positie op dak</w:t>
+            </w:r>
+          </w:p>
+        </w:tc>
+        <w:tc>
+          <w:tcPr>
+            <w:tcW w:w="2961" w:type="dxa"/>
+          </w:tcPr>
+          <w:p>
+            <w:pPr>
+              <w:spacing w:after="0"/>
+              <w:rPr>
+                <w:sz w:val="20"/>
+                <w:szCs w:val="20"/>
+              </w:rPr>
+            </w:pPr>
+            <w:r>
+              <w:rPr>
+                <w:sz w:val="20"/>
+                <w:szCs w:val="20"/>
+              </w:rPr>
+              <w:t>{{ panel.positie_op_dak }}</w:t>
+            </w:r>
+          </w:p>
+        </w:tc>
+      </w:tr>
+      <w:tr>
+        <w:tc>
+          <w:tcPr>
+            <w:tcW w:w="2800" w:type="dxa"/>
+          </w:tcPr>
+          <w:p>
+            <w:pPr>
+              <w:spacing w:after="0"/>
+              <w:rPr>
+                <w:sz w:val="20"/>
+                <w:szCs w:val="20"/>
+              </w:rPr>
+            </w:pPr>
+            <w:r>
+              <w:rPr>
+                <w:sz w:val="20"/>
+                <w:szCs w:val="20"/>
+              </w:rPr>
+              <w:t>Weersomstandigheden</w:t>
+            </w:r>
+          </w:p>
+        </w:tc>
+        <w:tc>
+          <w:tcPr>
+            <w:tcW w:w="2161" w:type="dxa"/>
+          </w:tcPr>
+          <w:p>
+            <w:pPr>
+              <w:spacing w:after="0"/>
+              <w:rPr>
+                <w:sz w:val="20"/>
+                <w:szCs w:val="20"/>
+              </w:rPr>
+            </w:pPr>
+            <w:r>
+              <w:rPr>
+                <w:sz w:val="20"/>
+                <w:szCs w:val="20"/>
+              </w:rPr>
+              <w:t>{{ panel.weersomstandigheden }}</w:t>
+            </w:r>
+          </w:p>
+        </w:tc>
+        <w:tc>
+          <w:tcPr>
+            <w:tcW w:w="4961" w:type="dxa"/>
+            <w:gridSpan w:val="2"/>
+            <w:vMerge w:val="restart"/>
+          </w:tcPr>
+          <w:p>
+            <w:pPr>
+              <w:spacing w:after="0"/>
+              <w:rPr>
+                <w:sz w:val="20"/>
+                <w:szCs w:val="20"/>
+              </w:rPr>
+            </w:pPr>
+            <w:r>
+              <w:rPr>
+                <w:sz w:val="20"/>
+                <w:szCs w:val="20"/>
+              </w:rPr>
+              <w:t>{{ panel.locatie_foto }}</w:t>
+            </w:r>
+          </w:p>
+        </w:tc>
+      </w:tr>
+      <w:tr>
+        <w:tc>
+          <w:tcPr>
+            <w:tcW w:w="2800" w:type="dxa"/>
+          </w:tcPr>
+          <w:p>
+            <w:pPr>
+              <w:spacing w:after="0"/>
+              <w:rPr>
+                <w:sz w:val="20"/>
+                <w:szCs w:val="20"/>
+              </w:rPr>
+            </w:pPr>
+            <w:r>
+              <w:rPr>
+                <w:sz w:val="20"/>
+                <w:szCs w:val="20"/>
+              </w:rPr>
+              <w:t>Buitentemperatuur</w:t>
+            </w:r>
+          </w:p>
+        </w:tc>
+        <w:tc>
+          <w:tcPr>
+            <w:tcW w:w="2161" w:type="dxa"/>
+          </w:tcPr>
+          <w:p>
+            <w:pPr>
+              <w:spacing w:after="0"/>
+              <w:rPr>
+                <w:sz w:val="20"/>
+                <w:szCs w:val="20"/>
+              </w:rPr>
+            </w:pPr>
+            <w:r>
+              <w:rPr>
+                <w:sz w:val="20"/>
+                <w:szCs w:val="20"/>
+              </w:rPr>
+              <w:t>{{ panel.buitentemperatuur }}</w:t>
+            </w:r>
+          </w:p>
+        </w:tc>
+        <w:tc>
+          <w:tcPr>
+            <w:tcW w:w="4961" w:type="dxa"/>
+            <w:gridSpan w:val="2"/>
+            <w:vMerge/>
+          </w:tcPr>
+          <w:p>
+            <w:pPr>
+              <w:spacing w:after="0"/>
+              <w:rPr>
+                <w:sz w:val="20"/>
+                <w:szCs w:val="20"/>
+              </w:rPr>
+            </w:pPr>
+          </w:p>
+        </w:tc>
+      </w:tr>
+      <w:tr>
+        <w:tc>
+          <w:tcPr>
+            <w:tcW w:w="2800" w:type="dxa"/>
+          </w:tcPr>
+          <w:p>
+            <w:pPr>
+              <w:spacing w:after="0"/>
+              <w:rPr>
+                <w:sz w:val="20"/>
+                <w:szCs w:val="20"/>
+              </w:rPr>
+            </w:pPr>
+            <w:r>
+              <w:rPr>
+                <w:sz w:val="20"/>
+                <w:szCs w:val="20"/>
+              </w:rPr>
+              <w:t>Windsnelheid</w:t>
+            </w:r>
+          </w:p>
+        </w:tc>
+        <w:tc>
+          <w:tcPr>
+            <w:tcW w:w="2161" w:type="dxa"/>
+          </w:tcPr>
+          <w:p>
+            <w:pPr>
+              <w:spacing w:after="0"/>
+              <w:rPr>
+                <w:sz w:val="20"/>
+                <w:szCs w:val="20"/>
+              </w:rPr>
+            </w:pPr>
+            <w:r>
+              <w:rPr>
+                <w:sz w:val="20"/>
+                <w:szCs w:val="20"/>
+              </w:rPr>
+              <w:t>{{ panel.windsnelheid }}</w:t>
+            </w:r>
+          </w:p>
+        </w:tc>
+        <w:tc>
+          <w:tcPr>
+            <w:tcW w:w="4961" w:type="dxa"/>
+            <w:gridSpan w:val="2"/>
+            <w:vMerge/>
+          </w:tcPr>
+          <w:p>
+            <w:pPr>
+              <w:spacing w:after="0"/>
+              <w:rPr>
+                <w:sz w:val="20"/>
+                <w:szCs w:val="20"/>
+              </w:rPr>
+            </w:pPr>
+          </w:p>
+        </w:tc>
+      </w:tr>
+      <w:tr>
+        <w:tc>
+          <w:tcPr>
+            <w:tcW w:w="2800" w:type="dxa"/>
+          </w:tcPr>
+          <w:p>
+            <w:pPr>
+              <w:spacing w:after="0"/>
+              <w:rPr>
+                <w:sz w:val="20"/>
+                <w:szCs w:val="20"/>
+              </w:rPr>
+            </w:pPr>
+            <w:r>
+              <w:rPr>
+                <w:sz w:val="20"/>
+                <w:szCs w:val="20"/>
+              </w:rPr>
+              <w:t>Instraling</w:t>
+            </w:r>
+          </w:p>
+        </w:tc>
+        <w:tc>
+          <w:tcPr>
+            <w:tcW w:w="2161" w:type="dxa"/>
+          </w:tcPr>
+          <w:p>
+            <w:pPr>
+              <w:spacing w:after="0"/>
+              <w:rPr>
+                <w:sz w:val="20"/>
+                <w:szCs w:val="20"/>
+              </w:rPr>
+            </w:pPr>
+            <w:r>
+              <w:rPr>
+                <w:sz w:val="20"/>
+                <w:szCs w:val="20"/>
+              </w:rPr>
+              <w:t>{{ panel.instraling }}</w:t>
+            </w:r>
+          </w:p>
+        </w:tc>
+        <w:tc>
+          <w:tcPr>
+            <w:tcW w:w="4961" w:type="dxa"/>
+            <w:gridSpan w:val="2"/>
+            <w:vMerge/>
+          </w:tcPr>
+          <w:p>
+            <w:pPr>
+              <w:spacing w:after="0"/>
+              <w:rPr>
+                <w:sz w:val="20"/>
+                <w:szCs w:val="20"/>
+              </w:rPr>
+            </w:pPr>
+          </w:p>
+        </w:tc>
+      </w:tr>
+      <w:tr>
+        <w:tc>
+          <w:tcPr>
+            <w:tcW w:w="2800" w:type="dxa"/>
+          </w:tcPr>
+          <w:p>
+            <w:pPr>
+              <w:spacing w:after="0"/>
+              <w:rPr>
+                <w:sz w:val="20"/>
+                <w:szCs w:val="20"/>
+              </w:rPr>
+            </w:pPr>
+            <w:r>
+              <w:rPr>
+                <w:sz w:val="20"/>
+                <w:szCs w:val="20"/>
+              </w:rPr>
+              <w:t>Drone / Camera</w:t>
+            </w:r>
+          </w:p>
+        </w:tc>
+        <w:tc>
+          <w:tcPr>
+            <w:tcW w:w="2161" w:type="dxa"/>
+          </w:tcPr>
+          <w:p>
+            <w:pPr>
+              <w:spacing w:after="0"/>
+              <w:rPr>
+                <w:sz w:val="20"/>
+                <w:szCs w:val="20"/>
+              </w:rPr>
+            </w:pPr>
+            <w:r>
+              <w:rPr>
+                <w:sz w:val="20"/>
+                <w:szCs w:val="20"/>
+              </w:rPr>
+              <w:t>{{ panel.drone_camera }}</w:t>
+            </w:r>
+          </w:p>
+        </w:tc>
+        <w:tc>
+          <w:tcPr>
+            <w:tcW w:w="4961" w:type="dxa"/>
+            <w:gridSpan w:val="2"/>
+            <w:vMerge/>
+          </w:tcPr>
+          <w:p>
+            <w:pPr>
+              <w:spacing w:after="0"/>
+              <w:rPr>
+                <w:sz w:val="20"/>
+                <w:szCs w:val="20"/>
+              </w:rPr>
+            </w:pPr>
+          </w:p>
+        </w:tc>
+      </w:tr>
+      <w:tr>
+        <w:tc>
+          <w:tcPr>
+            <w:tcW w:w="4961" w:type="dxa"/>
+            <w:gridSpan w:val="2"/>
+          </w:tcPr>
+          <w:p>
+            <w:pPr>
+              <w:spacing w:after="0"/>
+              <w:rPr>
+                <w:sz w:val="20"/>
+                <w:szCs w:val="20"/>
+              </w:rPr>
+            </w:pPr>
+          </w:p>
+        </w:tc>
+        <w:tc>
+          <w:tcPr>
+            <w:tcW w:w="4961" w:type="dxa"/>
+            <w:gridSpan w:val="2"/>
+            <w:vMerge/>
+          </w:tcPr>
+          <w:p>
+            <w:pPr>
+              <w:spacing w:after="0"/>
+              <w:rPr>
+                <w:sz w:val="20"/>
+                <w:szCs w:val="20"/>
+              </w:rPr>
+            </w:pPr>
+          </w:p>
+        </w:tc>
+      </w:tr>
+      <w:tr>
+        <w:tc>
+          <w:tcPr>
+            <w:tcW w:w="4961" w:type="dxa"/>
+            <w:gridSpan w:val="2"/>
+          </w:tcPr>
+          <w:p>
+            <w:pPr>
+              <w:spacing w:after="0"/>
+              <w:rPr>
+                <w:sz w:val="20"/>
+                <w:szCs w:val="20"/>
+              </w:rPr>
+            </w:pPr>
+            <w:r>
+              <w:rPr>
+                <w:b/>
+                <w:bCs/>
+                <w:sz w:val="20"/>
+                <w:szCs w:val="20"/>
+              </w:rPr>
+              <w:t>Thermische meetresultaten</w:t>
+            </w:r>
+          </w:p>
+        </w:tc>
+        <w:tc>
+          <w:tcPr>
+            <w:tcW w:w="4961" w:type="dxa"/>
+            <w:gridSpan w:val="2"/>
+            <w:vMerge/>
+          </w:tcPr>
+          <w:p>
+            <w:pPr>
+              <w:spacing w:after="0"/>
+              <w:rPr>
+                <w:sz w:val="20"/>
+                <w:szCs w:val="20"/>
+              </w:rPr>
+            </w:pPr>
+          </w:p>
+        </w:tc>
+      </w:tr>
+      <w:tr>
+        <w:tc>
+          <w:tcPr>
+            <w:tcW w:w="2800" w:type="dxa"/>
+          </w:tcPr>
+          <w:p>
+            <w:pPr>
+              <w:spacing w:after="0"/>
+              <w:rPr>
+                <w:sz w:val="20"/>
+                <w:szCs w:val="20"/>
+              </w:rPr>
+            </w:pPr>
+            <w:r>
+              <w:rPr>
+                <w:sz w:val="20"/>
+                <w:szCs w:val="20"/>
+              </w:rPr>
+              <w:t>Gemiddelde paneeltemp.</w:t>
+            </w:r>
+          </w:p>
+        </w:tc>
+        <w:tc>
+          <w:tcPr>
+            <w:tcW w:w="2161" w:type="dxa"/>
+          </w:tcPr>
+          <w:p>
+            <w:pPr>
+              <w:spacing w:after="0"/>
+              <w:rPr>
+                <w:sz w:val="20"/>
+                <w:szCs w:val="20"/>
+              </w:rPr>
+            </w:pPr>
+            <w:r>
+              <w:rPr>
+                <w:sz w:val="20"/>
+                <w:szCs w:val="20"/>
+              </w:rPr>
+              <w:t>{{ panel.gem_paneeltemp }}</w:t>
+            </w:r>
+          </w:p>
+        </w:tc>
+        <w:tc>
+          <w:tcPr>
+            <w:tcW w:w="4961" w:type="dxa"/>
+            <w:gridSpan w:val="2"/>
+            <w:vMerge/>
+          </w:tcPr>
+          <w:p>
+            <w:pPr>
+              <w:spacing w:after="0"/>
+              <w:rPr>
+                <w:sz w:val="20"/>
+                <w:szCs w:val="20"/>
+              </w:rPr>
+            </w:pPr>
+          </w:p>
+        </w:tc>
+      </w:tr>
+      <w:tr>
+        <w:tc>
+          <w:tcPr>
+            <w:tcW w:w="2800" w:type="dxa"/>
+          </w:tcPr>
+          <w:p>
+            <w:pPr>
+              <w:spacing w:after="0"/>
+              <w:rPr>
+                <w:sz w:val="20"/>
+                <w:szCs w:val="20"/>
+              </w:rPr>
+            </w:pPr>
+            <w:r>
+              <w:rPr>
+                <w:sz w:val="20"/>
+                <w:szCs w:val="20"/>
+              </w:rPr>
+              <w:t>Maximale temperatuur</w:t>
+            </w:r>
+          </w:p>
+        </w:tc>
+        <w:tc>
+          <w:tcPr>
+            <w:tcW w:w="2161" w:type="dxa"/>
+          </w:tcPr>
+          <w:p>
+            <w:pPr>
+              <w:spacing w:after="0"/>
+              <w:rPr>
+                <w:sz w:val="20"/>
+                <w:szCs w:val="20"/>
+              </w:rPr>
+            </w:pPr>
+            <w:r>
+              <w:rPr>
+                <w:sz w:val="20"/>
+                <w:szCs w:val="20"/>
+              </w:rPr>
+              <w:t>{{ panel.max_temperatuur }}</w:t>
+            </w:r>
+          </w:p>
+        </w:tc>
+        <w:tc>
+          <w:tcPr>
+            <w:tcW w:w="4961" w:type="dxa"/>
+            <w:gridSpan w:val="2"/>
+            <w:vMerge/>
+          </w:tcPr>
+          <w:p>
+            <w:pPr>
+              <w:spacing w:after="0"/>
+              <w:rPr>
+                <w:sz w:val="20"/>
+                <w:szCs w:val="20"/>
+              </w:rPr>
+            </w:pPr>
+          </w:p>
+        </w:tc>
+      </w:tr>
+      <w:tr>
+        <w:tc>
+          <w:tcPr>
+            <w:tcW w:w="2800" w:type="dxa"/>
+          </w:tcPr>
+          <w:p>
+            <w:pPr>
+              <w:spacing w:after="0"/>
+              <w:rPr>
+                <w:sz w:val="20"/>
+                <w:szCs w:val="20"/>
+              </w:rPr>
+            </w:pPr>
+            <w:r>
+              <w:rPr>
+                <w:sz w:val="20"/>
+                <w:szCs w:val="20"/>
+              </w:rPr>
+              <w:t>Minimale temperatuur</w:t>
+            </w:r>
+          </w:p>
+        </w:tc>
+        <w:tc>
+          <w:tcPr>
+            <w:tcW w:w="2161" w:type="dxa"/>
+          </w:tcPr>
+          <w:p>
+            <w:pPr>
+              <w:spacing w:after="0"/>
+              <w:rPr>
+                <w:sz w:val="20"/>
+                <w:szCs w:val="20"/>
+              </w:rPr>
+            </w:pPr>
+            <w:r>
+              <w:rPr>
+                <w:sz w:val="20"/>
+                <w:szCs w:val="20"/>
+              </w:rPr>
+              <w:t>{{ panel.min_temperatuur }}</w:t>
+            </w:r>
+          </w:p>
+        </w:tc>
+        <w:tc>
+          <w:tcPr>
+            <w:tcW w:w="4961" w:type="dxa"/>
+            <w:gridSpan w:val="2"/>
+            <w:vMerge/>
+          </w:tcPr>
+          <w:p>
+            <w:pPr>
+              <w:spacing w:after="0"/>
+              <w:rPr>
+                <w:sz w:val="20"/>
+                <w:szCs w:val="20"/>
+              </w:rPr>
+            </w:pPr>
+          </w:p>
+        </w:tc>
+      </w:tr>
+      <w:tr>
+        <w:tc>
+          <w:tcPr>
+            <w:tcW w:w="2800" w:type="dxa"/>
+          </w:tcPr>
+          <w:p>
+            <w:pPr>
+              <w:spacing w:after="0"/>
+              <w:rPr>
+                <w:sz w:val="20"/>
+                <w:szCs w:val="20"/>
+              </w:rPr>
+            </w:pPr>
+            <w:r>
+              <w:rPr>
+                <w:sz w:val="20"/>
+                <w:szCs w:val="20"/>
+              </w:rPr>
+              <w:t>Temperatuurverschil ΔT</w:t>
+            </w:r>
+          </w:p>
+        </w:tc>
+        <w:tc>
+          <w:tcPr>
+            <w:tcW w:w="2161" w:type="dxa"/>
+          </w:tcPr>
+          <w:p>
+            <w:pPr>
+              <w:spacing w:after="0"/>
+              <w:rPr>
+                <w:sz w:val="20"/>
+                <w:szCs w:val="20"/>
+              </w:rPr>
+            </w:pPr>
+            <w:r>
+              <w:rPr>
+                <w:sz w:val="20"/>
+                <w:szCs w:val="20"/>
+              </w:rPr>
+              <w:t>{{ panel.temperatuurverschil }}</w:t>
+            </w:r>
+          </w:p>
+        </w:tc>
+        <w:tc>
+          <w:tcPr>
+            <w:tcW w:w="4961" w:type="dxa"/>
+            <w:gridSpan w:val="2"/>
+          </w:tcPr>
+          <w:p>
+            <w:pPr>
+              <w:spacing w:after="0"/>
+              <w:rPr>
+                <w:sz w:val="20"/>
+                <w:szCs w:val="20"/>
+              </w:rPr>
+            </w:pPr>
+            <w:r>
+              <w:rPr>
+                <w:i/>
+                <w:iCs/>
+                <w:sz w:val="20"/>
+                <w:szCs w:val="20"/>
+              </w:rPr>
+              <w:t>locatie paneel</w:t>
+            </w:r>
+          </w:p>
+        </w:tc>
+      </w:tr>
+    </w:tbl>
     <w:p>
       <w:pPr>
         <w:spacing w:after="0"/>
@@ -44,2142 +1255,69 @@
           <w:szCs w:val="20"/>
         </w:rPr>
       </w:pPr>
-      <w:r>
-        <w:rPr>
-          <w:b/>
-          <w:bCs/>
-          <w:sz w:val="20"/>
-          <w:szCs w:val="20"/>
-        </w:rPr>
-        <w:t>Projectgegevens</w:t>
-      </w:r>
-      <w:r>
-        <w:rPr>
-          <w:b/>
-          <w:bCs/>
-          <w:sz w:val="20"/>
-          <w:szCs w:val="20"/>
-        </w:rPr>
-        <w:tab/>
-      </w:r>
-      <w:r>
-        <w:rPr>
-          <w:b/>
-          <w:bCs/>
-          <w:sz w:val="20"/>
-          <w:szCs w:val="20"/>
-        </w:rPr>
-        <w:tab/>
-      </w:r>
-      <w:r>
-        <w:rPr>
-          <w:b/>
-          <w:bCs/>
-          <w:sz w:val="20"/>
-          <w:szCs w:val="20"/>
-        </w:rPr>
-        <w:tab/>
-      </w:r>
-      <w:r>
-        <w:rPr>
-          <w:b/>
-          <w:bCs/>
-          <w:sz w:val="20"/>
-          <w:szCs w:val="20"/>
-        </w:rPr>
-        <w:tab/>
-      </w:r>
-      <w:r>
-        <w:rPr>
-          <w:b/>
-          <w:bCs/>
-          <w:sz w:val="20"/>
-          <w:szCs w:val="20"/>
-        </w:rPr>
-        <w:tab/>
-      </w:r>
-      <w:r>
-        <w:rPr>
-          <w:b/>
-          <w:bCs/>
-          <w:sz w:val="20"/>
-          <w:szCs w:val="20"/>
-        </w:rPr>
-        <w:tab/>
-      </w:r>
-      <w:r>
-        <w:rPr>
-          <w:b/>
-          <w:bCs/>
-          <w:sz w:val="20"/>
-          <w:szCs w:val="20"/>
-        </w:rPr>
-        <w:tab/>
-      </w:r>
-      <w:r>
-        <w:rPr>
-          <w:b/>
-          <w:bCs/>
-          <w:sz w:val="20"/>
-          <w:szCs w:val="20"/>
-        </w:rPr>
-        <w:t>Paneelgegevens</w:t>
-      </w:r>
     </w:p>
-    <w:p>
-      <w:pPr>
-        <w:spacing w:after="0"/>
-        <w:rPr>
-          <w:sz w:val="20"/>
-          <w:szCs w:val="20"/>
-          <w:lang w:val="en-US"/>
-        </w:rPr>
-      </w:pPr>
-      <w:proofErr w:type="spellStart"/>
-      <w:r>
-        <w:rPr>
-          <w:sz w:val="20"/>
-          <w:szCs w:val="20"/>
-          <w:lang w:val="en-US"/>
-        </w:rPr>
-        <w:t>Projectnummer</w:t>
-      </w:r>
-      <w:proofErr w:type="spellEnd"/>
-      <w:r>
-        <w:rPr>
-          <w:sz w:val="20"/>
-          <w:szCs w:val="20"/>
-          <w:lang w:val="en-US"/>
-        </w:rPr>
-        <w:tab/>
-      </w:r>
-      <w:r>
-        <w:rPr>
-          <w:sz w:val="20"/>
-          <w:szCs w:val="20"/>
-          <w:lang w:val="en-US"/>
-        </w:rPr>
-        <w:tab/>
-      </w:r>
-      <w:proofErr w:type="gramStart"/>
-      <w:r>
-        <w:rPr>
-          <w:b/>
-          <w:bCs/>
-          <w:sz w:val="20"/>
-          <w:szCs w:val="20"/>
-          <w:lang w:val="en-US"/>
-        </w:rPr>
-        <w:t xml:space="preserve">{{ </w:t>
-      </w:r>
-      <w:proofErr w:type="spellStart"/>
-      <w:r>
-        <w:rPr>
-          <w:b/>
-          <w:bCs/>
-          <w:sz w:val="20"/>
-          <w:szCs w:val="20"/>
-          <w:lang w:val="en-US"/>
-        </w:rPr>
-        <w:t>panel</w:t>
-      </w:r>
-      <w:proofErr w:type="gramEnd"/>
-      <w:r>
-        <w:rPr>
-          <w:b/>
-          <w:bCs/>
-          <w:sz w:val="20"/>
-          <w:szCs w:val="20"/>
-          <w:lang w:val="en-US"/>
-        </w:rPr>
-        <w:t>.</w:t>
-      </w:r>
-      <w:proofErr w:type="gramStart"/>
-      <w:r>
-        <w:rPr>
-          <w:b/>
-          <w:bCs/>
-          <w:sz w:val="20"/>
-          <w:szCs w:val="20"/>
-          <w:lang w:val="en-US"/>
-        </w:rPr>
-        <w:t>projectnummer</w:t>
-      </w:r>
-      <w:proofErr w:type="spellEnd"/>
-      <w:r>
-        <w:rPr>
-          <w:b/>
-          <w:bCs/>
-          <w:sz w:val="20"/>
-          <w:szCs w:val="20"/>
-          <w:lang w:val="en-US"/>
-        </w:rPr>
-        <w:t xml:space="preserve"> }}</w:t>
-      </w:r>
-      <w:r>
-        <w:rPr>
-          <w:b/>
-          <w:bCs/>
-          <w:sz w:val="20"/>
-          <w:szCs w:val="20"/>
-          <w:lang w:val="en-US"/>
-        </w:rPr>
-        <w:tab/>
-      </w:r>
-      <w:proofErr w:type="gramEnd"/>
-      <w:r>
-        <w:rPr>
-          <w:b/>
-          <w:bCs/>
-          <w:sz w:val="20"/>
-          <w:szCs w:val="20"/>
-          <w:lang w:val="en-US"/>
-        </w:rPr>
-        <w:tab/>
-      </w:r>
-      <w:r>
-        <w:rPr>
-          <w:sz w:val="20"/>
-          <w:szCs w:val="20"/>
-          <w:lang w:val="en-US"/>
-        </w:rPr>
-        <w:t>String</w:t>
-      </w:r>
-      <w:r>
-        <w:rPr>
-          <w:sz w:val="20"/>
-          <w:szCs w:val="20"/>
-          <w:lang w:val="en-US"/>
-        </w:rPr>
-        <w:tab/>
-      </w:r>
-      <w:r>
-        <w:rPr>
-          <w:sz w:val="20"/>
-          <w:szCs w:val="20"/>
-          <w:lang w:val="en-US"/>
-        </w:rPr>
-        <w:tab/>
-      </w:r>
-      <w:r>
-        <w:rPr>
-          <w:sz w:val="20"/>
-          <w:szCs w:val="20"/>
-          <w:lang w:val="en-US"/>
-        </w:rPr>
-        <w:tab/>
-      </w:r>
-      <w:proofErr w:type="gramStart"/>
-      <w:r>
-        <w:rPr>
-          <w:sz w:val="20"/>
-          <w:szCs w:val="20"/>
-          <w:lang w:val="en-US"/>
-        </w:rPr>
-        <w:t xml:space="preserve">{{ </w:t>
-      </w:r>
-      <w:proofErr w:type="spellStart"/>
-      <w:r>
-        <w:rPr>
-          <w:sz w:val="20"/>
-          <w:szCs w:val="20"/>
-          <w:lang w:val="en-US"/>
-        </w:rPr>
-        <w:t>panel</w:t>
-      </w:r>
-      <w:proofErr w:type="gramEnd"/>
-      <w:r>
-        <w:rPr>
-          <w:sz w:val="20"/>
-          <w:szCs w:val="20"/>
-          <w:lang w:val="en-US"/>
-        </w:rPr>
-        <w:t>.</w:t>
-      </w:r>
-      <w:proofErr w:type="gramStart"/>
-      <w:r>
-        <w:rPr>
-          <w:sz w:val="20"/>
-          <w:szCs w:val="20"/>
-          <w:lang w:val="en-US"/>
-        </w:rPr>
-        <w:t>string</w:t>
-      </w:r>
-      <w:proofErr w:type="spellEnd"/>
-      <w:r>
-        <w:rPr>
-          <w:sz w:val="20"/>
-          <w:szCs w:val="20"/>
-          <w:lang w:val="en-US"/>
-        </w:rPr>
-        <w:t xml:space="preserve"> }</w:t>
-      </w:r>
-      <w:proofErr w:type="gramEnd"/>
-      <w:r>
-        <w:rPr>
-          <w:sz w:val="20"/>
-          <w:szCs w:val="20"/>
-          <w:lang w:val="en-US"/>
-        </w:rPr>
-        <w:t>}</w:t>
-      </w:r>
-    </w:p>
-    <w:p>
-      <w:pPr>
-        <w:spacing w:after="0"/>
-        <w:rPr>
-          <w:sz w:val="20"/>
-          <w:szCs w:val="20"/>
-        </w:rPr>
-      </w:pPr>
-      <w:r>
-        <w:rPr>
-          <w:sz w:val="20"/>
-          <w:szCs w:val="20"/>
-        </w:rPr>
-        <w:t>Opdrachtgever</w:t>
-      </w:r>
-      <w:r>
-        <w:rPr>
-          <w:sz w:val="20"/>
-          <w:szCs w:val="20"/>
-        </w:rPr>
-        <w:tab/>
-      </w:r>
-      <w:r>
-        <w:rPr>
-          <w:sz w:val="20"/>
-          <w:szCs w:val="20"/>
-        </w:rPr>
-        <w:tab/>
-      </w:r>
-      <w:proofErr w:type="gramStart"/>
-      <w:r>
-        <w:rPr>
-          <w:sz w:val="20"/>
-          <w:szCs w:val="20"/>
-        </w:rPr>
-        <w:t xml:space="preserve">{{ </w:t>
-      </w:r>
-      <w:proofErr w:type="spellStart"/>
-      <w:r>
-        <w:rPr>
-          <w:sz w:val="20"/>
-          <w:szCs w:val="20"/>
-        </w:rPr>
-        <w:t>panel</w:t>
-      </w:r>
-      <w:proofErr w:type="gramEnd"/>
-      <w:r>
-        <w:rPr>
-          <w:sz w:val="20"/>
-          <w:szCs w:val="20"/>
-        </w:rPr>
-        <w:t>.</w:t>
-      </w:r>
-      <w:proofErr w:type="gramStart"/>
-      <w:r>
-        <w:rPr>
-          <w:sz w:val="20"/>
-          <w:szCs w:val="20"/>
-        </w:rPr>
-        <w:t>opdrachtgever</w:t>
-      </w:r>
-      <w:proofErr w:type="spellEnd"/>
-      <w:r>
-        <w:rPr>
-          <w:sz w:val="20"/>
-          <w:szCs w:val="20"/>
-        </w:rPr>
-        <w:t xml:space="preserve"> }}</w:t>
-      </w:r>
-      <w:r>
-        <w:rPr>
-          <w:sz w:val="20"/>
-          <w:szCs w:val="20"/>
-        </w:rPr>
-        <w:tab/>
-      </w:r>
-      <w:proofErr w:type="gramEnd"/>
-      <w:r>
-        <w:rPr>
-          <w:sz w:val="20"/>
-          <w:szCs w:val="20"/>
-        </w:rPr>
-        <w:tab/>
-      </w:r>
-      <w:r>
-        <w:rPr>
-          <w:sz w:val="20"/>
-          <w:szCs w:val="20"/>
-        </w:rPr>
-        <w:tab/>
-        <w:t>Paneelnummer</w:t>
-      </w:r>
-      <w:r>
-        <w:rPr>
-          <w:sz w:val="20"/>
-          <w:szCs w:val="20"/>
-        </w:rPr>
-        <w:tab/>
-      </w:r>
-      <w:r>
-        <w:rPr>
-          <w:sz w:val="20"/>
-          <w:szCs w:val="20"/>
-        </w:rPr>
-        <w:tab/>
-      </w:r>
-      <w:proofErr w:type="gramStart"/>
-      <w:r>
-        <w:rPr>
-          <w:sz w:val="20"/>
-          <w:szCs w:val="20"/>
-        </w:rPr>
-        <w:t>{{ panel</w:t>
-      </w:r>
-      <w:proofErr w:type="gramEnd"/>
-      <w:r>
-        <w:rPr>
-          <w:sz w:val="20"/>
-          <w:szCs w:val="20"/>
-        </w:rPr>
-        <w:t>.</w:t>
-      </w:r>
-      <w:proofErr w:type="gramStart"/>
-      <w:r>
-        <w:rPr>
-          <w:sz w:val="20"/>
-          <w:szCs w:val="20"/>
-        </w:rPr>
-        <w:t>paneelnummer }</w:t>
-      </w:r>
-      <w:proofErr w:type="gramEnd"/>
-      <w:r>
-        <w:rPr>
-          <w:sz w:val="20"/>
-          <w:szCs w:val="20"/>
-        </w:rPr>
-        <w:t>}</w:t>
-      </w:r>
-    </w:p>
-    <w:p>
-      <w:pPr>
-        <w:spacing w:after="0"/>
-        <w:rPr>
-          <w:sz w:val="20"/>
-          <w:szCs w:val="20"/>
-        </w:rPr>
-      </w:pPr>
-      <w:r>
-        <w:rPr>
-          <w:sz w:val="20"/>
-          <w:szCs w:val="20"/>
-        </w:rPr>
-        <w:t>Locatie</w:t>
-      </w:r>
-      <w:r>
-        <w:rPr>
-          <w:sz w:val="20"/>
-          <w:szCs w:val="20"/>
-        </w:rPr>
-        <w:tab/>
-      </w:r>
-      <w:r>
-        <w:rPr>
-          <w:sz w:val="20"/>
-          <w:szCs w:val="20"/>
-        </w:rPr>
-        <w:tab/>
-      </w:r>
-      <w:r>
-        <w:rPr>
-          <w:sz w:val="20"/>
-          <w:szCs w:val="20"/>
-        </w:rPr>
-        <w:tab/>
-      </w:r>
-      <w:proofErr w:type="gramStart"/>
-      <w:r>
-        <w:rPr>
-          <w:sz w:val="20"/>
-          <w:szCs w:val="20"/>
-        </w:rPr>
-        <w:t xml:space="preserve">{{ </w:t>
-      </w:r>
-      <w:proofErr w:type="spellStart"/>
-      <w:r>
-        <w:rPr>
-          <w:sz w:val="20"/>
-          <w:szCs w:val="20"/>
-        </w:rPr>
-        <w:t>panel</w:t>
-      </w:r>
-      <w:proofErr w:type="gramEnd"/>
-      <w:r>
-        <w:rPr>
-          <w:sz w:val="20"/>
-          <w:szCs w:val="20"/>
-        </w:rPr>
-        <w:t>.</w:t>
-      </w:r>
-      <w:proofErr w:type="gramStart"/>
-      <w:r>
-        <w:rPr>
-          <w:sz w:val="20"/>
-          <w:szCs w:val="20"/>
-        </w:rPr>
-        <w:t>locatie</w:t>
-      </w:r>
-      <w:proofErr w:type="spellEnd"/>
-      <w:r>
-        <w:rPr>
-          <w:sz w:val="20"/>
-          <w:szCs w:val="20"/>
-        </w:rPr>
-        <w:t xml:space="preserve"> }}</w:t>
-      </w:r>
-      <w:r>
-        <w:rPr>
-          <w:sz w:val="20"/>
-          <w:szCs w:val="20"/>
-        </w:rPr>
-        <w:tab/>
-      </w:r>
-      <w:proofErr w:type="gramEnd"/>
-      <w:r>
-        <w:rPr>
-          <w:sz w:val="20"/>
-          <w:szCs w:val="20"/>
-        </w:rPr>
-        <w:tab/>
-      </w:r>
-      <w:r>
-        <w:rPr>
-          <w:sz w:val="20"/>
-          <w:szCs w:val="20"/>
-        </w:rPr>
-        <w:tab/>
-      </w:r>
-      <w:r>
-        <w:rPr>
-          <w:sz w:val="20"/>
-          <w:szCs w:val="20"/>
-        </w:rPr>
-        <w:tab/>
-      </w:r>
-      <w:r>
-        <w:rPr>
-          <w:sz w:val="20"/>
-          <w:szCs w:val="20"/>
-        </w:rPr>
-        <w:t>Type paneel</w:t>
-      </w:r>
-      <w:r>
-        <w:rPr>
-          <w:sz w:val="20"/>
-          <w:szCs w:val="20"/>
-        </w:rPr>
-        <w:tab/>
-      </w:r>
-      <w:r>
-        <w:rPr>
-          <w:sz w:val="20"/>
-          <w:szCs w:val="20"/>
-        </w:rPr>
-        <w:tab/>
-      </w:r>
-      <w:proofErr w:type="gramStart"/>
-      <w:r>
-        <w:rPr>
-          <w:sz w:val="20"/>
-          <w:szCs w:val="20"/>
-        </w:rPr>
-        <w:t xml:space="preserve">{{ </w:t>
-      </w:r>
-      <w:proofErr w:type="spellStart"/>
-      <w:r>
-        <w:rPr>
-          <w:sz w:val="20"/>
-          <w:szCs w:val="20"/>
-        </w:rPr>
-        <w:t>panel</w:t>
-      </w:r>
-      <w:proofErr w:type="gramEnd"/>
-      <w:r>
-        <w:rPr>
-          <w:sz w:val="20"/>
-          <w:szCs w:val="20"/>
-        </w:rPr>
-        <w:t>.type_</w:t>
-      </w:r>
-      <w:proofErr w:type="gramStart"/>
-      <w:r>
-        <w:rPr>
-          <w:sz w:val="20"/>
-          <w:szCs w:val="20"/>
-        </w:rPr>
-        <w:t>paneel</w:t>
-      </w:r>
-      <w:proofErr w:type="spellEnd"/>
-      <w:r>
-        <w:rPr>
-          <w:sz w:val="20"/>
-          <w:szCs w:val="20"/>
-        </w:rPr>
-        <w:t xml:space="preserve"> }</w:t>
-      </w:r>
-      <w:proofErr w:type="gramEnd"/>
-      <w:r>
-        <w:rPr>
-          <w:sz w:val="20"/>
-          <w:szCs w:val="20"/>
-        </w:rPr>
-        <w:t>}</w:t>
-      </w:r>
-    </w:p>
-    <w:p>
-      <w:pPr>
-        <w:spacing w:after="0"/>
-        <w:rPr>
-          <w:sz w:val="20"/>
-          <w:szCs w:val="20"/>
-        </w:rPr>
-      </w:pPr>
-      <w:r>
-        <w:rPr>
-          <w:sz w:val="20"/>
-          <w:szCs w:val="20"/>
-        </w:rPr>
-        <w:t>Datum inspectie</w:t>
-      </w:r>
-      <w:r>
-        <w:rPr>
-          <w:sz w:val="20"/>
-          <w:szCs w:val="20"/>
-        </w:rPr>
-        <w:tab/>
-      </w:r>
-      <w:r>
-        <w:rPr>
-          <w:sz w:val="20"/>
-          <w:szCs w:val="20"/>
-        </w:rPr>
-        <w:tab/>
-      </w:r>
-      <w:proofErr w:type="gramStart"/>
-      <w:r>
-        <w:rPr>
-          <w:sz w:val="20"/>
-          <w:szCs w:val="20"/>
-        </w:rPr>
-        <w:t xml:space="preserve">{{ </w:t>
-      </w:r>
-      <w:proofErr w:type="spellStart"/>
-      <w:r>
-        <w:rPr>
-          <w:sz w:val="20"/>
-          <w:szCs w:val="20"/>
-        </w:rPr>
-        <w:t>panel</w:t>
-      </w:r>
-      <w:proofErr w:type="gramEnd"/>
-      <w:r>
-        <w:rPr>
-          <w:sz w:val="20"/>
-          <w:szCs w:val="20"/>
-        </w:rPr>
-        <w:t>.datum_</w:t>
-      </w:r>
-      <w:proofErr w:type="gramStart"/>
-      <w:r>
-        <w:rPr>
-          <w:sz w:val="20"/>
-          <w:szCs w:val="20"/>
-        </w:rPr>
-        <w:t>inspectie</w:t>
-      </w:r>
-      <w:proofErr w:type="spellEnd"/>
-      <w:r>
-        <w:rPr>
-          <w:sz w:val="20"/>
-          <w:szCs w:val="20"/>
-        </w:rPr>
-        <w:t xml:space="preserve"> }}</w:t>
-      </w:r>
-      <w:r>
-        <w:rPr>
-          <w:sz w:val="20"/>
-          <w:szCs w:val="20"/>
-        </w:rPr>
-        <w:tab/>
-      </w:r>
-      <w:proofErr w:type="gramEnd"/>
-      <w:r>
-        <w:rPr>
-          <w:sz w:val="20"/>
-          <w:szCs w:val="20"/>
-        </w:rPr>
-        <w:tab/>
-        <w:t>Oriëntatie</w:t>
-      </w:r>
-      <w:r>
-        <w:rPr>
-          <w:sz w:val="20"/>
-          <w:szCs w:val="20"/>
-        </w:rPr>
-        <w:tab/>
-      </w:r>
-      <w:r>
-        <w:rPr>
-          <w:sz w:val="20"/>
-          <w:szCs w:val="20"/>
-        </w:rPr>
-        <w:tab/>
-      </w:r>
-      <w:proofErr w:type="gramStart"/>
-      <w:r>
-        <w:rPr>
-          <w:sz w:val="20"/>
-          <w:szCs w:val="20"/>
-        </w:rPr>
-        <w:t xml:space="preserve">{{ </w:t>
-      </w:r>
-      <w:proofErr w:type="spellStart"/>
-      <w:r>
-        <w:rPr>
-          <w:sz w:val="20"/>
-          <w:szCs w:val="20"/>
-        </w:rPr>
-        <w:t>panel</w:t>
-      </w:r>
-      <w:proofErr w:type="gramEnd"/>
-      <w:r>
-        <w:rPr>
-          <w:sz w:val="20"/>
-          <w:szCs w:val="20"/>
-        </w:rPr>
-        <w:t>.</w:t>
-      </w:r>
-      <w:proofErr w:type="gramStart"/>
-      <w:r>
-        <w:rPr>
-          <w:sz w:val="20"/>
-          <w:szCs w:val="20"/>
-        </w:rPr>
-        <w:t>orientatie</w:t>
-      </w:r>
-      <w:proofErr w:type="spellEnd"/>
-      <w:r>
-        <w:rPr>
-          <w:sz w:val="20"/>
-          <w:szCs w:val="20"/>
-        </w:rPr>
-        <w:t xml:space="preserve"> }</w:t>
-      </w:r>
-      <w:proofErr w:type="gramEnd"/>
-      <w:r>
-        <w:rPr>
-          <w:sz w:val="20"/>
-          <w:szCs w:val="20"/>
-        </w:rPr>
-        <w:t>}</w:t>
-      </w:r>
-    </w:p>
-    <w:p>
-      <w:pPr>
-        <w:spacing w:after="0"/>
-        <w:rPr>
-          <w:sz w:val="20"/>
-          <w:szCs w:val="20"/>
-        </w:rPr>
-      </w:pPr>
-      <w:r>
-        <w:rPr>
-          <w:sz w:val="20"/>
-          <w:szCs w:val="20"/>
-        </w:rPr>
-        <w:t>Tijdstip inspectie</w:t>
-      </w:r>
-      <w:r>
-        <w:rPr>
-          <w:sz w:val="20"/>
-          <w:szCs w:val="20"/>
-        </w:rPr>
-        <w:tab/>
-      </w:r>
-      <w:r>
-        <w:rPr>
-          <w:sz w:val="20"/>
-          <w:szCs w:val="20"/>
-        </w:rPr>
-        <w:tab/>
-      </w:r>
-      <w:proofErr w:type="gramStart"/>
-      <w:r>
-        <w:rPr>
-          <w:sz w:val="20"/>
-          <w:szCs w:val="20"/>
-        </w:rPr>
-        <w:t xml:space="preserve">{{ </w:t>
-      </w:r>
-      <w:proofErr w:type="spellStart"/>
-      <w:r>
-        <w:rPr>
-          <w:sz w:val="20"/>
-          <w:szCs w:val="20"/>
-        </w:rPr>
-        <w:t>panel</w:t>
-      </w:r>
-      <w:proofErr w:type="gramEnd"/>
-      <w:r>
-        <w:rPr>
-          <w:sz w:val="20"/>
-          <w:szCs w:val="20"/>
-        </w:rPr>
-        <w:t>.tijdstip_</w:t>
-      </w:r>
-      <w:proofErr w:type="gramStart"/>
-      <w:r>
-        <w:rPr>
-          <w:sz w:val="20"/>
-          <w:szCs w:val="20"/>
-        </w:rPr>
-        <w:t>inspectie</w:t>
-      </w:r>
-      <w:proofErr w:type="spellEnd"/>
-      <w:r>
-        <w:rPr>
-          <w:sz w:val="20"/>
-          <w:szCs w:val="20"/>
-        </w:rPr>
-        <w:t xml:space="preserve"> }}</w:t>
-      </w:r>
-      <w:r>
-        <w:rPr>
-          <w:sz w:val="20"/>
-          <w:szCs w:val="20"/>
-        </w:rPr>
-        <w:tab/>
-      </w:r>
-      <w:proofErr w:type="gramEnd"/>
-      <w:r>
-        <w:rPr>
-          <w:sz w:val="20"/>
-          <w:szCs w:val="20"/>
-        </w:rPr>
-        <w:tab/>
-        <w:t>Hellingshoek</w:t>
-      </w:r>
-      <w:r>
-        <w:rPr>
-          <w:sz w:val="20"/>
-          <w:szCs w:val="20"/>
-        </w:rPr>
-        <w:tab/>
-      </w:r>
-      <w:r>
-        <w:rPr>
-          <w:sz w:val="20"/>
-          <w:szCs w:val="20"/>
-        </w:rPr>
-        <w:tab/>
-      </w:r>
-      <w:proofErr w:type="gramStart"/>
-      <w:r>
-        <w:rPr>
-          <w:sz w:val="20"/>
-          <w:szCs w:val="20"/>
-        </w:rPr>
-        <w:t xml:space="preserve">{{ </w:t>
-      </w:r>
-      <w:proofErr w:type="spellStart"/>
-      <w:r>
-        <w:rPr>
-          <w:sz w:val="20"/>
-          <w:szCs w:val="20"/>
-        </w:rPr>
-        <w:t>panel</w:t>
-      </w:r>
-      <w:proofErr w:type="gramEnd"/>
-      <w:r>
-        <w:rPr>
-          <w:sz w:val="20"/>
-          <w:szCs w:val="20"/>
-        </w:rPr>
-        <w:t>.</w:t>
-      </w:r>
-      <w:proofErr w:type="gramStart"/>
-      <w:r>
-        <w:rPr>
-          <w:sz w:val="20"/>
-          <w:szCs w:val="20"/>
-        </w:rPr>
-        <w:t>hellingshoek</w:t>
-      </w:r>
-      <w:proofErr w:type="spellEnd"/>
-      <w:r>
-        <w:rPr>
-          <w:sz w:val="20"/>
-          <w:szCs w:val="20"/>
-        </w:rPr>
-        <w:t xml:space="preserve"> }</w:t>
-      </w:r>
-      <w:proofErr w:type="gramEnd"/>
-      <w:r>
-        <w:rPr>
-          <w:sz w:val="20"/>
-          <w:szCs w:val="20"/>
-        </w:rPr>
-        <w:t>}</w:t>
-      </w:r>
-    </w:p>
-    <w:p>
-      <w:pPr>
-        <w:spacing w:after="0"/>
-        <w:rPr>
-          <w:sz w:val="20"/>
-          <w:szCs w:val="20"/>
-        </w:rPr>
-      </w:pPr>
-      <w:r>
-        <w:rPr>
-          <w:sz w:val="20"/>
-          <w:szCs w:val="20"/>
-        </w:rPr>
-        <w:t>Inspecteur</w:t>
-      </w:r>
-      <w:r>
-        <w:rPr>
-          <w:sz w:val="20"/>
-          <w:szCs w:val="20"/>
-        </w:rPr>
-        <w:tab/>
-      </w:r>
-      <w:r>
-        <w:rPr>
-          <w:sz w:val="20"/>
-          <w:szCs w:val="20"/>
-        </w:rPr>
-        <w:tab/>
-      </w:r>
-      <w:proofErr w:type="gramStart"/>
-      <w:r>
-        <w:rPr>
-          <w:sz w:val="20"/>
-          <w:szCs w:val="20"/>
-        </w:rPr>
-        <w:t xml:space="preserve">{{ </w:t>
-      </w:r>
-      <w:proofErr w:type="spellStart"/>
-      <w:r>
-        <w:rPr>
-          <w:sz w:val="20"/>
-          <w:szCs w:val="20"/>
-        </w:rPr>
-        <w:t>panel</w:t>
-      </w:r>
-      <w:proofErr w:type="gramEnd"/>
-      <w:r>
-        <w:rPr>
-          <w:sz w:val="20"/>
-          <w:szCs w:val="20"/>
-        </w:rPr>
-        <w:t>.</w:t>
-      </w:r>
-      <w:proofErr w:type="gramStart"/>
-      <w:r>
-        <w:rPr>
-          <w:sz w:val="20"/>
-          <w:szCs w:val="20"/>
-        </w:rPr>
-        <w:t>inspecteur</w:t>
-      </w:r>
-      <w:proofErr w:type="spellEnd"/>
-      <w:r>
-        <w:rPr>
-          <w:sz w:val="20"/>
-          <w:szCs w:val="20"/>
-        </w:rPr>
-        <w:t xml:space="preserve"> }}</w:t>
-      </w:r>
-      <w:r>
-        <w:rPr>
-          <w:sz w:val="20"/>
-          <w:szCs w:val="20"/>
-        </w:rPr>
-        <w:tab/>
-      </w:r>
-      <w:proofErr w:type="gramEnd"/>
-      <w:r>
-        <w:rPr>
-          <w:sz w:val="20"/>
-          <w:szCs w:val="20"/>
-        </w:rPr>
-        <w:tab/>
-      </w:r>
-      <w:r>
-        <w:rPr>
-          <w:sz w:val="20"/>
-          <w:szCs w:val="20"/>
-        </w:rPr>
-        <w:tab/>
-        <w:t>Positie op dak</w:t>
-      </w:r>
-      <w:r>
-        <w:rPr>
-          <w:sz w:val="20"/>
-          <w:szCs w:val="20"/>
-        </w:rPr>
-        <w:tab/>
-      </w:r>
-      <w:r>
-        <w:rPr>
-          <w:sz w:val="20"/>
-          <w:szCs w:val="20"/>
-        </w:rPr>
-        <w:tab/>
-      </w:r>
-      <w:proofErr w:type="gramStart"/>
-      <w:r>
-        <w:rPr>
-          <w:sz w:val="20"/>
-          <w:szCs w:val="20"/>
-        </w:rPr>
-        <w:t>{{ panel</w:t>
-      </w:r>
-      <w:proofErr w:type="gramEnd"/>
-      <w:r>
-        <w:rPr>
-          <w:sz w:val="20"/>
-          <w:szCs w:val="20"/>
-        </w:rPr>
-        <w:t>.positie_op_</w:t>
-      </w:r>
-      <w:proofErr w:type="gramStart"/>
-      <w:r>
-        <w:rPr>
-          <w:sz w:val="20"/>
-          <w:szCs w:val="20"/>
-        </w:rPr>
-        <w:t>dak }</w:t>
-      </w:r>
-      <w:proofErr w:type="gramEnd"/>
-      <w:r>
-        <w:rPr>
-          <w:sz w:val="20"/>
-          <w:szCs w:val="20"/>
-        </w:rPr>
-        <w:t>}</w:t>
-      </w:r>
-    </w:p>
-    <w:p>
-      <w:pPr>
-        <w:spacing w:after="0"/>
-        <w:rPr>
-          <w:sz w:val="20"/>
-          <w:szCs w:val="20"/>
-        </w:rPr>
-      </w:pPr>
-      <w:r>
-        <w:rPr>
-          <w:noProof/>
-          <w:sz w:val="20"/>
-          <w:szCs w:val="20"/>
-        </w:rPr>
-        <mc:AlternateContent>
-          <mc:Choice Requires="wps">
-            <w:drawing>
-              <wp:anchor distT="45720" distB="45720" distL="114300" distR="114300" simplePos="0" relativeHeight="251660293" behindDoc="0" locked="0" layoutInCell="1" allowOverlap="1" wp14:anchorId="204AFA4F" wp14:editId="7771640A">
-                <wp:simplePos x="0" y="0"/>
-                <wp:positionH relativeFrom="column">
-                  <wp:posOffset>3503930</wp:posOffset>
-                </wp:positionH>
-                <wp:positionV relativeFrom="paragraph">
-                  <wp:posOffset>10795</wp:posOffset>
-                </wp:positionV>
-                <wp:extent cx="2628900" cy="1724025"/>
-                <wp:effectExtent l="0" t="0" r="0" b="0"/>
-                <wp:wrapNone/>
-                <wp:docPr id="510334537" name="Tekstvak 2"/>
-                <wp:cNvGraphicFramePr>
-                  <a:graphicFrameLocks xmlns:a="http://schemas.openxmlformats.org/drawingml/2006/main"/>
-                </wp:cNvGraphicFramePr>
-                <a:graphic xmlns:a="http://schemas.openxmlformats.org/drawingml/2006/main">
-                  <a:graphicData uri="http://schemas.microsoft.com/office/word/2010/wordprocessingShape">
-                    <wps:wsp>
-                      <wps:cNvSpPr txBox="1">
-                        <a:spLocks noChangeArrowheads="1"/>
-                      </wps:cNvSpPr>
-                      <wps:spPr bwMode="auto">
-                        <a:xfrm>
-                          <a:off x="0" y="0"/>
-                          <a:ext cx="2628900" cy="1724025"/>
-                        </a:xfrm>
-                        <a:prstGeom prst="rect">
-                          <a:avLst/>
-                        </a:prstGeom>
-                        <a:noFill/>
-                        <a:ln w="9525">
-                          <a:noFill/>
-                          <a:miter lim="800000"/>
-                          <a:headEnd/>
-                          <a:tailEnd/>
-                        </a:ln>
-                      </wps:spPr>
-                      <wps:txbx>
-                        <w:txbxContent>
-                          <w:p>
-                            <w:r>
-                              <w:rPr>
-                                <w:noProof/>
-                              </w:rPr>
-                              <w:drawing>
-                                <wp:inline distT="0" distB="0" distL="0" distR="0" wp14:anchorId="5CBF76AE" wp14:editId="3838E55A">
-                                  <wp:extent cx="2409825" cy="1613340"/>
-                                  <wp:effectExtent l="0" t="0" r="0" b="6350"/>
-                                  <wp:docPr id="1956148834" name="Afbeelding 1"/>
-                                  <wp:cNvGraphicFramePr>
-                                    <a:graphicFrameLocks xmlns:a="http://schemas.openxmlformats.org/drawingml/2006/main" noChangeAspect="1"/>
-                                  </wp:cNvGraphicFramePr>
-                                  <a:graphic xmlns:a="http://schemas.openxmlformats.org/drawingml/2006/main">
-                                    <a:graphicData uri="http://schemas.openxmlformats.org/drawingml/2006/picture">
-                                      <pic:pic xmlns:pic="http://schemas.openxmlformats.org/drawingml/2006/picture">
-                                        <pic:nvPicPr>
-                                          <pic:cNvPr id="1956148834" name=""/>
-                                          <pic:cNvPicPr/>
-                                        </pic:nvPicPr>
-                                        <pic:blipFill>
-                                          <a:blip r:embed="rId11"/>
-                                          <a:stretch>
-                                            <a:fillRect/>
-                                          </a:stretch>
-                                        </pic:blipFill>
-                                        <pic:spPr>
-                                          <a:xfrm>
-                                            <a:off x="0" y="0"/>
-                                            <a:ext cx="2427434" cy="1625129"/>
-                                          </a:xfrm>
-                                          <a:prstGeom prst="rect">
-                                            <a:avLst/>
-                                          </a:prstGeom>
-                                        </pic:spPr>
-                                      </pic:pic>
-                                    </a:graphicData>
-                                  </a:graphic>
-                                </wp:inline>
-                              </w:drawing>
-                            </w:r>
-                          </w:p>
-                        </w:txbxContent>
-                      </wps:txbx>
-                      <wps:bodyPr rot="0" vert="horz" wrap="square" lIns="91440" tIns="45720" rIns="91440" bIns="45720" anchor="t" anchorCtr="0">
-                        <a:noAutofit/>
-                      </wps:bodyPr>
-                    </wps:wsp>
-                  </a:graphicData>
-                </a:graphic>
-                <wp14:sizeRelH relativeFrom="margin">
-                  <wp14:pctWidth>0</wp14:pctWidth>
-                </wp14:sizeRelH>
-                <wp14:sizeRelV relativeFrom="margin">
-                  <wp14:pctHeight>0</wp14:pctHeight>
-                </wp14:sizeRelV>
-              </wp:anchor>
-            </w:drawing>
-          </mc:Choice>
-          <mc:Fallback xmlns="">
-            <w:pict>
-              <v:shapetype w14:anchorId="1E49E321" id="_x0000_t202" coordsize="21600,21600" o:spt="202" path="m,l,21600r21600,l21600,xe">
-                <v:stroke joinstyle="miter"/>
-                <v:path gradientshapeok="t" o:connecttype="rect"/>
-              </v:shapetype>
-              <v:shape id="Tekstvak 2" o:spid="_x0000_s1026" type="#_x0000_t202" style="position:absolute;margin-left:275.9pt;margin-top:.85pt;width:207pt;height:135.75pt;z-index:251660293;visibility:visible;mso-wrap-style:square;mso-width-percent:0;mso-height-percent:0;mso-wrap-distance-left:9pt;mso-wrap-distance-top:3.6pt;mso-wrap-distance-right:9pt;mso-wrap-distance-bottom:3.6pt;mso-position-horizontal:absolute;mso-position-horizontal-relative:text;mso-position-vertical:absolute;mso-position-vertical-relative:text;mso-width-percent:0;mso-height-percent:0;mso-width-relative:margin;mso-height-relative:margin;v-text-anchor:top" o:gfxdata="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" filled="f" stroked="f">
-                <v:textbox>
-                  <w:txbxContent>
-                    <w:p>
-                      <w:r>
-                        <w:rPr>
-                          <w:noProof/>
-                        </w:rPr>
-                        <w:drawing>
-                          <wp:inline distT="0" distB="0" distL="0" distR="0" wp14:anchorId="2D53B607" wp14:editId="21397796">
-                            <wp:extent cx="2409825" cy="1613340"/>
-                            <wp:effectExtent l="0" t="0" r="0" b="6350"/>
-                            <wp:docPr id="1956148834" name="Afbeelding 1"/>
-                            <wp:cNvGraphicFramePr>
-                              <a:graphicFrameLocks xmlns:a="http://schemas.openxmlformats.org/drawingml/2006/main" noChangeAspect="1"/>
-                            </wp:cNvGraphicFramePr>
-                            <a:graphic xmlns:a="http://schemas.openxmlformats.org/drawingml/2006/main">
-                              <a:graphicData uri="http://schemas.openxmlformats.org/drawingml/2006/picture">
-                                <pic:pic xmlns:pic="http://schemas.openxmlformats.org/drawingml/2006/picture">
-                                  <pic:nvPicPr>
-                                    <pic:cNvPr id="1956148834" name=""/>
-                                    <pic:cNvPicPr/>
-                                  </pic:nvPicPr>
-                                  <pic:blipFill>
-                                    <a:blip r:embed="rId12"/>
-                                    <a:stretch>
-                                      <a:fillRect/>
-                                    </a:stretch>
-                                  </pic:blipFill>
-                                  <pic:spPr>
-                                    <a:xfrm>
-                                      <a:off x="0" y="0"/>
-                                      <a:ext cx="2427434" cy="1625129"/>
-                                    </a:xfrm>
-                                    <a:prstGeom prst="rect">
-                                      <a:avLst/>
-                                    </a:prstGeom>
-                                  </pic:spPr>
-                                </pic:pic>
-                              </a:graphicData>
-                            </a:graphic>
-                          </wp:inline>
-                        </w:drawing>
-                      </w:r>
-                    </w:p>
-                  </w:txbxContent>
-                </v:textbox>
-              </v:shape>
-            </w:pict>
-          </mc:Fallback>
-        </mc:AlternateContent>
-      </w:r>
-      <w:r>
-        <w:rPr>
-          <w:sz w:val="20"/>
-          <w:szCs w:val="20"/>
-        </w:rPr>
-        <w:t>Weersomstandigheden</w:t>
-      </w:r>
-      <w:r>
-        <w:rPr>
-          <w:sz w:val="20"/>
-          <w:szCs w:val="20"/>
-        </w:rPr>
-        <w:tab/>
-      </w:r>
-      <w:proofErr w:type="gramStart"/>
-      <w:r>
-        <w:rPr>
-          <w:sz w:val="20"/>
-          <w:szCs w:val="20"/>
-        </w:rPr>
-        <w:t>{{ panel</w:t>
-      </w:r>
-      <w:proofErr w:type="gramEnd"/>
-      <w:r>
-        <w:rPr>
-          <w:sz w:val="20"/>
-          <w:szCs w:val="20"/>
-        </w:rPr>
-        <w:t>.</w:t>
-      </w:r>
-      <w:proofErr w:type="gramStart"/>
-      <w:r>
-        <w:rPr>
-          <w:sz w:val="20"/>
-          <w:szCs w:val="20"/>
-        </w:rPr>
-        <w:t>weersomstandigheden }</w:t>
-      </w:r>
-      <w:proofErr w:type="gramEnd"/>
-      <w:r>
-        <w:rPr>
-          <w:sz w:val="20"/>
-          <w:szCs w:val="20"/>
-        </w:rPr>
-        <w:t>}</w:t>
-      </w:r>
-      <w:r>
-        <w:rPr>
-          <w:sz w:val="20"/>
-          <w:szCs w:val="20"/>
-        </w:rPr>
-        <w:tab/>
-      </w:r>
-      <w:r>
-        <w:rPr>
-          <w:sz w:val="20"/>
-          <w:szCs w:val="20"/>
-        </w:rPr>
-        <w:tab/>
-      </w:r>
-      <w:r>
-        <w:rPr>
-          <w:sz w:val="20"/>
-          <w:szCs w:val="20"/>
-        </w:rPr>
-        <w:tab/>
-      </w:r>
-    </w:p>
-    <w:p>
-      <w:pPr>
-        <w:spacing w:after="0"/>
-        <w:rPr>
-          <w:sz w:val="20"/>
-          <w:szCs w:val="20"/>
-        </w:rPr>
-      </w:pPr>
-      <w:r>
-        <w:rPr>
-          <w:sz w:val="20"/>
-          <w:szCs w:val="20"/>
-        </w:rPr>
-        <w:t>Buitentemperatuur</w:t>
-      </w:r>
-      <w:r>
-        <w:rPr>
-          <w:sz w:val="20"/>
-          <w:szCs w:val="20"/>
-        </w:rPr>
-        <w:tab/>
-      </w:r>
-      <w:proofErr w:type="gramStart"/>
-      <w:r>
-        <w:rPr>
-          <w:sz w:val="20"/>
-          <w:szCs w:val="20"/>
-        </w:rPr>
-        <w:t>{{ panel</w:t>
-      </w:r>
-      <w:proofErr w:type="gramEnd"/>
-      <w:r>
-        <w:rPr>
-          <w:sz w:val="20"/>
-          <w:szCs w:val="20"/>
-        </w:rPr>
-        <w:t>.</w:t>
-      </w:r>
-      <w:proofErr w:type="gramStart"/>
-      <w:r>
-        <w:rPr>
-          <w:sz w:val="20"/>
-          <w:szCs w:val="20"/>
-        </w:rPr>
-        <w:t>buitentemperatuur }</w:t>
-      </w:r>
-      <w:proofErr w:type="gramEnd"/>
-      <w:r>
-        <w:rPr>
-          <w:sz w:val="20"/>
-          <w:szCs w:val="20"/>
-        </w:rPr>
-        <w:t>}</w:t>
-      </w:r>
-    </w:p>
-    <w:p>
-      <w:pPr>
-        <w:spacing w:after="0"/>
-        <w:rPr>
-          <w:sz w:val="20"/>
-          <w:szCs w:val="20"/>
-        </w:rPr>
-      </w:pPr>
-      <w:r>
-        <w:rPr>
-          <w:sz w:val="20"/>
-          <w:szCs w:val="20"/>
-        </w:rPr>
-        <w:t>Windsnelheid</w:t>
-      </w:r>
-      <w:r>
-        <w:rPr>
-          <w:sz w:val="20"/>
-          <w:szCs w:val="20"/>
-        </w:rPr>
-        <w:tab/>
-      </w:r>
-      <w:r>
-        <w:rPr>
-          <w:sz w:val="20"/>
-          <w:szCs w:val="20"/>
-        </w:rPr>
-        <w:tab/>
-      </w:r>
-      <w:proofErr w:type="gramStart"/>
-      <w:r>
-        <w:rPr>
-          <w:sz w:val="20"/>
-          <w:szCs w:val="20"/>
-        </w:rPr>
-        <w:t>{{ panel</w:t>
-      </w:r>
-      <w:proofErr w:type="gramEnd"/>
-      <w:r>
-        <w:rPr>
-          <w:sz w:val="20"/>
-          <w:szCs w:val="20"/>
-        </w:rPr>
-        <w:t>.</w:t>
-      </w:r>
-      <w:proofErr w:type="gramStart"/>
-      <w:r>
-        <w:rPr>
-          <w:sz w:val="20"/>
-          <w:szCs w:val="20"/>
-        </w:rPr>
-        <w:t>windsnelheid }</w:t>
-      </w:r>
-      <w:proofErr w:type="gramEnd"/>
-      <w:r>
-        <w:rPr>
-          <w:sz w:val="20"/>
-          <w:szCs w:val="20"/>
-        </w:rPr>
-        <w:t>}</w:t>
-      </w:r>
-    </w:p>
-    <w:p>
-      <w:pPr>
-        <w:spacing w:after="0"/>
-        <w:rPr>
-          <w:sz w:val="20"/>
-          <w:szCs w:val="20"/>
-        </w:rPr>
-      </w:pPr>
-      <w:r>
-        <w:rPr>
-          <w:noProof/>
-          <w:sz w:val="20"/>
-          <w:szCs w:val="20"/>
-        </w:rPr>
-        <mc:AlternateContent>
-          <mc:Choice Requires="wps">
-            <w:drawing>
-              <wp:anchor distT="0" distB="0" distL="114300" distR="114300" simplePos="0" relativeHeight="251661317" behindDoc="0" locked="0" layoutInCell="1" allowOverlap="1" wp14:anchorId="5417CE70" wp14:editId="305793CD">
-                <wp:simplePos x="0" y="0"/>
-                <wp:positionH relativeFrom="column">
-                  <wp:posOffset>3874011</wp:posOffset>
-                </wp:positionH>
-                <wp:positionV relativeFrom="paragraph">
-                  <wp:posOffset>61854</wp:posOffset>
-                </wp:positionV>
-                <wp:extent cx="70338" cy="45719"/>
-                <wp:effectExtent l="0" t="0" r="25400" b="12065"/>
-                <wp:wrapNone/>
-                <wp:docPr id="882155381" name="Rechthoek 15"/>
-                <wp:cNvGraphicFramePr/>
-                <a:graphic xmlns:a="http://schemas.openxmlformats.org/drawingml/2006/main">
-                  <a:graphicData uri="http://schemas.microsoft.com/office/word/2010/wordprocessingShape">
-                    <wps:wsp>
-                      <wps:cNvSpPr/>
-                      <wps:spPr>
-                        <a:xfrm>
-                          <a:off x="0" y="0"/>
-                          <a:ext cx="70338" cy="45719"/>
-                        </a:xfrm>
-                        <a:prstGeom prst="rect">
-                          <a:avLst/>
-                        </a:prstGeom>
-                        <a:solidFill>
-                          <a:srgbClr val="EE0000"/>
-                        </a:solidFill>
-                        <a:ln>
-                          <a:solidFill>
-                            <a:srgbClr val="EE0000"/>
-                          </a:solidFill>
-                        </a:ln>
-                      </wps:spPr>
-                      <wps:style>
-                        <a:lnRef idx="2">
-                          <a:schemeClr val="accent1">
-                            <a:shade val="15000"/>
-                          </a:schemeClr>
-                        </a:lnRef>
-                        <a:fillRef idx="1">
-                          <a:schemeClr val="accent1"/>
-                        </a:fillRef>
-                        <a:effectRef idx="0">
-                          <a:schemeClr val="accent1"/>
-                        </a:effectRef>
-                        <a:fontRef idx="minor">
-                          <a:schemeClr val="lt1"/>
-                        </a:fontRef>
-                      </wps:style>
-                      <wps:bodyPr rot="0" spcFirstLastPara="0" vertOverflow="overflow" horzOverflow="overflow" vert="horz" wrap="square" lIns="91440" tIns="45720" rIns="91440" bIns="45720" numCol="1" spcCol="0" rtlCol="0" fromWordArt="0" anchor="ctr" anchorCtr="0" forceAA="0" compatLnSpc="1">
-                        <a:prstTxWarp prst="textNoShape">
-                          <a:avLst/>
-                        </a:prstTxWarp>
-                        <a:noAutofit/>
-                      </wps:bodyPr>
-                    </wps:wsp>
-                  </a:graphicData>
-                </a:graphic>
-                <wp14:sizeRelH relativeFrom="margin">
-                  <wp14:pctWidth>0</wp14:pctWidth>
-                </wp14:sizeRelH>
-                <wp14:sizeRelV relativeFrom="margin">
-                  <wp14:pctHeight>0</wp14:pctHeight>
-                </wp14:sizeRelV>
-              </wp:anchor>
-            </w:drawing>
-          </mc:Choice>
-          <mc:Fallback xmlns="">
-            <w:pict>
-              <v:rect w14:anchorId="4E1B8920" id="Rechthoek 15" o:spid="_x0000_s1026" style="position:absolute;margin-left:305.05pt;margin-top:4.85pt;width:5.55pt;height:3.6pt;z-index:251661317;visibility:visible;mso-wrap-style:square;mso-width-percent:0;mso-height-percent:0;mso-wrap-distance-left:9pt;mso-wrap-distance-top:0;mso-wrap-distance-right:9pt;mso-wrap-distance-bottom:0;mso-position-horizontal:absolute;mso-position-horizontal-relative:text;mso-position-vertical:absolute;mso-position-vertical-relative:text;mso-width-percent:0;mso-height-percent:0;mso-width-relative:margin;mso-height-relative:margin;v-text-anchor:middle" o:gfxdata="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" fillcolor="#e00" strokecolor="#e00" strokeweight="1pt"/>
-            </w:pict>
-          </mc:Fallback>
-        </mc:AlternateContent>
-      </w:r>
-      <w:r>
-        <w:rPr>
-          <w:sz w:val="20"/>
-          <w:szCs w:val="20"/>
-        </w:rPr>
-        <w:t>Instraling</w:t>
-      </w:r>
-      <w:r>
-        <w:rPr>
-          <w:sz w:val="20"/>
-          <w:szCs w:val="20"/>
-        </w:rPr>
-        <w:tab/>
-      </w:r>
-      <w:r>
-        <w:rPr>
-          <w:sz w:val="20"/>
-          <w:szCs w:val="20"/>
-        </w:rPr>
-        <w:tab/>
-      </w:r>
-      <w:proofErr w:type="gramStart"/>
-      <w:r>
-        <w:rPr>
-          <w:sz w:val="20"/>
-          <w:szCs w:val="20"/>
-        </w:rPr>
-        <w:t xml:space="preserve">{{ </w:t>
-      </w:r>
-      <w:proofErr w:type="spellStart"/>
-      <w:r>
-        <w:rPr>
-          <w:sz w:val="20"/>
-          <w:szCs w:val="20"/>
-        </w:rPr>
-        <w:t>panel</w:t>
-      </w:r>
-      <w:proofErr w:type="gramEnd"/>
-      <w:r>
-        <w:rPr>
-          <w:sz w:val="20"/>
-          <w:szCs w:val="20"/>
-        </w:rPr>
-        <w:t>.</w:t>
-      </w:r>
-      <w:proofErr w:type="gramStart"/>
-      <w:r>
-        <w:rPr>
-          <w:sz w:val="20"/>
-          <w:szCs w:val="20"/>
-        </w:rPr>
-        <w:t>instraling</w:t>
-      </w:r>
-      <w:proofErr w:type="spellEnd"/>
-      <w:r>
-        <w:rPr>
-          <w:sz w:val="20"/>
-          <w:szCs w:val="20"/>
-        </w:rPr>
-        <w:t xml:space="preserve"> }</w:t>
-      </w:r>
-      <w:proofErr w:type="gramEnd"/>
-      <w:r>
-        <w:rPr>
-          <w:sz w:val="20"/>
-          <w:szCs w:val="20"/>
-        </w:rPr>
-        <w:t>}</w:t>
-      </w:r>
-      <w:r>
-        <w:rPr>
-          <w:sz w:val="20"/>
-          <w:szCs w:val="20"/>
-        </w:rPr>
-        <w:tab/>
-      </w:r>
-      <w:r>
-        <w:rPr>
-          <w:sz w:val="20"/>
-          <w:szCs w:val="20"/>
-        </w:rPr>
-        <w:tab/>
-      </w:r>
-      <w:r>
-        <w:rPr>
-          <w:sz w:val="20"/>
-          <w:szCs w:val="20"/>
-        </w:rPr>
-        <w:tab/>
-      </w:r>
-      <w:r>
-        <w:rPr>
-          <w:sz w:val="20"/>
-          <w:szCs w:val="20"/>
-        </w:rPr>
-        <w:tab/>
-      </w:r>
-    </w:p>
-    <w:p>
-      <w:pPr>
-        <w:spacing w:after="0"/>
-        <w:rPr>
-          <w:sz w:val="20"/>
-          <w:szCs w:val="20"/>
-          <w:lang w:val="en-GB"/>
-        </w:rPr>
-      </w:pPr>
-      <w:r>
-        <w:rPr>
-          <w:sz w:val="20"/>
-          <w:szCs w:val="20"/>
-          <w:lang w:val="en-GB"/>
-        </w:rPr>
-        <w:t>Drone / Camera</w:t>
-      </w:r>
-      <w:r>
-        <w:rPr>
-          <w:sz w:val="20"/>
-          <w:szCs w:val="20"/>
-          <w:lang w:val="en-GB"/>
-        </w:rPr>
-        <w:tab/>
-      </w:r>
-      <w:r>
-        <w:rPr>
-          <w:sz w:val="20"/>
-          <w:szCs w:val="20"/>
-          <w:lang w:val="en-GB"/>
-        </w:rPr>
-        <w:tab/>
-      </w:r>
-      <w:proofErr w:type="gramStart"/>
-      <w:r>
-        <w:rPr>
-          <w:sz w:val="20"/>
-          <w:szCs w:val="20"/>
-          <w:lang w:val="en-GB"/>
-        </w:rPr>
-        <w:t xml:space="preserve">{{ </w:t>
-      </w:r>
-      <w:proofErr w:type="spellStart"/>
-      <w:r>
-        <w:rPr>
-          <w:sz w:val="20"/>
-          <w:szCs w:val="20"/>
-          <w:lang w:val="en-GB"/>
-        </w:rPr>
-        <w:t>panel</w:t>
-      </w:r>
-      <w:proofErr w:type="gramEnd"/>
-      <w:r>
-        <w:rPr>
-          <w:sz w:val="20"/>
-          <w:szCs w:val="20"/>
-          <w:lang w:val="en-GB"/>
-        </w:rPr>
-        <w:t>.drone_</w:t>
-      </w:r>
-      <w:proofErr w:type="gramStart"/>
-      <w:r>
-        <w:rPr>
-          <w:sz w:val="20"/>
-          <w:szCs w:val="20"/>
-          <w:lang w:val="en-GB"/>
-        </w:rPr>
-        <w:t>camera</w:t>
-      </w:r>
-      <w:proofErr w:type="spellEnd"/>
-      <w:r>
-        <w:rPr>
-          <w:sz w:val="20"/>
-          <w:szCs w:val="20"/>
-          <w:lang w:val="en-GB"/>
-        </w:rPr>
-        <w:t xml:space="preserve"> }</w:t>
-      </w:r>
-      <w:proofErr w:type="gramEnd"/>
-      <w:r>
-        <w:rPr>
-          <w:sz w:val="20"/>
-          <w:szCs w:val="20"/>
-          <w:lang w:val="en-GB"/>
-        </w:rPr>
-        <w:t>}</w:t>
-      </w:r>
-      <w:r>
-        <w:rPr>
-          <w:sz w:val="20"/>
-          <w:szCs w:val="20"/>
-          <w:lang w:val="en-GB"/>
-        </w:rPr>
-        <w:tab/>
-      </w:r>
-      <w:r>
-        <w:rPr>
-          <w:sz w:val="20"/>
-          <w:szCs w:val="20"/>
-          <w:lang w:val="en-GB"/>
-        </w:rPr>
-        <w:tab/>
-      </w:r>
-      <w:r>
-        <w:rPr>
-          <w:sz w:val="20"/>
-          <w:szCs w:val="20"/>
-          <w:lang w:val="en-GB"/>
-        </w:rPr>
-        <w:tab/>
-      </w:r>
-    </w:p>
-    <w:p>
-      <w:pPr>
-        <w:spacing w:after="0"/>
-        <w:rPr>
-          <w:sz w:val="20"/>
-          <w:szCs w:val="20"/>
-          <w:lang w:val="en-GB"/>
-        </w:rPr>
-      </w:pPr>
-    </w:p>
-    <w:p>
-      <w:pPr>
-        <w:spacing w:after="0"/>
-        <w:rPr>
-          <w:b/>
-          <w:bCs/>
-          <w:sz w:val="20"/>
-          <w:szCs w:val="20"/>
-        </w:rPr>
-      </w:pPr>
-      <w:r>
-        <w:rPr>
-          <w:b/>
-          <w:bCs/>
-          <w:sz w:val="20"/>
-          <w:szCs w:val="20"/>
-        </w:rPr>
-        <w:t>Thermische meetresultaten</w:t>
-      </w:r>
-      <w:r>
-        <w:rPr>
-          <w:b/>
-          <w:bCs/>
-          <w:sz w:val="20"/>
-          <w:szCs w:val="20"/>
-        </w:rPr>
-        <w:tab/>
-      </w:r>
-      <w:r>
-        <w:rPr>
-          <w:b/>
-          <w:bCs/>
-          <w:sz w:val="20"/>
-          <w:szCs w:val="20"/>
-        </w:rPr>
-        <w:tab/>
-      </w:r>
-      <w:r>
-        <w:rPr>
-          <w:b/>
-          <w:bCs/>
-          <w:sz w:val="20"/>
-          <w:szCs w:val="20"/>
-        </w:rPr>
-        <w:tab/>
-      </w:r>
-      <w:r>
-        <w:rPr>
-          <w:b/>
-          <w:bCs/>
-          <w:sz w:val="20"/>
-          <w:szCs w:val="20"/>
-        </w:rPr>
-        <w:tab/>
-      </w:r>
-      <w:r>
-        <w:rPr>
-          <w:b/>
-          <w:bCs/>
-          <w:sz w:val="20"/>
-          <w:szCs w:val="20"/>
-        </w:rPr>
-        <w:tab/>
-      </w:r>
-    </w:p>
-    <w:p>
-      <w:pPr>
-        <w:spacing w:after="0"/>
-        <w:rPr>
-          <w:sz w:val="20"/>
-          <w:szCs w:val="20"/>
-        </w:rPr>
-      </w:pPr>
-      <w:r>
-        <w:rPr>
-          <w:sz w:val="20"/>
-          <w:szCs w:val="20"/>
-        </w:rPr>
-        <w:t>Gemiddelde paneeltemp.</w:t>
-      </w:r>
-      <w:r>
-        <w:rPr>
-          <w:sz w:val="20"/>
-          <w:szCs w:val="20"/>
-        </w:rPr>
-        <w:tab/>
-      </w:r>
-      <w:r>
-        <w:rPr>
-          <w:sz w:val="20"/>
-          <w:szCs w:val="20"/>
-        </w:rPr>
-        <w:tab/>
-      </w:r>
-      <w:proofErr w:type="gramStart"/>
-      <w:r>
-        <w:rPr>
-          <w:sz w:val="20"/>
-          <w:szCs w:val="20"/>
-        </w:rPr>
-        <w:t>{{ panel.gem</w:t>
-      </w:r>
-      <w:proofErr w:type="gramEnd"/>
-      <w:r>
-        <w:rPr>
-          <w:sz w:val="20"/>
-          <w:szCs w:val="20"/>
-        </w:rPr>
-        <w:t>_</w:t>
-      </w:r>
-      <w:proofErr w:type="gramStart"/>
-      <w:r>
-        <w:rPr>
-          <w:sz w:val="20"/>
-          <w:szCs w:val="20"/>
-        </w:rPr>
-        <w:t>paneeltemp }</w:t>
-      </w:r>
-      <w:proofErr w:type="gramEnd"/>
-      <w:r>
-        <w:rPr>
-          <w:sz w:val="20"/>
-          <w:szCs w:val="20"/>
-        </w:rPr>
-        <w:t>}</w:t>
-      </w:r>
-    </w:p>
-    <w:p>
-      <w:pPr>
-        <w:spacing w:after="0"/>
-        <w:rPr>
-          <w:sz w:val="20"/>
-          <w:szCs w:val="20"/>
-        </w:rPr>
-      </w:pPr>
-      <w:r>
-        <w:rPr>
-          <w:sz w:val="20"/>
-          <w:szCs w:val="20"/>
-        </w:rPr>
-        <w:t>Maximale temperatuur</w:t>
-      </w:r>
-      <w:r>
-        <w:rPr>
-          <w:sz w:val="20"/>
-          <w:szCs w:val="20"/>
-        </w:rPr>
-        <w:tab/>
-      </w:r>
-      <w:r>
-        <w:rPr>
-          <w:sz w:val="20"/>
-          <w:szCs w:val="20"/>
-        </w:rPr>
-        <w:tab/>
-      </w:r>
-      <w:proofErr w:type="gramStart"/>
-      <w:r>
-        <w:rPr>
-          <w:sz w:val="20"/>
-          <w:szCs w:val="20"/>
-        </w:rPr>
-        <w:t>{{ panel.max</w:t>
-      </w:r>
-      <w:proofErr w:type="gramEnd"/>
-      <w:r>
-        <w:rPr>
-          <w:sz w:val="20"/>
-          <w:szCs w:val="20"/>
-        </w:rPr>
-        <w:t>_</w:t>
-      </w:r>
-      <w:proofErr w:type="gramStart"/>
-      <w:r>
-        <w:rPr>
-          <w:sz w:val="20"/>
-          <w:szCs w:val="20"/>
-        </w:rPr>
-        <w:t>temperatuur }</w:t>
-      </w:r>
-      <w:proofErr w:type="gramEnd"/>
-      <w:r>
-        <w:rPr>
-          <w:sz w:val="20"/>
-          <w:szCs w:val="20"/>
-        </w:rPr>
-        <w:t>}</w:t>
-      </w:r>
-    </w:p>
-    <w:p>
-      <w:pPr>
-        <w:spacing w:after="0"/>
-        <w:rPr>
-          <w:sz w:val="20"/>
-          <w:szCs w:val="20"/>
-        </w:rPr>
-      </w:pPr>
-      <w:r>
-        <w:rPr>
-          <w:sz w:val="20"/>
-          <w:szCs w:val="20"/>
-        </w:rPr>
-        <w:t>Minimale temperatuur</w:t>
-      </w:r>
-      <w:r>
-        <w:rPr>
-          <w:sz w:val="20"/>
-          <w:szCs w:val="20"/>
-        </w:rPr>
-        <w:tab/>
-      </w:r>
-      <w:r>
-        <w:rPr>
-          <w:sz w:val="20"/>
-          <w:szCs w:val="20"/>
-        </w:rPr>
-        <w:tab/>
-      </w:r>
-      <w:proofErr w:type="gramStart"/>
-      <w:r>
-        <w:rPr>
-          <w:sz w:val="20"/>
-          <w:szCs w:val="20"/>
-        </w:rPr>
-        <w:t>{{ panel.min</w:t>
-      </w:r>
-      <w:proofErr w:type="gramEnd"/>
-      <w:r>
-        <w:rPr>
-          <w:sz w:val="20"/>
-          <w:szCs w:val="20"/>
-        </w:rPr>
-        <w:t>_</w:t>
-      </w:r>
-      <w:proofErr w:type="gramStart"/>
-      <w:r>
-        <w:rPr>
-          <w:sz w:val="20"/>
-          <w:szCs w:val="20"/>
-        </w:rPr>
-        <w:t>temperatuur }</w:t>
-      </w:r>
-      <w:proofErr w:type="gramEnd"/>
-      <w:r>
-        <w:rPr>
-          <w:sz w:val="20"/>
-          <w:szCs w:val="20"/>
-        </w:rPr>
-        <w:t>}</w:t>
-      </w:r>
-      <w:r>
-        <w:rPr>
-          <w:sz w:val="20"/>
-          <w:szCs w:val="20"/>
-        </w:rPr>
-        <w:tab/>
-      </w:r>
-      <w:r>
-        <w:rPr>
-          <w:sz w:val="20"/>
-          <w:szCs w:val="20"/>
-        </w:rPr>
-        <w:tab/>
-      </w:r>
-      <w:r>
-        <w:rPr>
-          <w:sz w:val="20"/>
-          <w:szCs w:val="20"/>
-        </w:rPr>
-        <w:tab/>
-      </w:r>
-      <w:r>
-        <w:rPr>
-          <w:sz w:val="20"/>
-          <w:szCs w:val="20"/>
-        </w:rPr>
-        <w:tab/>
-      </w:r>
-    </w:p>
-    <w:p>
-      <w:pPr>
-        <w:spacing w:after="0"/>
-        <w:rPr>
-          <w:sz w:val="20"/>
-          <w:szCs w:val="20"/>
-        </w:rPr>
-      </w:pPr>
-      <w:r>
-        <w:rPr>
-          <w:sz w:val="20"/>
-          <w:szCs w:val="20"/>
-        </w:rPr>
-        <w:t xml:space="preserve">Temperatuurverschil </w:t>
-      </w:r>
-      <w:r>
-        <w:rPr>
-          <w:sz w:val="20"/>
-          <w:szCs w:val="20"/>
-          <w:lang w:val="en-GB"/>
-        </w:rPr>
-        <w:t>Δ</w:t>
-      </w:r>
-      <w:r>
-        <w:rPr>
-          <w:sz w:val="20"/>
-          <w:szCs w:val="20"/>
-        </w:rPr>
-        <w:t>T</w:t>
-      </w:r>
-      <w:r>
-        <w:rPr>
-          <w:sz w:val="20"/>
-          <w:szCs w:val="20"/>
-        </w:rPr>
-        <w:tab/>
-      </w:r>
-      <w:r>
-        <w:rPr>
-          <w:sz w:val="20"/>
-          <w:szCs w:val="20"/>
-        </w:rPr>
-        <w:tab/>
-      </w:r>
-      <w:proofErr w:type="gramStart"/>
-      <w:r>
-        <w:rPr>
-          <w:sz w:val="20"/>
-          <w:szCs w:val="20"/>
-        </w:rPr>
-        <w:t>{{ panel</w:t>
-      </w:r>
-      <w:proofErr w:type="gramEnd"/>
-      <w:r>
-        <w:rPr>
-          <w:sz w:val="20"/>
-          <w:szCs w:val="20"/>
-        </w:rPr>
-        <w:t>.</w:t>
-      </w:r>
-      <w:proofErr w:type="gramStart"/>
-      <w:r>
-        <w:rPr>
-          <w:sz w:val="20"/>
-          <w:szCs w:val="20"/>
-        </w:rPr>
-        <w:t>temperatuurverschil }}</w:t>
-      </w:r>
-      <w:r>
-        <w:rPr>
-          <w:sz w:val="20"/>
-          <w:szCs w:val="20"/>
-        </w:rPr>
-        <w:tab/>
-      </w:r>
-      <w:proofErr w:type="gramEnd"/>
-      <w:r>
-        <w:rPr>
-          <w:sz w:val="20"/>
-          <w:szCs w:val="20"/>
-        </w:rPr>
-        <w:tab/>
-      </w:r>
-      <w:r>
-        <w:rPr>
-          <w:sz w:val="20"/>
-          <w:szCs w:val="20"/>
-        </w:rPr>
-        <w:tab/>
-      </w:r>
-      <w:r>
-        <w:rPr>
-          <w:sz w:val="20"/>
-          <w:szCs w:val="20"/>
-        </w:rPr>
-        <w:tab/>
-      </w:r>
-      <w:r>
-        <w:rPr>
-          <w:i/>
-          <w:iCs/>
-          <w:sz w:val="20"/>
-          <w:szCs w:val="20"/>
-        </w:rPr>
-        <w:t>l</w:t>
-      </w:r>
-      <w:r>
-        <w:rPr>
-          <w:i/>
-          <w:iCs/>
-          <w:sz w:val="20"/>
-          <w:szCs w:val="20"/>
-        </w:rPr>
-        <w:t>ocatie paneel</w:t>
-      </w:r>
-    </w:p>
-    <w:p>
-      <w:pPr>
-        <w:spacing w:after="0"/>
-      </w:pPr>
-    </w:p>
-    <w:p>
-      <w:pPr>
-        <w:spacing w:after="0"/>
-      </w:pPr>
-      <w:r>
-        <w:rPr>
-          <w:noProof/>
-        </w:rPr>
-        <w:t>{{ panel.normaal_foto }}</w:t>
-      </w:r>
-      <w:r>
-        <w:tab/>
-      </w:r>
-      <w:r>
-        <w:tab/>
-      </w:r>
-      <w:r>
-        <w:tab/>
-      </w:r>
-      <w:r>
-        <w:tab/>
-      </w:r>
-      <w:r>
-        <w:tab/>
-      </w:r>
-      <w:r>
-        <w:rPr>
-          <w:noProof/>
-        </w:rPr>
-        <w:t>{{ panel.thermisch_foto }}</w:t>
-      </w:r>
-    </w:p>
-    <w:p>
-      <w:pPr>
-        <w:spacing w:after="0"/>
-      </w:pPr>
-    </w:p>
+    <w:tbl>
+      <w:tblPr>
+        <w:tblW w:w="9922" w:type="dxa"/>
+        <w:tblBorders>
+          <w:top w:val="none" w:sz="0" w:space="0" w:color="auto"/>
+          <w:left w:val="none" w:sz="0" w:space="0" w:color="auto"/>
+          <w:bottom w:val="none" w:sz="0" w:space="0" w:color="auto"/>
+          <w:right w:val="none" w:sz="0" w:space="0" w:color="auto"/>
+          <w:insideH w:val="none" w:sz="0" w:space="0" w:color="auto"/>
+          <w:insideV w:val="none" w:sz="0" w:space="0" w:color="auto"/>
+        </w:tblBorders>
+      </w:tblPr>
+      <w:tblGrid>
+        <w:gridCol w:w="4961"/>
+        <w:gridCol w:w="4961"/>
+      </w:tblGrid>
+      <w:tr>
+        <w:tc>
+          <w:tcPr>
+            <w:tcW w:w="4961" w:type="dxa"/>
+          </w:tcPr>
+          <w:p>
+            <w:pPr>
+              <w:spacing w:after="0"/>
+              <w:rPr>
+                <w:sz w:val="20"/>
+                <w:szCs w:val="20"/>
+              </w:rPr>
+            </w:pPr>
+            <w:r>
+              <w:rPr>
+                <w:sz w:val="20"/>
+                <w:szCs w:val="20"/>
+              </w:rPr>
+              <w:t>{{ panel.thermisch_foto }}</w:t>
+            </w:r>
+          </w:p>
+        </w:tc>
+        <w:tc>
+          <w:tcPr>
+            <w:tcW w:w="4961" w:type="dxa"/>
+          </w:tcPr>
+          <w:p>
+            <w:pPr>
+              <w:spacing w:after="0"/>
+              <w:rPr>
+                <w:sz w:val="20"/>
+                <w:szCs w:val="20"/>
+              </w:rPr>
+            </w:pPr>
+            <w:r>
+              <w:rPr>
+                <w:sz w:val="20"/>
+                <w:szCs w:val="20"/>
+              </w:rPr>
+              <w:t>{{ panel.normaal_foto }}</w:t>
+            </w:r>
+          </w:p>
+        </w:tc>
+      </w:tr>
+    </w:tbl>
+    <w:p/>
     <w:p>
       <w:pPr>
         <w:spacing w:after="0"/>
@@ -2208,53 +1346,12 @@
           <w:szCs w:val="20"/>
         </w:rPr>
       </w:pPr>
-      <w:proofErr w:type="gramStart"/>
       <w:r>
         <w:rPr>
           <w:sz w:val="20"/>
           <w:szCs w:val="20"/>
         </w:rPr>
-        <w:t xml:space="preserve">{{ </w:t>
-      </w:r>
-      <w:proofErr w:type="spellStart"/>
-      <w:r>
-        <w:rPr>
-          <w:sz w:val="20"/>
-          <w:szCs w:val="20"/>
-        </w:rPr>
-        <w:t>panel</w:t>
-      </w:r>
-      <w:proofErr w:type="gramEnd"/>
-      <w:r>
-        <w:rPr>
-          <w:sz w:val="20"/>
-          <w:szCs w:val="20"/>
-        </w:rPr>
-        <w:t>.</w:t>
-      </w:r>
-      <w:proofErr w:type="gramStart"/>
-      <w:r>
-        <w:rPr>
-          <w:sz w:val="20"/>
-          <w:szCs w:val="20"/>
-        </w:rPr>
-        <w:t>bevindingen</w:t>
-      </w:r>
-      <w:proofErr w:type="spellEnd"/>
-      <w:r>
-        <w:rPr>
-          <w:sz w:val="20"/>
-          <w:szCs w:val="20"/>
-        </w:rPr>
-        <w:t xml:space="preserve"> }</w:t>
-      </w:r>
-      <w:proofErr w:type="gramEnd"/>
-      <w:r>
-        <w:rPr>
-          <w:sz w:val="20"/>
-          <w:szCs w:val="20"/>
-        </w:rPr>
-        <w:t>}</w:t>
+        <w:t>{{ panel.bevindingen }}</w:t>
       </w:r>
     </w:p>
     <w:p>
@@ -2303,37 +1400,12 @@
           <w:szCs w:val="20"/>
         </w:rPr>
       </w:pPr>
-      <w:proofErr w:type="gramStart"/>
       <w:r>
         <w:rPr>
           <w:sz w:val="20"/>
           <w:szCs w:val="20"/>
         </w:rPr>
-        <w:t>{{ panel</w:t>
-      </w:r>
-      <w:proofErr w:type="gramEnd"/>
-      <w:r>
-        <w:rPr>
-          <w:sz w:val="20"/>
-          <w:szCs w:val="20"/>
-        </w:rPr>
-        <w:t>.</w:t>
-      </w:r>
-      <w:proofErr w:type="gramStart"/>
-      <w:r>
-        <w:rPr>
-          <w:sz w:val="20"/>
-          <w:szCs w:val="20"/>
-        </w:rPr>
-        <w:t>conclusie }</w:t>
-      </w:r>
-      <w:proofErr w:type="gramEnd"/>
-      <w:r>
-        <w:rPr>
-          <w:sz w:val="20"/>
-          <w:szCs w:val="20"/>
-        </w:rPr>
-        <w:t>}</w:t>
+        <w:t>{{ panel.conclusie }}</w:t>
       </w:r>
     </w:p>
     <w:p>
@@ -2365,7 +1437,6 @@
           <w:lang w:val="en-US"/>
         </w:rPr>
       </w:pPr>
-      <w:proofErr w:type="spellStart"/>
       <w:r>
         <w:rPr>
           <w:b/>
@@ -2376,7 +1447,6 @@
         </w:rPr>
         <w:t>Advies</w:t>
       </w:r>
-      <w:proofErr w:type="spellEnd"/>
     </w:p>
     <w:p>
       <w:pPr>
@@ -2387,59 +1457,13 @@
           <w:lang w:val="en-US"/>
         </w:rPr>
       </w:pPr>
-      <w:proofErr w:type="gramStart"/>
       <w:r>
         <w:rPr>
           <w:sz w:val="20"/>
           <w:szCs w:val="20"/>
           <w:lang w:val="en-US"/>
         </w:rPr>
-        <w:t xml:space="preserve">{{ </w:t>
-      </w:r>
-      <w:proofErr w:type="spellStart"/>
-      <w:r>
-        <w:rPr>
-          <w:sz w:val="20"/>
-          <w:szCs w:val="20"/>
-          <w:lang w:val="en-US"/>
-        </w:rPr>
-        <w:t>panel</w:t>
-      </w:r>
-      <w:proofErr w:type="gramEnd"/>
-      <w:r>
-        <w:rPr>
-          <w:sz w:val="20"/>
-          <w:szCs w:val="20"/>
-          <w:lang w:val="en-US"/>
-        </w:rPr>
-        <w:t>.</w:t>
-      </w:r>
-      <w:proofErr w:type="gramStart"/>
-      <w:r>
-        <w:rPr>
-          <w:sz w:val="20"/>
-          <w:szCs w:val="20"/>
-          <w:lang w:val="en-US"/>
-        </w:rPr>
-        <w:t>advies</w:t>
-      </w:r>
-      <w:proofErr w:type="spellEnd"/>
-      <w:r>
-        <w:rPr>
-          <w:sz w:val="20"/>
-          <w:szCs w:val="20"/>
-          <w:lang w:val="en-US"/>
-        </w:rPr>
-        <w:t xml:space="preserve"> }</w:t>
-      </w:r>
-      <w:proofErr w:type="gramEnd"/>
-      <w:r>
-        <w:rPr>
-          <w:sz w:val="20"/>
-          <w:szCs w:val="20"/>
-          <w:lang w:val="en-US"/>
-        </w:rPr>
-        <w:t>}</w:t>
+        <w:t>{{ panel.advies }}</w:t>
       </w:r>
       <w:bookmarkEnd w:id="0"/>
     </w:p>
@@ -2453,23 +1477,7 @@
         <w:rPr>
           <w:lang w:val="en-US"/>
         </w:rPr>
-        <w:t xml:space="preserve">{%p if not </w:t>
-      </w:r>
-      <w:proofErr w:type="spellStart"/>
-      <w:proofErr w:type="gramStart"/>
-      <w:r>
-        <w:rPr>
-          <w:lang w:val="en-US"/>
-        </w:rPr>
-        <w:t>loop.last</w:t>
-      </w:r>
-      <w:proofErr w:type="spellEnd"/>
-      <w:proofErr w:type="gramEnd"/>
-      <w:r>
-        <w:rPr>
-          <w:lang w:val="en-US"/>
-        </w:rPr>
-        <w:t xml:space="preserve"> %}</w:t>
+        <w:t>{%p if not loop.last %}</w:t>
       </w:r>
     </w:p>
     <w:p>
@@ -2488,15 +1496,7 @@
     <w:p>
       <w:r>
         <w:lastRenderedPageBreak/>
-        <w:t xml:space="preserve">{%p </w:t>
-      </w:r>
-      <w:proofErr w:type="spellStart"/>
-      <w:r>
-        <w:t>endif</w:t>
-      </w:r>
-      <w:proofErr w:type="spellEnd"/>
-      <w:r>
-        <w:t xml:space="preserve"> %}</w:t>
+        <w:t>{%p endif %}</w:t>
       </w:r>
     </w:p>
     <w:p>
@@ -2505,11 +1505,11 @@
       </w:r>
     </w:p>
     <w:sectPr>
-      <w:headerReference w:type="even" r:id="rId13"/>
-      <w:headerReference w:type="default" r:id="rId14"/>
-      <w:footerReference w:type="default" r:id="rId15"/>
-      <w:headerReference w:type="first" r:id="rId16"/>
-      <w:footerReference w:type="first" r:id="rId17"/>
+      <w:headerReference w:type="even" r:id="rId11"/>
+      <w:headerReference w:type="default" r:id="rId12"/>
+      <w:footerReference w:type="default" r:id="rId13"/>
+      <w:headerReference w:type="first" r:id="rId14"/>
+      <w:footerReference w:type="first" r:id="rId15"/>
       <w:pgSz w:w="11906" w:h="16838"/>
       <w:pgMar w:top="284" w:right="992" w:bottom="1135" w:left="992" w:header="680" w:footer="709" w:gutter="0"/>
       <w:cols w:space="708"/>
@@ -2723,7 +1723,7 @@
         <w:sz w:val="18"/>
         <w:szCs w:val="18"/>
       </w:rPr>
-      <w:t>24 juni 2026</w:t>
+      <w:t>25 juni 2026</w:t>
     </w:r>
     <w:r>
       <w:rPr>
@@ -2931,7 +1931,7 @@
               <v:stroke joinstyle="miter"/>
               <v:path gradientshapeok="t" o:connecttype="rect"/>
             </v:shapetype>
-            <v:shape id="Tekstvak 1" o:spid="_x0000_s1028" type="#_x0000_t202" style="position:absolute;margin-left:-6.05pt;margin-top:-7.7pt;width:345.75pt;height:51pt;z-index:251658240;visibility:visible;mso-wrap-style:square;mso-width-percent:0;mso-height-percent:0;mso-wrap-distance-left:9pt;mso-wrap-distance-top:0;mso-wrap-distance-right:9pt;mso-wrap-distance-bottom:0;mso-position-horizontal:absolute;mso-position-horizontal-relative:text;mso-position-vertical:absolute;mso-position-vertical-relative:text;mso-width-percent:0;mso-height-percent:0;mso-width-relative:margin;mso-height-relative:margin;v-text-anchor:top" o:gfxdata="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" filled="f" stroked="f" strokeweight=".5pt">
+            <v:shape id="Tekstvak 1" o:spid="_x0000_s1028" type="#_x0000_t202" style="position:absolute;margin-left:-6.05pt;margin-top:-7.7pt;width:345.75pt;height:51pt;z-index:251658240;visibility:visible;mso-wrap-style:square;mso-width-percent:0;mso-height-percent:0;mso-wrap-distance-left:9pt;mso-wrap-distance-top:0;mso-wrap-distance-right:9pt;mso-wrap-distance-bottom:0;mso-position-horizontal:absolute;mso-position-horizontal-relative:text;mso-position-vertical:absolute;mso-position-vertical-relative:text;mso-width-percent:0;mso-height-percent:0;mso-width-relative:margin;mso-height-relative:margin;v-text-anchor:top" o:gfxdata="UEsDBBQABgAIAAAAIQC2gziS/gAAAOEBAAATAAAAW0NvbnRlbnRfVHlwZXNdLnhtbJSRQU7DMBBF 90jcwfIWJU67QAgl6YK0S0CoHGBkTxKLZGx5TGhvj5O2G0SRWNoz/78nu9wcxkFMGNg6quQqL6RA 0s5Y6ir5vt9lD1JwBDIwOMJKHpHlpr69KfdHjyxSmriSfYz+USnWPY7AufNIadK6MEJMx9ApD/oD OlTrorhX2lFEilmcO2RdNtjC5xDF9pCuTyYBB5bi6bQ4syoJ3g9WQ0ymaiLzg5KdCXlKLjvcW893 SUOqXwnz5DrgnHtJTxOsQfEKIT7DmDSUCaxw7Rqn8787ZsmRM9e2VmPeBN4uqYvTtW7jvijg9N/y JsXecLq0q+WD6m8AAAD//wMAUEsDBBQABgAIAAAAIQA4/SH/1gAAAJQBAAALAAAAX3JlbHMvLnJl bHOkkMFqwzAMhu+DvYPRfXGawxijTi+j0GvpHsDYimMaW0Yy2fr2M4PBMnrbUb/Q94l/f/hMi1qR JVI2sOt6UJgd+ZiDgffL8ekFlFSbvV0oo4EbChzGx4f9GRdb25HMsYhqlCwG5lrLq9biZkxWOiqY 22YiTra2kYMu1l1tQD30/bPm3wwYN0x18gb45AdQl1tp5j/sFB2T0FQ7R0nTNEV3j6o9feQzro1i OWA14Fm+Q8a1a8+Bvu/d/dMb2JY5uiPbhG/ktn4cqGU/er3pcvwCAAD//wMAUEsDBBQABgAIAAAA IQBESaIoGgIAADMEAAAOAAAAZHJzL2Uyb0RvYy54bWysU01v2zAMvQ/YfxB0X+ykSdsYcYqsRYYB QVsgHXpWZCkWIIuapMTOfv0oOV/odhp2kUmRfiTfo2YPXaPJXjivwJR0OMgpEYZDpcy2pD/ell/u KfGBmYppMKKkB+Hpw/zzp1lrCzGCGnQlHEEQ44vWlrQOwRZZ5nktGuYHYIXBoATXsICu22aVYy2i Nzob5flt1oKrrAMuvMfbpz5I5wlfSsHDi5ReBKJLir2FdLp0buKZzWes2Dpma8WPbbB/6KJhymDR M9QTC4zsnPoDqlHcgQcZBhyaDKRUXKQZcJph/mGadc2sSLMgOd6eafL/D5Y/79f21ZHQfYUOBYyE tNYXHi/jPJ10TfxipwTjSOHhTJvoAuF4Ob6ZDvPRhBKOsdvx3d1oGmGyy9/W+fBNQEOiUVKHsiS2 2H7lQ596SonFDCyV1kkabUiLoDeTPP1wjiC4Nljj0mu0QrfpiKqu5thAdcDxHPTKe8uXCntYMR9e mUOpcSJc3/CCh9SAteBoUVKD+/W3+5iPCmCUkhZXp6T+5445QYn+blCb6XA8jruWnPHkboSOu45s riNm1zwCbucQH4rlyYz5QZ9M6aB5xy1fxKoYYoZj7ZKGk/kY+oXGV8LFYpGScLssCyuztjxCR1Yj w2/dO3P2KENAAZ/htGSs+KBGn9vrsdgFkCpJFXnuWT3Sj5uZxD6+orj6137Kurz1+W8AAAD//wMA UEsDBBQABgAIAAAAIQAD+94P4QAAAAoBAAAPAAAAZHJzL2Rvd25yZXYueG1sTI9NT4NAEIbvJv6H zZh4axeIRUpZmoakMTF6aO3F28BugbgfyG5b9Nc7PdXbO5kn7zxTrCej2VmNvndWQDyPgCnbONnb VsDhYzvLgPmAVqJ2Vgn4UR7W5f1dgbl0F7tT531oGZVYn6OALoQh59w3nTLo525QlnZHNxoMNI4t lyNeqNxonkRRyg32li50OKiqU83X/mQEvFbbd9zVicl+dfXydtwM34fPhRCPD9NmBSyoKdxguOqT OpTkVLuTlZ5pAbM4iQm9hsUTMCLS5yWFWkCWpsDLgv9/ofwDAAD//wMAUEsBAi0AFAAGAAgAAAAh ALaDOJL+AAAA4QEAABMAAAAAAAAAAAAAAAAAAAAAAFtDb250ZW50X1R5cGVzXS54bWxQSwECLQAU AAYACAAAACEAOP0h/9YAAACUAQAACwAAAAAAAAAAAAAAAAAvAQAAX3JlbHMvLnJlbHNQSwECLQAU AAYACAAAACEAREmiKBoCAAAzBAAADgAAAAAAAAAAAAAAAAAuAgAAZHJzL2Uyb0RvYy54bWxQSwEC LQAUAAYACAAAACEAA/veD+EAAAAKAQAADwAAAAAAAAAAAAAAAAB0BAAAZHJzL2Rvd25yZXYueG1s UEsFBgAAAAAEAAQA8wAAAIIFAAAAAA== " filled="f" stroked="f" strokeweight=".5pt">
               <v:textbox>
                 <w:txbxContent>
                   <w:p>
@@ -3182,7 +2182,7 @@
         </mc:Choice>
         <mc:Fallback xmlns="">
           <w:pict>
-            <v:shape w14:anchorId="10B52C07" id="_x0000_s1029" type="#_x0000_t202" style="position:absolute;margin-left:301.2pt;margin-top:-14.4pt;width:230.05pt;height:54.1pt;z-index:251658241;visibility:visible;mso-wrap-style:square;mso-width-percent:0;mso-height-percent:0;mso-wrap-distance-left:9pt;mso-wrap-distance-top:3.6pt;mso-wrap-distance-right:9pt;mso-wrap-distance-bottom:3.6pt;mso-position-horizontal:absolute;mso-position-horizontal-relative:text;mso-position-vertical:absolute;mso-position-vertical-relative:text;mso-width-percent:0;mso-height-percent:0;mso-width-relative:margin;mso-height-relative:margin;v-text-anchor:top" o:gfxdata="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" fillcolor="white [3212]" strokecolor="white [3212]">
+            <v:shape w14:anchorId="10B52C07" id="_x0000_s1029" type="#_x0000_t202" style="position:absolute;margin-left:301.2pt;margin-top:-14.4pt;width:230.05pt;height:54.1pt;z-index:251658241;visibility:visible;mso-wrap-style:square;mso-width-percent:0;mso-height-percent:0;mso-wrap-distance-left:9pt;mso-wrap-distance-top:3.6pt;mso-wrap-distance-right:9pt;mso-wrap-distance-bottom:3.6pt;mso-position-horizontal:absolute;mso-position-horizontal-relative:text;mso-position-vertical:absolute;mso-position-vertical-relative:text;mso-width-percent:0;mso-height-percent:0;mso-width-relative:margin;mso-height-relative:margin;v-text-anchor:top" o:gfxdata="UEsDBBQABgAIAAAAIQC2gziS/gAAAOEBAAATAAAAW0NvbnRlbnRfVHlwZXNdLnhtbJSRQU7DMBBF 90jcwfIWJU67QAgl6YK0S0CoHGBkTxKLZGx5TGhvj5O2G0SRWNoz/78nu9wcxkFMGNg6quQqL6RA 0s5Y6ir5vt9lD1JwBDIwOMJKHpHlpr69KfdHjyxSmriSfYz+USnWPY7AufNIadK6MEJMx9ApD/oD OlTrorhX2lFEilmcO2RdNtjC5xDF9pCuTyYBB5bi6bQ4syoJ3g9WQ0ymaiLzg5KdCXlKLjvcW893 SUOqXwnz5DrgnHtJTxOsQfEKIT7DmDSUCaxw7Rqn8787ZsmRM9e2VmPeBN4uqYvTtW7jvijg9N/y JsXecLq0q+WD6m8AAAD//wMAUEsDBBQABgAIAAAAIQA4/SH/1gAAAJQBAAALAAAAX3JlbHMvLnJl bHOkkMFqwzAMhu+DvYPRfXGawxijTi+j0GvpHsDYimMaW0Yy2fr2M4PBMnrbUb/Q94l/f/hMi1qR JVI2sOt6UJgd+ZiDgffL8ekFlFSbvV0oo4EbChzGx4f9GRdb25HMsYhqlCwG5lrLq9biZkxWOiqY 22YiTra2kYMu1l1tQD30/bPm3wwYN0x18gb45AdQl1tp5j/sFB2T0FQ7R0nTNEV3j6o9feQzro1i OWA14Fm+Q8a1a8+Bvu/d/dMb2JY5uiPbhG/ktn4cqGU/er3pcvwCAAD//wMAUEsDBBQABgAIAAAA IQBK9KETDwIAACQEAAAOAAAAZHJzL2Uyb0RvYy54bWysU9tu2zAMfR+wfxD0vjgxkiwx4hRdug4D ugvQ7QNkSY6FSaImKbGzrx8lp2nQPW2YHwTSlA7Jw8PNzWA0OUofFNiaziZTSqTlIJTd1/T7t/s3 K0pCZFYwDVbW9CQDvdm+frXpXSVL6EAL6QmC2FD1rqZdjK4qisA7aViYgJMWgy14wyK6fl8Iz3pE N7oop9Nl0YMXzgOXIeDfuzFItxm/bSWPX9o2yEh0TbG2mE+fzyadxXbDqr1nrlP8XAb7hyoMUxaT XqDuWGTk4NUfUEZxDwHaOOFgCmhbxWXuAbuZTV9089gxJ3MvSE5wF5rC/4Pln4+P7qsncXgHAw4w NxHcA/AfgVjYdczu5a330HeSCUw8S5QVvQvV+WmiOlQhgTT9JxA4ZHaIkIGG1pvECvZJEB0HcLqQ LodIOP4s1+VsucAQx9hytVwvypyCVU+vnQ/xgwRDklFTj0PN6Oz4EGKqhlVPV1KyAFqJe6V1dpKQ 5E57cmQogWY/1v/ilrakrylmXoz9/z2CURF1rJWp6WqavlFZibT3VmSVRab0aGPB2p5ZTMSNFMah GYgSyEh6m0htQJyQVg+jbHHN0OjA/6KkR8nWNPw8MC8p0R8tjmY9m8+TxrMzX7wt0fHXkeY6wixH qJpGSkZzF/NeJNYs3OIIW5XZfa7kXDJKMZN+Xpuk9Ws/33pe7u1vAAAA//8DAFBLAwQUAAYACAAA ACEAzhNG8eIAAAALAQAADwAAAGRycy9kb3ducmV2LnhtbEyPQUvDQBCF74L/YRnBi7QbQ01jzKbU QulBPFhTep1mxySYnQ3ZbRP/vduTHof5eO97+WoynbjQ4FrLCh7nEQjiyuqWawXl53aWgnAeWWNn mRT8kINVcXuTY6btyB902ftahBB2GSpovO8zKV3VkEE3tz1x+H3ZwaAP51BLPeAYwk0n4yhKpMGW Q0ODPW0aqr73Z6Pg7QE5LVM+Hjbv62M9bnf+tdwpdX83rV9AeJr8HwxX/aAORXA62TNrJzoFSRQv AqpgFqdhw5WIkvgJxEnB8nkBssjl/w3FLwAAAP//AwBQSwECLQAUAAYACAAAACEAtoM4kv4AAADh AQAAEwAAAAAAAAAAAAAAAAAAAAAAW0NvbnRlbnRfVHlwZXNdLnhtbFBLAQItABQABgAIAAAAIQA4 /SH/1gAAAJQBAAALAAAAAAAAAAAAAAAAAC8BAABfcmVscy8ucmVsc1BLAQItABQABgAIAAAAIQBK 9KETDwIAACQEAAAOAAAAAAAAAAAAAAAAAC4CAABkcnMvZTJvRG9jLnhtbFBLAQItABQABgAIAAAA IQDOE0bx4gAAAAsBAAAPAAAAAAAAAAAAAAAAAGkEAABkcnMvZG93bnJldi54bWxQSwUGAAAAAAQA BADzAAAAeAUAAAAA " fillcolor="white [3212]" strokecolor="white [3212]">
               <v:textbox>
                 <w:txbxContent>
                   <w:p>
@@ -3382,7 +2382,7 @@
               <v:stroke joinstyle="miter"/>
               <v:path gradientshapeok="t" o:connecttype="rect"/>
             </v:shapetype>
-            <v:shape id="Tekstvak 6" o:spid="_x0000_s1027" type="#_x0000_t202" style="position:absolute;margin-left:0;margin-top:0;width:475.5pt;height:203.8pt;rotation:-45;z-index:-251658238;visibility:visible;mso-wrap-style:square;mso-width-percent:0;mso-height-percent:0;mso-wrap-distance-left:9pt;mso-wrap-distance-top:0;mso-wrap-distance-right:9pt;mso-wrap-distance-bottom:0;mso-position-horizontal:center;mso-position-horizontal-relative:margin;mso-position-vertical:center;mso-position-vertical-relative:margin;mso-width-percent:0;mso-height-percent:0;mso-width-relative:page;mso-height-relative:page;v-text-anchor:top" o:gfxdata="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" o:allowincell="f" filled="f" stroked="f">
+            <v:shape id="Tekstvak 6" o:spid="_x0000_s1026" type="#_x0000_t202" style="position:absolute;margin-left:0;margin-top:0;width:475.5pt;height:203.8pt;rotation:-45;z-index:-251658238;visibility:visible;mso-wrap-style:square;mso-width-percent:0;mso-height-percent:0;mso-wrap-distance-left:9pt;mso-wrap-distance-top:0;mso-wrap-distance-right:9pt;mso-wrap-distance-bottom:0;mso-position-horizontal:center;mso-position-horizontal-relative:margin;mso-position-vertical:center;mso-position-vertical-relative:margin;mso-width-percent:0;mso-height-percent:0;mso-width-relative:page;mso-height-relative:page;v-text-anchor:top" o:gfxdata="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" o:allowincell="f" filled="f" stroked="f">
               <v:stroke joinstyle="round"/>
               <o:lock v:ext="edit" shapetype="t"/>
               <v:textbox style="mso-fit-shape-to-text:t">
@@ -7462,10 +6462,6 @@
 </file>
 
 <file path=customXml/item1.xml><?xml version="1.0" encoding="utf-8"?>
-<b:Sources xmlns:b="http://schemas.openxmlformats.org/officeDocument/2006/bibliography" xmlns="http://schemas.openxmlformats.org/officeDocument/2006/bibliography" SelectedStyle="\APASixthEditionOfficeOnline.xsl" StyleName="APA" Version="6"/>
-</file>
-
-<file path=customXml/item2.xml><?xml version="1.0" encoding="utf-8"?>
 <p:properties xmlns:p="http://schemas.microsoft.com/office/2006/metadata/properties" xmlns:xsi="http://www.w3.org/2001/XMLSchema-instance" xmlns:pc="http://schemas.microsoft.com/office/infopath/2007/PartnerControls">
   <documentManagement>
     <lcf76f155ced4ddcb4097134ff3c332f xmlns="ecd6e1e9-ac8d-43e0-b591-2645e6e1ef06">
@@ -7476,7 +6472,20 @@
 </p:properties>
 </file>
 
+<file path=customXml/item2.xml><?xml version="1.0" encoding="utf-8"?>
+<b:Sources xmlns:b="http://schemas.openxmlformats.org/officeDocument/2006/bibliography" xmlns="http://schemas.openxmlformats.org/officeDocument/2006/bibliography" SelectedStyle="\APASixthEditionOfficeOnline.xsl" StyleName="APA" Version="6"/>
+</file>
+
 <file path=customXml/item3.xml><?xml version="1.0" encoding="utf-8"?>
+<?mso-contentType ?>
+<FormTemplates xmlns="http://schemas.microsoft.com/sharepoint/v3/contenttype/forms">
+  <Display>DocumentLibraryForm</Display>
+  <Edit>DocumentLibraryForm</Edit>
+  <New>DocumentLibraryForm</New>
+</FormTemplates>
+</file>
+
+<file path=customXml/item4.xml><?xml version="1.0" encoding="utf-8"?>
 <ct:contentTypeSchema xmlns:ct="http://schemas.microsoft.com/office/2006/metadata/contentType" xmlns:ma="http://schemas.microsoft.com/office/2006/metadata/properties/metaAttributes" ct:_="" ma:_="" ma:contentTypeName="Document" ma:contentTypeID="0x010100D47544BA35D92F4981AE1845F24DC164" ma:contentTypeVersion="13" ma:contentTypeDescription="Een nieuw document maken." ma:contentTypeScope="" ma:versionID="bf3cb94996d167e86f02be0d48bc5c6a">
   <xsd:schema xmlns:xsd="http://www.w3.org/2001/XMLSchema" xmlns:xs="http://www.w3.org/2001/XMLSchema" xmlns:p="http://schemas.microsoft.com/office/2006/metadata/properties" xmlns:ns2="ecd6e1e9-ac8d-43e0-b591-2645e6e1ef06" xmlns:ns3="8fc8e79b-e696-40e3-82b1-239ab1b6385b" targetNamespace="http://schemas.microsoft.com/office/2006/metadata/properties" ma:root="true" ma:fieldsID="d3b80f81c7ffcdba1e7172e888ffb9b4" ns2:_="" ns3:_="">
     <xsd:import namespace="ecd6e1e9-ac8d-43e0-b591-2645e6e1ef06"/>
@@ -7683,24 +6692,7 @@
 </ct:contentTypeSchema>
 </file>
 
-<file path=customXml/item4.xml><?xml version="1.0" encoding="utf-8"?>
-<?mso-contentType ?>
-<FormTemplates xmlns="http://schemas.microsoft.com/sharepoint/v3/contenttype/forms">
-  <Display>DocumentLibraryForm</Display>
-  <Edit>DocumentLibraryForm</Edit>
-  <New>DocumentLibraryForm</New>
-</FormTemplates>
-</file>
-
 <file path=customXml/itemProps1.xml><?xml version="1.0" encoding="utf-8"?>
-<ds:datastoreItem xmlns:ds="http://schemas.openxmlformats.org/officeDocument/2006/customXml" ds:itemID="{AC498964-BFBA-48CA-A4F3-AF199BCD29C8}">
-  <ds:schemaRefs>
-    <ds:schemaRef ds:uri="http://schemas.openxmlformats.org/officeDocument/2006/bibliography"/>
-  </ds:schemaRefs>
-</ds:datastoreItem>
-</file>
-
-<file path=customXml/itemProps2.xml><?xml version="1.0" encoding="utf-8"?>
 <ds:datastoreItem xmlns:ds="http://schemas.openxmlformats.org/officeDocument/2006/customXml" ds:itemID="{D57D9AB7-1D3D-4E7F-8A89-1AB488838509}">
   <ds:schemaRefs>
     <ds:schemaRef ds:uri="http://schemas.microsoft.com/office/2006/metadata/properties"/>
@@ -7711,7 +6703,23 @@
 </ds:datastoreItem>
 </file>
 
+<file path=customXml/itemProps2.xml><?xml version="1.0" encoding="utf-8"?>
+<ds:datastoreItem xmlns:ds="http://schemas.openxmlformats.org/officeDocument/2006/customXml" ds:itemID="{AC498964-BFBA-48CA-A4F3-AF199BCD29C8}">
+  <ds:schemaRefs>
+    <ds:schemaRef ds:uri="http://schemas.openxmlformats.org/officeDocument/2006/bibliography"/>
+  </ds:schemaRefs>
+</ds:datastoreItem>
+</file>
+
 <file path=customXml/itemProps3.xml><?xml version="1.0" encoding="utf-8"?>
+<ds:datastoreItem xmlns:ds="http://schemas.openxmlformats.org/officeDocument/2006/customXml" ds:itemID="{AFA01445-9AA3-44DE-8AA3-72924337F849}">
+  <ds:schemaRefs>
+    <ds:schemaRef ds:uri="http://schemas.microsoft.com/sharepoint/v3/contenttype/forms"/>
+  </ds:schemaRefs>
+</ds:datastoreItem>
+</file>
+
+<file path=customXml/itemProps4.xml><?xml version="1.0" encoding="utf-8"?>
 <ds:datastoreItem xmlns:ds="http://schemas.openxmlformats.org/officeDocument/2006/customXml" ds:itemID="{558A8D64-ECC0-42ED-9AD5-2D573CD7CC85}">
   <ds:schemaRefs>
     <ds:schemaRef ds:uri="http://schemas.microsoft.com/office/2006/metadata/contentType"/>
@@ -7728,12 +6736,4 @@
     <ds:schemaRef ds:uri="http://schemas.microsoft.com/internal/obd"/>
   </ds:schemaRefs>
 </ds:datastoreItem>
-</file>
-
-<file path=customXml/itemProps4.xml><?xml version="1.0" encoding="utf-8"?>
-<ds:datastoreItem xmlns:ds="http://schemas.openxmlformats.org/officeDocument/2006/customXml" ds:itemID="{AFA01445-9AA3-44DE-8AA3-72924337F849}">
-  <ds:schemaRefs>
-    <ds:schemaRef ds:uri="http://schemas.microsoft.com/sharepoint/v3/contenttype/forms"/>
-  </ds:schemaRefs>
-</ds:datastoreItem>
 </file>
</xml_diff>

<commit_message>
SET-18 Improve speed template preview
</commit_message>
<xml_diff>
--- a/templates/thermofly_paneel_tagged.docx
+++ b/templates/thermofly_paneel_tagged.docx
@@ -1,8 +1,8 @@
 
 <file path=word/document.xml><?xml version="1.0" encoding="utf-8"?>
-<w:document xmlns:wpc="http://schemas.microsoft.com/office/word/2010/wordprocessingCanvas" xmlns:cx="http://schemas.microsoft.com/office/drawing/2014/chartex" xmlns:cx1="http://schemas.microsoft.com/office/drawing/2015/9/8/chartex" xmlns:cx2="http://schemas.microsoft.com/office/drawing/2015/10/21/chartex" xmlns:cx3="http://schemas.microsoft.com/office/drawing/2016/5/9/chartex" xmlns:cx4="http://schemas.microsoft.com/office/drawing/2016/5/10/chartex" xmlns:cx5="http://schemas.microsoft.com/office/drawing/2016/5/11/chartex" xmlns:cx6="http://schemas.microsoft.com/office/drawing/2016/5/12/chartex" xmlns:cx7="http://schemas.microsoft.com/office/drawing/2016/5/13/chartex" xmlns:cx8="http://schemas.microsoft.com/office/drawing/2016/5/14/chartex" xmlns:mc="http://schemas.openxmlformats.org/markup-compatibility/2006" xmlns:aink="http://schemas.microsoft.com/office/drawing/2016/ink" xmlns:am3d="http://schemas.microsoft.com/office/drawing/2017/model3d" xmlns:o="urn:schemas-microsoft-com:office:office" xmlns:oel="http://schemas.microsoft.com/office/2019/extlst" xmlns:r="http://schemas.openxmlformats.org/officeDocument/2006/relationships" xmlns:m="http://schemas.openxmlformats.org/officeDocument/2006/math" xmlns:v="urn:schemas-microsoft-com:vml" xmlns:wp14="http://schemas.microsoft.com/office/word/2010/wordprocessingDrawing" xmlns:wp="http://schemas.openxmlformats.org/drawingml/2006/wordprocessingDrawing" xmlns:w10="urn:schemas-microsoft-com:office:word" xmlns:w="http://schemas.openxmlformats.org/wordprocessingml/2006/main" xmlns:w14="http://schemas.microsoft.com/office/word/2010/wordml" xmlns:w15="http://schemas.microsoft.com/office/word/2012/wordml" xmlns:w16cex="http://schemas.microsoft.com/office/word/2018/wordml/cex" xmlns:w16cid="http://schemas.microsoft.com/office/word/2016/wordml/cid" xmlns:w16="http://schemas.microsoft.com/office/word/2018/wordml" xmlns:w16du="http://schemas.microsoft.com/office/word/2023/wordml/word16du" xmlns:w16sdtdh="http://schemas.microsoft.com/office/word/2020/wordml/sdtdatahash" xmlns:w16sdtfl="http://schemas.microsoft.com/office/word/2024/wordml/sdtformatlock" xmlns:w16se="http://schemas.microsoft.com/office/word/2015/wordml/symex" xmlns:wpg="http://schemas.microsoft.com/office/word/2010/wordprocessingGroup" xmlns:wpi="http://schemas.microsoft.com/office/word/2010/wordprocessingInk" xmlns:wne="http://schemas.microsoft.com/office/word/2006/wordml" xmlns:wps="http://schemas.microsoft.com/office/word/2010/wordprocessingShape" mc:Ignorable="w14 w15 w16se w16cid w16 w16cex w16sdtdh w16sdtfl w16du wp14">
+<w:document xmlns:ns1="http://schemas.openxmlformats.org/markup-compatibility/2006" xmlns:ns2="http://schemas.microsoft.com/office/word/2010/wordml" xmlns:ns3="http://schemas.openxmlformats.org/officeDocument/2006/relationships" xmlns:w="http://schemas.openxmlformats.org/wordprocessingml/2006/main" ns1:Ignorable="w14 w15 w16se w16cid w16 w16cex w16sdtdh w16sdtfl w16du wp14">
   <w:body>
-    <w:p>
+    <w:p ns2:paraId="15370E4E" ns2:textId="77777777">
       <w:pPr>
         <w:rPr>
           <w:lang w:val="en-US"/>
@@ -15,7 +15,7 @@
         <w:t>{%p for panel in panels %}</w:t>
       </w:r>
     </w:p>
-    <w:p>
+    <w:p ns2:paraId="7C2C9023" ns2:textId="77777777">
       <w:pPr>
         <w:pStyle w:val="TF-Algemeen"/>
         <w:rPr>
@@ -1002,6 +1002,7 @@
         <w:tc>
           <w:tcPr>
             <w:tcW w:w="2800" w:type="dxa"/>
+            <w:vAlign w:val="top"/>
           </w:tcPr>
           <w:p>
             <w:pPr>
@@ -1023,6 +1024,7 @@
         <w:tc>
           <w:tcPr>
             <w:tcW w:w="2161" w:type="dxa"/>
+            <w:vAlign w:val="top"/>
           </w:tcPr>
           <w:p>
             <w:pPr>
@@ -1062,6 +1064,7 @@
         <w:tc>
           <w:tcPr>
             <w:tcW w:w="2800" w:type="dxa"/>
+            <w:vAlign w:val="top"/>
           </w:tcPr>
           <w:p>
             <w:pPr>
@@ -1083,6 +1086,7 @@
         <w:tc>
           <w:tcPr>
             <w:tcW w:w="2161" w:type="dxa"/>
+            <w:vAlign w:val="top"/>
           </w:tcPr>
           <w:p>
             <w:pPr>
@@ -1122,6 +1126,7 @@
         <w:tc>
           <w:tcPr>
             <w:tcW w:w="2800" w:type="dxa"/>
+            <w:vAlign w:val="top"/>
           </w:tcPr>
           <w:p>
             <w:pPr>
@@ -1143,6 +1148,7 @@
         <w:tc>
           <w:tcPr>
             <w:tcW w:w="2161" w:type="dxa"/>
+            <w:vAlign w:val="top"/>
           </w:tcPr>
           <w:p>
             <w:pPr>
@@ -1182,6 +1188,7 @@
         <w:tc>
           <w:tcPr>
             <w:tcW w:w="2800" w:type="dxa"/>
+            <w:vAlign w:val="top"/>
           </w:tcPr>
           <w:p>
             <w:pPr>
@@ -1203,6 +1210,7 @@
         <w:tc>
           <w:tcPr>
             <w:tcW w:w="2161" w:type="dxa"/>
+            <w:vAlign w:val="top"/>
           </w:tcPr>
           <w:p>
             <w:pPr>
@@ -1218,6 +1226,68 @@
                 <w:szCs w:val="20"/>
               </w:rPr>
               <w:t>{{ panel.temperatuurverschil }}</w:t>
+            </w:r>
+          </w:p>
+        </w:tc>
+        <w:tc>
+          <w:tcPr>
+            <w:tcW w:w="4961" w:type="dxa"/>
+            <w:gridSpan w:val="2"/>
+            <w:vMerge/>
+          </w:tcPr>
+          <w:p>
+            <w:pPr>
+              <w:spacing w:after="0"/>
+              <w:rPr>
+                <w:sz w:val="20"/>
+                <w:szCs w:val="20"/>
+              </w:rPr>
+            </w:pPr>
+          </w:p>
+        </w:tc>
+      </w:tr>
+      <w:tr>
+        <w:tc>
+          <w:tcPr>
+            <w:tcW w:w="2800" w:type="dxa"/>
+            <w:vAlign w:val="top"/>
+          </w:tcPr>
+          <w:p>
+            <w:pPr>
+              <w:spacing w:after="0"/>
+              <w:rPr>
+                <w:sz w:val="20"/>
+                <w:szCs w:val="20"/>
+              </w:rPr>
+            </w:pPr>
+            <w:r>
+              <w:rPr>
+                <w:sz w:val="20"/>
+                <w:szCs w:val="20"/>
+              </w:rPr>
+              <w:t/>
+            </w:r>
+          </w:p>
+        </w:tc>
+        <w:tc>
+          <w:tcPr>
+            <w:tcW w:w="2161" w:type="dxa"/>
+            <w:vAlign w:val="top"/>
+          </w:tcPr>
+          <w:p>
+            <w:pPr>
+              <w:spacing w:after="0"/>
+              <w:rPr>
+                <w:sz w:val="20"/>
+                <w:szCs w:val="20"/>
+              </w:rPr>
+            </w:pPr>
+            <w:r>
+              <w:rPr>
+                <w:sz w:val="20"/>
+                <w:szCs w:val="20"/>
+              </w:rPr>
+              <w:t/>
             </w:r>
           </w:p>
         </w:tc>
@@ -1318,7 +1388,7 @@
       </w:tr>
     </w:tbl>
     <w:p/>
-    <w:p>
+    <w:p ns2:paraId="410CA35E" ns2:textId="77777777">
       <w:pPr>
         <w:spacing w:after="0"/>
         <w:rPr>
@@ -1338,7 +1408,7 @@
         <w:t>Bevindingen</w:t>
       </w:r>
     </w:p>
-    <w:p>
+    <w:p ns2:paraId="1CE431EE" ns2:textId="77777777">
       <w:pPr>
         <w:spacing w:after="0"/>
         <w:rPr>
@@ -1354,7 +1424,7 @@
         <w:t>{{ panel.bevindingen }}</w:t>
       </w:r>
     </w:p>
-    <w:p>
+    <w:p ns2:paraId="795C36B2" ns2:textId="77777777">
       <w:pPr>
         <w:spacing w:after="0"/>
         <w:rPr>
@@ -1363,7 +1433,7 @@
         </w:rPr>
       </w:pPr>
     </w:p>
-    <w:p>
+    <w:p ns2:paraId="61AB568E" ns2:textId="77777777">
       <w:pPr>
         <w:spacing w:after="0"/>
         <w:rPr>
@@ -1372,7 +1442,7 @@
         </w:rPr>
       </w:pPr>
     </w:p>
-    <w:p>
+    <w:p ns2:paraId="05246439" ns2:textId="77777777">
       <w:pPr>
         <w:spacing w:after="0"/>
         <w:rPr>
@@ -1392,7 +1462,7 @@
         <w:t>Conclusie</w:t>
       </w:r>
     </w:p>
-    <w:p>
+    <w:p ns2:paraId="6025A1FE" ns2:textId="77777777">
       <w:pPr>
         <w:spacing w:after="0"/>
         <w:rPr>
@@ -1408,7 +1478,7 @@
         <w:t>{{ panel.conclusie }}</w:t>
       </w:r>
     </w:p>
-    <w:p>
+    <w:p ns2:paraId="1EC46B76" ns2:textId="77777777">
       <w:pPr>
         <w:spacing w:after="0"/>
         <w:rPr>
@@ -1417,7 +1487,7 @@
         </w:rPr>
       </w:pPr>
     </w:p>
-    <w:p>
+    <w:p ns2:paraId="705B4DB4" ns2:textId="77777777">
       <w:pPr>
         <w:spacing w:after="0"/>
         <w:rPr>
@@ -1426,7 +1496,7 @@
         </w:rPr>
       </w:pPr>
     </w:p>
-    <w:p>
+    <w:p ns2:paraId="79C0E94C" ns2:textId="77777777">
       <w:pPr>
         <w:spacing w:after="0"/>
         <w:rPr>
@@ -1448,7 +1518,7 @@
         <w:t>Advies</w:t>
       </w:r>
     </w:p>
-    <w:p>
+    <w:p ns2:paraId="78C31300" ns2:textId="77777777">
       <w:pPr>
         <w:spacing w:after="0"/>
         <w:rPr>
@@ -1467,7 +1537,7 @@
       </w:r>
       <w:bookmarkEnd w:id="0"/>
     </w:p>
-    <w:p>
+    <w:p ns2:paraId="6EBCD3B8" ns2:textId="77777777">
       <w:pPr>
         <w:rPr>
           <w:lang w:val="en-US"/>
@@ -1480,7 +1550,7 @@
         <w:t>{%p if not loop.last %}</w:t>
       </w:r>
     </w:p>
-    <w:p>
+    <w:p ns2:paraId="5D132943" ns2:textId="77777777">
       <w:pPr>
         <w:rPr>
           <w:lang w:val="en-US"/>
@@ -1493,23 +1563,23 @@
         <w:br w:type="page"/>
       </w:r>
     </w:p>
-    <w:p>
+    <w:p ns2:paraId="4322CD13" ns2:textId="77777777">
       <w:r>
         <w:lastRenderedPageBreak/>
         <w:t>{%p endif %}</w:t>
       </w:r>
     </w:p>
-    <w:p>
+    <w:p ns2:paraId="292234A9" ns2:textId="77777777">
       <w:r>
         <w:t>{%p endfor %}</w:t>
       </w:r>
     </w:p>
     <w:sectPr>
-      <w:headerReference w:type="even" r:id="rId11"/>
-      <w:headerReference w:type="default" r:id="rId12"/>
-      <w:footerReference w:type="default" r:id="rId13"/>
-      <w:headerReference w:type="first" r:id="rId14"/>
-      <w:footerReference w:type="first" r:id="rId15"/>
+      <w:headerReference w:type="even" ns3:id="rId11"/>
+      <w:headerReference w:type="default" ns3:id="rId12"/>
+      <w:footerReference w:type="default" ns3:id="rId13"/>
+      <w:headerReference w:type="first" ns3:id="rId14"/>
+      <w:footerReference w:type="first" ns3:id="rId15"/>
       <w:pgSz w:w="11906" w:h="16838"/>
       <w:pgMar w:top="284" w:right="992" w:bottom="1135" w:left="992" w:header="680" w:footer="709" w:gutter="0"/>
       <w:cols w:space="708"/>

</xml_diff>